<commit_message>
Incorporate datasets Joe learned about, but didn't use
</commit_message>
<xml_diff>
--- a/Inventory_lit_review.docx
+++ b/Inventory_lit_review.docx
@@ -72,79 +72,55 @@
         <w:rPr>
           <w:rStyle w:val="citationrow"/>
         </w:rPr>
-        <w:t xml:space="preserve">.  Global study that looks at an empirical relationship between waste composition, moisture, and temperature to adjust the waste decay rate used in landfill emission estimates using IPCC methods.  Showed improved comparisons with measurements (though N is small, ~200), though certainly not a perfect agreement with measurements.  A </w:t>
-      </w:r>
-      <w:proofErr w:type="spellStart"/>
+        <w:t xml:space="preserve">.  Global study that looks at an empirical relationship between waste composition, moisture, and temperature to adjust the waste decay rate used in landfill emission estimates using IPCC methods.  Showed improved comparisons with measurements (though N is small, ~200), though certainly not a perfect agreement with measurements.  A followup appears to be in the works, preprint = </w:t>
+      </w:r>
       <w:r>
         <w:rPr>
           <w:rStyle w:val="citationrow"/>
         </w:rPr>
-        <w:t>followup</w:t>
-      </w:r>
-      <w:proofErr w:type="spellEnd"/>
+        <w:t>https://doi.org/10.21203/rs.3.rs-3423080/v1</w:t>
+      </w:r>
       <w:r>
         <w:rPr>
           <w:rStyle w:val="citationrow"/>
         </w:rPr>
-        <w:t xml:space="preserve"> appears to be in the works, preprint = </w:t>
-      </w:r>
+        <w:t>.</w:t>
+      </w:r>
+    </w:p>
+    <w:p>
+      <w:pPr>
+        <w:ind w:left="1440"/>
+      </w:pPr>
       <w:r>
         <w:rPr>
           <w:rStyle w:val="citationrow"/>
         </w:rPr>
-        <w:t>https://doi.org/10.21203/rs.3.rs-3423080/v1</w:t>
+        <w:t xml:space="preserve">Science – 2024 </w:t>
+      </w:r>
+      <w:hyperlink r:id="rId7" w:history="1">
+        <w:r>
+          <w:rPr>
+            <w:rStyle w:val="Hyperlink"/>
+          </w:rPr>
+          <w:t>https://doi.org/10.1126/science.adi7735</w:t>
+        </w:r>
+      </w:hyperlink>
+      <w:r>
+        <w:t>.</w:t>
       </w:r>
       <w:r>
         <w:rPr>
           <w:rStyle w:val="citationrow"/>
         </w:rPr>
-        <w:t>.</w:t>
-      </w:r>
-    </w:p>
-    <w:p>
-      <w:pPr>
-        <w:ind w:left="1440"/>
-      </w:pPr>
-      <w:r>
-        <w:rPr>
-          <w:rStyle w:val="citationrow"/>
-        </w:rPr>
-        <w:t xml:space="preserve">Science – 2024 </w:t>
-      </w:r>
-      <w:hyperlink r:id="rId7" w:history="1">
-        <w:r>
-          <w:rPr>
-            <w:rStyle w:val="Hyperlink"/>
-          </w:rPr>
-          <w:t>https://doi.org/10.1126/science.adi7735</w:t>
-        </w:r>
-      </w:hyperlink>
-      <w:r>
-        <w:t>.</w:t>
-      </w:r>
-      <w:r>
-        <w:rPr>
-          <w:rStyle w:val="citationrow"/>
-        </w:rPr>
         <w:t xml:space="preserve">  </w:t>
       </w:r>
-      <w:proofErr w:type="spellStart"/>
       <w:r>
         <w:rPr>
           <w:rStyle w:val="Hyperlink"/>
           <w:color w:val="auto"/>
           <w:u w:val="none"/>
         </w:rPr>
-        <w:t>Sciav</w:t>
-      </w:r>
-      <w:proofErr w:type="spellEnd"/>
-      <w:r>
-        <w:rPr>
-          <w:rStyle w:val="Hyperlink"/>
-          <w:color w:val="auto"/>
-          <w:u w:val="none"/>
-        </w:rPr>
-        <w:t xml:space="preserve"> + AVIRIS study looking at many landfills showing </w:t>
+        <w:t xml:space="preserve">Sciav + AVIRIS study looking at many landfills showing </w:t>
       </w:r>
       <w:r>
         <w:rPr>
@@ -202,15 +178,7 @@
         </w:rPr>
       </w:pPr>
       <w:r>
-        <w:t xml:space="preserve">Hamburg + Utrecht (EU) – </w:t>
-      </w:r>
-      <w:proofErr w:type="spellStart"/>
-      <w:r>
-        <w:t>Maazallahi</w:t>
-      </w:r>
-      <w:proofErr w:type="spellEnd"/>
-      <w:r>
-        <w:t xml:space="preserve"> et al., 2020, </w:t>
+        <w:t xml:space="preserve">Hamburg + Utrecht (EU) – Maazallahi et al., 2020, </w:t>
       </w:r>
       <w:hyperlink r:id="rId9" w:history="1">
         <w:r>
@@ -280,15 +248,7 @@
         <w:ind w:left="1440"/>
       </w:pPr>
       <w:r>
-        <w:t xml:space="preserve">Paris (EU) – </w:t>
-      </w:r>
-      <w:proofErr w:type="spellStart"/>
-      <w:r>
-        <w:t>Defratyka</w:t>
-      </w:r>
-      <w:proofErr w:type="spellEnd"/>
-      <w:r>
-        <w:t xml:space="preserve"> et al., 2021, </w:t>
+        <w:t xml:space="preserve">Paris (EU) – Defratyka et al., 2021, </w:t>
       </w:r>
       <w:hyperlink r:id="rId11" w:history="1">
         <w:r>
@@ -318,27 +278,11 @@
         </w:r>
       </w:hyperlink>
       <w:r>
-        <w:t xml:space="preserve"> – chamber based CH4 and flasks for C isotopes, CO2/CH4 and ethane/methane.  Detailed emission factors for many components on SI </w:t>
-      </w:r>
-      <w:proofErr w:type="spellStart"/>
-      <w:r>
-        <w:t>pg</w:t>
-      </w:r>
-      <w:proofErr w:type="spellEnd"/>
-      <w:r>
-        <w:t xml:space="preserve"> s17.  NG gate = 2.44E3 [0.74E3 – 4.9E3 </w:t>
+        <w:t xml:space="preserve"> – chamber based CH4 and flasks for C isotopes, CO2/CH4 and ethane/methane.  Detailed emission factors for many components on SI pg s17.  NG gate = 2.44E3 [0.74E3 – 4.9E3 </w:t>
       </w:r>
       <w:r>
         <w:lastRenderedPageBreak/>
-        <w:t>95%CI] g/hr.  Sewer manholes = 0.567 [0.025 – 1.946] g/hr. Historic landfills = 14.6 [8.5 – 26.8] mg/</w:t>
-      </w:r>
-      <w:proofErr w:type="spellStart"/>
-      <w:r>
-        <w:t>hr</w:t>
-      </w:r>
-      <w:proofErr w:type="spellEnd"/>
-      <w:r>
-        <w:t>/m2.  Most (all?) were highly skewed.</w:t>
+        <w:t>95%CI] g/hr.  Sewer manholes = 0.567 [0.025 – 1.946] g/hr. Historic landfills = 14.6 [8.5 – 26.8] mg/hr/m2.  Most (all?) were highly skewed.</w:t>
       </w:r>
     </w:p>
     <w:p>
@@ -402,51 +346,15 @@
           <w:color w:val="auto"/>
           <w:u w:val="none"/>
         </w:rPr>
-        <w:t>Using this estimate they scaled to national emissions of 1.2 MMT CO2e/</w:t>
-      </w:r>
-      <w:proofErr w:type="spellStart"/>
+        <w:t>Using this estimate they scaled to national emissions of 1.2 MMT CO2e/yr from sewers.</w:t>
+      </w:r>
       <w:r>
         <w:rPr>
           <w:rStyle w:val="Hyperlink"/>
           <w:color w:val="auto"/>
           <w:u w:val="none"/>
         </w:rPr>
-        <w:t>yr</w:t>
-      </w:r>
-      <w:proofErr w:type="spellEnd"/>
-      <w:r>
-        <w:rPr>
-          <w:rStyle w:val="Hyperlink"/>
-          <w:color w:val="auto"/>
-          <w:u w:val="none"/>
-        </w:rPr>
-        <w:t xml:space="preserve"> from sewers.</w:t>
-      </w:r>
-      <w:r>
-        <w:rPr>
-          <w:rStyle w:val="Hyperlink"/>
-          <w:color w:val="auto"/>
-          <w:u w:val="none"/>
-        </w:rPr>
-        <w:t xml:space="preserve">  This is compared to 10.9 ± 7 MMT CO2e/</w:t>
-      </w:r>
-      <w:proofErr w:type="spellStart"/>
-      <w:r>
-        <w:rPr>
-          <w:rStyle w:val="Hyperlink"/>
-          <w:color w:val="auto"/>
-          <w:u w:val="none"/>
-        </w:rPr>
-        <w:t>yr</w:t>
-      </w:r>
-      <w:proofErr w:type="spellEnd"/>
-      <w:r>
-        <w:rPr>
-          <w:rStyle w:val="Hyperlink"/>
-          <w:color w:val="auto"/>
-          <w:u w:val="none"/>
-        </w:rPr>
-        <w:t xml:space="preserve"> from wastewater entirely.  Mentions some relationships with temperature.</w:t>
+        <w:t xml:space="preserve">  This is compared to 10.9 ± 7 MMT CO2e/yr from wastewater entirely.  Mentions some relationships with temperature.</w:t>
       </w:r>
     </w:p>
     <w:p>
@@ -794,15 +702,7 @@
       </w:pPr>
       <w:r>
         <w:tab/>
-        <w:t>Many models beyond just WETCHARTS (</w:t>
-      </w:r>
-      <w:proofErr w:type="spellStart"/>
-      <w:r>
-        <w:t>Wetchimp</w:t>
-      </w:r>
-      <w:proofErr w:type="spellEnd"/>
-      <w:r>
-        <w:t>, NASA’s LPJ-WSL, SOCCR)</w:t>
+        <w:t>Many models beyond just WETCHARTS (Wetchimp, NASA’s LPJ-WSL, SOCCR)</w:t>
       </w:r>
     </w:p>
     <w:p>
@@ -876,15 +776,7 @@
         <w:t xml:space="preserve"> and C13-CH4 measurements.  </w:t>
       </w:r>
       <w:r>
-        <w:t xml:space="preserve">2.043 </w:t>
-      </w:r>
-      <w:proofErr w:type="spellStart"/>
-      <w:r>
-        <w:t>tonnes</w:t>
-      </w:r>
-      <w:proofErr w:type="spellEnd"/>
-      <w:r>
-        <w:t>/km/yr.</w:t>
+        <w:t>2.043 tonnes/km/yr.</w:t>
       </w:r>
     </w:p>
     <w:p>
@@ -1128,9 +1020,17 @@
           <w:color w:val="auto"/>
           <w:u w:val="none"/>
         </w:rPr>
-        <w:t>Unread 2024 EST paper on agricultural ponds.  Discusses a method to estimate emissions, uses Australia to demo and compare to reported emissions.  41 kt/</w:t>
-      </w:r>
-      <w:proofErr w:type="spellStart"/>
+        <w:t xml:space="preserve">Unread 2024 EST paper on agricultural ponds.  Discusses a method to estimate emissions, uses Australia to demo and compare to reported emissions.  41 kt/yr or 0.238 t/ha/yr.  </w:t>
+      </w:r>
+      <w:hyperlink r:id="rId33" w:history="1">
+        <w:r>
+          <w:rPr>
+            <w:rStyle w:val="Hyperlink"/>
+            <w:rFonts w:ascii="Times New Roman" w:eastAsia="Times New Roman" w:hAnsi="Times New Roman" w:cs="Times New Roman"/>
+          </w:rPr>
+          <w:t>https://doi.org/10.1021/acs.est.3c08898</w:t>
+        </w:r>
+      </w:hyperlink>
       <w:r>
         <w:rPr>
           <w:rStyle w:val="Hyperlink"/>
@@ -1138,27 +1038,18 @@
           <w:color w:val="auto"/>
           <w:u w:val="none"/>
         </w:rPr>
-        <w:t>yr</w:t>
-      </w:r>
-      <w:proofErr w:type="spellEnd"/>
-      <w:r>
+        <w:t xml:space="preserve"> </w:t>
+      </w:r>
+    </w:p>
+    <w:p>
+      <w:pPr>
         <w:rPr>
           <w:rStyle w:val="Hyperlink"/>
           <w:rFonts w:ascii="Times New Roman" w:eastAsia="Times New Roman" w:hAnsi="Times New Roman" w:cs="Times New Roman"/>
           <w:color w:val="auto"/>
           <w:u w:val="none"/>
         </w:rPr>
-        <w:t xml:space="preserve"> or 0.238 t/ha/yr.  </w:t>
-      </w:r>
-      <w:hyperlink r:id="rId33" w:history="1">
-        <w:r>
-          <w:rPr>
-            <w:rStyle w:val="Hyperlink"/>
-            <w:rFonts w:ascii="Times New Roman" w:eastAsia="Times New Roman" w:hAnsi="Times New Roman" w:cs="Times New Roman"/>
-          </w:rPr>
-          <w:t>https://doi.org/10.1021/acs.est.3c08898</w:t>
-        </w:r>
-      </w:hyperlink>
+      </w:pPr>
       <w:r>
         <w:rPr>
           <w:rStyle w:val="Hyperlink"/>
@@ -1166,17 +1057,22 @@
           <w:color w:val="auto"/>
           <w:u w:val="none"/>
         </w:rPr>
-        <w:t xml:space="preserve"> </w:t>
-      </w:r>
-    </w:p>
-    <w:p>
-      <w:pPr>
+        <w:tab/>
+        <w:t>Chemical Production</w:t>
+      </w:r>
+      <w:r>
         <w:rPr>
           <w:rStyle w:val="Hyperlink"/>
           <w:rFonts w:ascii="Times New Roman" w:eastAsia="Times New Roman" w:hAnsi="Times New Roman" w:cs="Times New Roman"/>
           <w:color w:val="auto"/>
           <w:u w:val="none"/>
         </w:rPr>
+        <w:t xml:space="preserve"> (priority = low, complexity = ?)</w:t>
+      </w:r>
+    </w:p>
+    <w:p>
+      <w:pPr>
+        <w:ind w:left="1440"/>
       </w:pPr>
       <w:r>
         <w:rPr>
@@ -1185,8 +1081,7 @@
           <w:color w:val="auto"/>
           <w:u w:val="none"/>
         </w:rPr>
-        <w:tab/>
-        <w:t>Chemical Production</w:t>
+        <w:t xml:space="preserve">Unread </w:t>
       </w:r>
       <w:r>
         <w:rPr>
@@ -1195,29 +1090,6 @@
           <w:color w:val="auto"/>
           <w:u w:val="none"/>
         </w:rPr>
-        <w:t xml:space="preserve"> (priority = low, complexity = ?)</w:t>
-      </w:r>
-    </w:p>
-    <w:p>
-      <w:pPr>
-        <w:ind w:left="1440"/>
-      </w:pPr>
-      <w:r>
-        <w:rPr>
-          <w:rStyle w:val="Hyperlink"/>
-          <w:rFonts w:ascii="Times New Roman" w:eastAsia="Times New Roman" w:hAnsi="Times New Roman" w:cs="Times New Roman"/>
-          <w:color w:val="auto"/>
-          <w:u w:val="none"/>
-        </w:rPr>
-        <w:t xml:space="preserve">Unread </w:t>
-      </w:r>
-      <w:r>
-        <w:rPr>
-          <w:rStyle w:val="Hyperlink"/>
-          <w:rFonts w:ascii="Times New Roman" w:eastAsia="Times New Roman" w:hAnsi="Times New Roman" w:cs="Times New Roman"/>
-          <w:color w:val="auto"/>
-          <w:u w:val="none"/>
-        </w:rPr>
         <w:t xml:space="preserve">2024 Nature Chemical Engineering global paper using lifecycle modeling to estimate lifetime emissions from cradle to gate.  Some aspects/methods and data sets could be of value, though we’d want point emissions, not to assign lifecycle emissions at the point of production.  </w:t>
       </w:r>
       <w:hyperlink r:id="rId34" w:history="1">
@@ -1381,6 +1253,9 @@
     <w:p>
       <w:pPr>
         <w:ind w:left="720"/>
+        <w:rPr>
+          <w:rStyle w:val="Hyperlink"/>
+        </w:rPr>
       </w:pPr>
       <w:r>
         <w:t xml:space="preserve">EPA FRS database that primarily includes facility information data for pretty much anything of environmental interest.  </w:t>
@@ -1399,13 +1274,61 @@
         <w:ind w:left="720"/>
       </w:pPr>
       <w:r>
+        <w:t xml:space="preserve">Waste Business Journal for landfills that Joe mentioned was used in combination with LMOP to scale up emissions beyond GHGRP for the GHGI.  </w:t>
+      </w:r>
+      <w:hyperlink r:id="rId42" w:history="1">
+        <w:r>
+          <w:rPr>
+            <w:rStyle w:val="Hyperlink"/>
+          </w:rPr>
+          <w:t>https://www.wasteinfo.com/diratlas.htm</w:t>
+        </w:r>
+      </w:hyperlink>
+      <w:r>
+        <w:t xml:space="preserve">  </w:t>
+      </w:r>
+      <w:r>
         <w:lastRenderedPageBreak/>
+        <w:t>discussed</w:t>
+      </w:r>
+      <w:r>
+        <w:t xml:space="preserve"> in </w:t>
+      </w:r>
+      <w:hyperlink r:id="rId43" w:history="1">
+        <w:r>
+          <w:rPr>
+            <w:rStyle w:val="Hyperlink"/>
+          </w:rPr>
+          <w:t>https://www.epa.gov/sites/production/files/2021-04/documents/us-ghg-inventory-2021-annex-3-additional-source-or-sink-categorie</w:t>
+        </w:r>
+        <w:r>
+          <w:rPr>
+            <w:rStyle w:val="Hyperlink"/>
+          </w:rPr>
+          <w:t>s</w:t>
+        </w:r>
+        <w:r>
+          <w:rPr>
+            <w:rStyle w:val="Hyperlink"/>
+          </w:rPr>
+          <w:t>-part-b.pdf</w:t>
+        </w:r>
+      </w:hyperlink>
+      <w:r>
+        <w:t xml:space="preserve"> </w:t>
+      </w:r>
+    </w:p>
+    <w:p>
+      <w:pPr>
+        <w:ind w:left="720"/>
+      </w:pPr>
+      <w:r>
         <w:t>USDA Census Ag Atlas Maps</w:t>
       </w:r>
       <w:r>
         <w:t xml:space="preserve"> – used by GEPA v2 for several agricultural datasets </w:t>
       </w:r>
-      <w:hyperlink r:id="rId42" w:history="1">
+      <w:hyperlink r:id="rId44" w:history="1">
         <w:r>
           <w:rPr>
             <w:rStyle w:val="Hyperlink"/>
@@ -1422,25 +1345,67 @@
         <w:ind w:left="720"/>
       </w:pPr>
       <w:r>
-        <w:t xml:space="preserve">USDA </w:t>
-      </w:r>
-      <w:proofErr w:type="spellStart"/>
-      <w:r>
-        <w:t>CropScape</w:t>
-      </w:r>
-      <w:proofErr w:type="spellEnd"/>
+        <w:t xml:space="preserve">USDA CropScape </w:t>
+      </w:r>
+      <w:r>
+        <w:t xml:space="preserve">– used by GEPA v2 for high resolution cropland type </w:t>
+      </w:r>
+      <w:hyperlink r:id="rId45" w:history="1">
+        <w:r>
+          <w:rPr>
+            <w:rStyle w:val="Hyperlink"/>
+          </w:rPr>
+          <w:t>https://nassgeodata.gmu.edu/CropScape/</w:t>
+        </w:r>
+      </w:hyperlink>
       <w:r>
         <w:t xml:space="preserve"> </w:t>
       </w:r>
-      <w:r>
-        <w:t xml:space="preserve">– used by GEPA v2 for high resolution cropland type </w:t>
-      </w:r>
-      <w:hyperlink r:id="rId43" w:history="1">
-        <w:r>
-          <w:rPr>
-            <w:rStyle w:val="Hyperlink"/>
-          </w:rPr>
-          <w:t>https://nassgeodata.gmu.edu/CropScape/</w:t>
+    </w:p>
+    <w:p>
+      <w:pPr>
+        <w:ind w:left="720"/>
+      </w:pPr>
+      <w:r>
+        <w:t xml:space="preserve">Enverus </w:t>
+      </w:r>
+      <w:r>
+        <w:t xml:space="preserve">(formerly drillinginfo) </w:t>
+      </w:r>
+      <w:r>
+        <w:t xml:space="preserve">data </w:t>
+      </w:r>
+      <w:r>
+        <w:t xml:space="preserve">– </w:t>
+      </w:r>
+      <w:r>
+        <w:t xml:space="preserve">seems to be a product for sale, though they have university partnerships </w:t>
+      </w:r>
+      <w:hyperlink r:id="rId46" w:history="1">
+        <w:r>
+          <w:rPr>
+            <w:rStyle w:val="Hyperlink"/>
+          </w:rPr>
+          <w:t>https://www.enverus.com/university-partnerships</w:t>
+        </w:r>
+      </w:hyperlink>
+      <w:r>
+        <w:t>.  Used by GEPA v2 for multiple O&amp;G sectors’ activity data.</w:t>
+      </w:r>
+    </w:p>
+    <w:p>
+      <w:pPr>
+        <w:ind w:left="720"/>
+      </w:pPr>
+      <w:r>
+        <w:t xml:space="preserve">Mine safety and health administration – used by GEPA v2 for coal mine locations and some mobile combustion sources.  </w:t>
+      </w:r>
+      <w:hyperlink r:id="rId47" w:history="1">
+        <w:r>
+          <w:rPr>
+            <w:rStyle w:val="Hyperlink"/>
+          </w:rPr>
+          <w:t>https://www.msha.gov/data-and-reports/mine-data-retrieval-system</w:t>
         </w:r>
       </w:hyperlink>
       <w:r>
@@ -1451,73 +1416,10 @@
       <w:pPr>
         <w:ind w:left="720"/>
       </w:pPr>
-      <w:proofErr w:type="spellStart"/>
-      <w:r>
-        <w:t>Enverus</w:t>
-      </w:r>
-      <w:proofErr w:type="spellEnd"/>
-      <w:r>
-        <w:t xml:space="preserve"> </w:t>
-      </w:r>
-      <w:r>
-        <w:t xml:space="preserve">(formerly </w:t>
-      </w:r>
-      <w:proofErr w:type="spellStart"/>
-      <w:r>
-        <w:t>drillinginfo</w:t>
-      </w:r>
-      <w:proofErr w:type="spellEnd"/>
-      <w:r>
-        <w:t xml:space="preserve">) </w:t>
-      </w:r>
-      <w:r>
-        <w:t xml:space="preserve">data </w:t>
-      </w:r>
-      <w:r>
-        <w:t xml:space="preserve">– </w:t>
-      </w:r>
-      <w:r>
-        <w:t xml:space="preserve">seems to be a product for sale, though they have university partnerships </w:t>
-      </w:r>
-      <w:hyperlink r:id="rId44" w:history="1">
-        <w:r>
-          <w:rPr>
-            <w:rStyle w:val="Hyperlink"/>
-          </w:rPr>
-          <w:t>https://www.enverus.com/university-partnerships</w:t>
-        </w:r>
-      </w:hyperlink>
-      <w:r>
-        <w:t>.  Used by GEPA v2 for multiple O&amp;G sectors’ activity data.</w:t>
-      </w:r>
-    </w:p>
-    <w:p>
-      <w:pPr>
-        <w:ind w:left="720"/>
-      </w:pPr>
-      <w:r>
-        <w:t xml:space="preserve">Mine safety and health administration – used by GEPA v2 for coal mine locations and some mobile combustion sources.  </w:t>
-      </w:r>
-      <w:hyperlink r:id="rId45" w:history="1">
-        <w:r>
-          <w:rPr>
-            <w:rStyle w:val="Hyperlink"/>
-          </w:rPr>
-          <w:t>https://www.msha.gov/data-and-reports/mine-data-retrieval-system</w:t>
-        </w:r>
-      </w:hyperlink>
-      <w:r>
-        <w:t xml:space="preserve"> </w:t>
-      </w:r>
-    </w:p>
-    <w:p>
-      <w:pPr>
-        <w:ind w:left="720"/>
-      </w:pPr>
       <w:r>
         <w:t xml:space="preserve">DOT datasets – used by GEPA v2 for mobile combustion sources.  </w:t>
       </w:r>
-      <w:hyperlink r:id="rId46" w:history="1">
+      <w:hyperlink r:id="rId48" w:history="1">
         <w:r>
           <w:rPr>
             <w:rStyle w:val="Hyperlink"/>
@@ -1533,7 +1435,7 @@
       <w:r>
         <w:t xml:space="preserve">National waterway network – used by GEPA v2 for mobile combustion.  </w:t>
       </w:r>
-      <w:hyperlink r:id="rId47" w:history="1">
+      <w:hyperlink r:id="rId49" w:history="1">
         <w:r>
           <w:rPr>
             <w:rStyle w:val="Hyperlink"/>
@@ -1662,13 +1564,8 @@
         <w:t>Maryann Sargent</w:t>
       </w:r>
       <w:r>
-        <w:t xml:space="preserve"> and Steve </w:t>
-      </w:r>
-      <w:proofErr w:type="spellStart"/>
-      <w:r>
-        <w:t>Wofsy</w:t>
-      </w:r>
-      <w:proofErr w:type="spellEnd"/>
+        <w:t xml:space="preserve"> and Steve Wofsy</w:t>
+      </w:r>
     </w:p>
     <w:p>
       <w:pPr>
@@ -1685,7 +1582,7 @@
       <w:r>
         <w:t>Debra Wunch – developed Flame-GTA inventory (</w:t>
       </w:r>
-      <w:hyperlink r:id="rId48" w:history="1">
+      <w:hyperlink r:id="rId50" w:history="1">
         <w:r>
           <w:rPr>
             <w:rStyle w:val="Hyperlink"/>
@@ -1699,7 +1596,7 @@
       <w:r>
         <w:t xml:space="preserve">and has done lots of work on urban CH4 (e.g., </w:t>
       </w:r>
-      <w:hyperlink r:id="rId49" w:history="1">
+      <w:hyperlink r:id="rId51" w:history="1">
         <w:r>
           <w:rPr>
             <w:rStyle w:val="Hyperlink"/>
@@ -1716,6 +1613,7 @@
         <w:ind w:left="720"/>
       </w:pPr>
       <w:r>
+        <w:lastRenderedPageBreak/>
         <w:t>EDF – in general, and especially if we eventually have interest in NG production</w:t>
       </w:r>
     </w:p>
@@ -1732,7 +1630,6 @@
         <w:ind w:left="720"/>
       </w:pPr>
       <w:r>
-        <w:lastRenderedPageBreak/>
         <w:t>GRAAPES/NOAA/James Whetstone – already offered whatever support they can provide in terms of bringing about a better final product</w:t>
       </w:r>
     </w:p>
@@ -1740,13 +1637,8 @@
       <w:pPr>
         <w:ind w:left="720"/>
       </w:pPr>
-      <w:proofErr w:type="spellStart"/>
-      <w:r>
-        <w:t>ConEd</w:t>
-      </w:r>
-      <w:proofErr w:type="spellEnd"/>
-      <w:r>
-        <w:t xml:space="preserve"> or other utilities – we have some tie-ins from the CH4 workshop</w:t>
+      <w:r>
+        <w:t>ConEd or other utilities – we have some tie-ins from the CH4 workshop</w:t>
       </w:r>
     </w:p>
     <w:p>
@@ -1756,7 +1648,7 @@
       <w:r>
         <w:t>Jean Bogner (</w:t>
       </w:r>
-      <w:hyperlink r:id="rId50" w:history="1">
+      <w:hyperlink r:id="rId52" w:history="1">
         <w:r>
           <w:rPr>
             <w:rStyle w:val="Hyperlink"/>

</xml_diff>

<commit_message>
Added new ACP paper (sectoral TROPOMI 25 km2 national inversion, some focused discussion on landfills)
</commit_message>
<xml_diff>
--- a/Inventory_lit_review.docx
+++ b/Inventory_lit_review.docx
@@ -39,8 +39,17 @@
           <w:b/>
           <w:bCs/>
         </w:rPr>
-        <w:t xml:space="preserve"> improve sectors</w:t>
-      </w:r>
+        <w:t xml:space="preserve"> improve </w:t>
+      </w:r>
+      <w:proofErr w:type="gramStart"/>
+      <w:r>
+        <w:rPr>
+          <w:b/>
+          <w:bCs/>
+        </w:rPr>
+        <w:t>sectors</w:t>
+      </w:r>
+      <w:proofErr w:type="gramEnd"/>
     </w:p>
     <w:p>
       <w:pPr>
@@ -72,12 +81,26 @@
         <w:rPr>
           <w:rStyle w:val="citationrow"/>
         </w:rPr>
-        <w:t xml:space="preserve">.  Global study that looks at an empirical relationship between waste composition, moisture, and temperature to adjust the waste decay rate used in landfill emission estimates using IPCC methods.  Showed improved comparisons with measurements (though N is small, ~200), though certainly not a perfect agreement with measurements.  A followup appears to be in the works, preprint = </w:t>
-      </w:r>
+        <w:t xml:space="preserve">.  Global study that looks at an empirical relationship between waste composition, moisture, and temperature to adjust the waste decay rate used in landfill emission estimates using IPCC methods.  Showed improved comparisons with measurements (though N is small, ~200), though certainly not a perfect agreement with measurements.  A </w:t>
+      </w:r>
+      <w:proofErr w:type="spellStart"/>
       <w:r>
         <w:rPr>
           <w:rStyle w:val="citationrow"/>
         </w:rPr>
+        <w:t>followup</w:t>
+      </w:r>
+      <w:proofErr w:type="spellEnd"/>
+      <w:r>
+        <w:rPr>
+          <w:rStyle w:val="citationrow"/>
+        </w:rPr>
+        <w:t xml:space="preserve"> appears to be in the works, preprint = </w:t>
+      </w:r>
+      <w:r>
+        <w:rPr>
+          <w:rStyle w:val="citationrow"/>
+        </w:rPr>
         <w:t>https://doi.org/10.21203/rs.3.rs-3423080/v1</w:t>
       </w:r>
       <w:r>
@@ -90,6 +113,11 @@
     <w:p>
       <w:pPr>
         <w:ind w:left="1440"/>
+        <w:rPr>
+          <w:rStyle w:val="Hyperlink"/>
+          <w:color w:val="auto"/>
+          <w:u w:val="none"/>
+        </w:rPr>
       </w:pPr>
       <w:r>
         <w:rPr>
@@ -114,13 +142,23 @@
         </w:rPr>
         <w:t xml:space="preserve">  </w:t>
       </w:r>
-      <w:r>
-        <w:rPr>
-          <w:rStyle w:val="Hyperlink"/>
-          <w:color w:val="auto"/>
-          <w:u w:val="none"/>
-        </w:rPr>
-        <w:t xml:space="preserve">Sciav + AVIRIS study looking at many landfills showing </w:t>
+      <w:proofErr w:type="spellStart"/>
+      <w:r>
+        <w:rPr>
+          <w:rStyle w:val="Hyperlink"/>
+          <w:color w:val="auto"/>
+          <w:u w:val="none"/>
+        </w:rPr>
+        <w:t>Sciav</w:t>
+      </w:r>
+      <w:proofErr w:type="spellEnd"/>
+      <w:r>
+        <w:rPr>
+          <w:rStyle w:val="Hyperlink"/>
+          <w:color w:val="auto"/>
+          <w:u w:val="none"/>
+        </w:rPr>
+        <w:t xml:space="preserve"> + AVIRIS study looking at many landfills showing </w:t>
       </w:r>
       <w:r>
         <w:rPr>
@@ -141,6 +179,35 @@
     </w:p>
     <w:p>
       <w:pPr>
+        <w:ind w:left="1440"/>
+      </w:pPr>
+      <w:r>
+        <w:rPr>
+          <w:rStyle w:val="Hyperlink"/>
+          <w:color w:val="auto"/>
+          <w:u w:val="none"/>
+        </w:rPr>
+        <w:t xml:space="preserve">ACP – 2024 </w:t>
+      </w:r>
+      <w:hyperlink r:id="rId8" w:history="1">
+        <w:r>
+          <w:rPr>
+            <w:rStyle w:val="Hyperlink"/>
+          </w:rPr>
+          <w:t>https://doi.org/10.5194/acp-24-5069-2024</w:t>
+        </w:r>
+      </w:hyperlink>
+      <w:r>
+        <w:rPr>
+          <w:rStyle w:val="Hyperlink"/>
+          <w:color w:val="auto"/>
+          <w:u w:val="none"/>
+        </w:rPr>
+        <w:t>.  Unread.  National 25 km2 inversion over US in 2019 including detailed sectoral, state, and urban estimates.  Includes some detailed investigation of landfills.</w:t>
+      </w:r>
+    </w:p>
+    <w:p>
+      <w:pPr>
         <w:ind w:firstLine="720"/>
       </w:pPr>
       <w:r>
@@ -154,7 +221,7 @@
       <w:r>
         <w:t xml:space="preserve">Cincinnati – Fries et al., 2018, </w:t>
       </w:r>
-      <w:hyperlink r:id="rId8" w:history="1">
+      <w:hyperlink r:id="rId9" w:history="1">
         <w:r>
           <w:rPr>
             <w:rStyle w:val="Hyperlink"/>
@@ -178,9 +245,17 @@
         </w:rPr>
       </w:pPr>
       <w:r>
-        <w:t xml:space="preserve">Hamburg + Utrecht (EU) – Maazallahi et al., 2020, </w:t>
-      </w:r>
-      <w:hyperlink r:id="rId9" w:history="1">
+        <w:t xml:space="preserve">Hamburg + Utrecht (EU) – </w:t>
+      </w:r>
+      <w:proofErr w:type="spellStart"/>
+      <w:r>
+        <w:t>Maazallahi</w:t>
+      </w:r>
+      <w:proofErr w:type="spellEnd"/>
+      <w:r>
+        <w:t xml:space="preserve"> et al., 2020, </w:t>
+      </w:r>
+      <w:hyperlink r:id="rId10" w:history="1">
         <w:r>
           <w:rPr>
             <w:rStyle w:val="Hyperlink"/>
@@ -231,7 +306,7 @@
       <w:r>
         <w:t xml:space="preserve">Bucharest and Ploiesti (EU) – Fernandez et al., 2022, </w:t>
       </w:r>
-      <w:hyperlink r:id="rId10" w:history="1">
+      <w:hyperlink r:id="rId11" w:history="1">
         <w:r>
           <w:rPr>
             <w:rStyle w:val="Hyperlink"/>
@@ -248,9 +323,17 @@
         <w:ind w:left="1440"/>
       </w:pPr>
       <w:r>
-        <w:t xml:space="preserve">Paris (EU) – Defratyka et al., 2021, </w:t>
-      </w:r>
-      <w:hyperlink r:id="rId11" w:history="1">
+        <w:t xml:space="preserve">Paris (EU) – </w:t>
+      </w:r>
+      <w:proofErr w:type="spellStart"/>
+      <w:r>
+        <w:t>Defratyka</w:t>
+      </w:r>
+      <w:proofErr w:type="spellEnd"/>
+      <w:r>
+        <w:t xml:space="preserve"> et al., 2021, </w:t>
+      </w:r>
+      <w:hyperlink r:id="rId12" w:history="1">
         <w:r>
           <w:rPr>
             <w:rStyle w:val="Hyperlink"/>
@@ -267,9 +350,10 @@
         <w:ind w:left="1440"/>
       </w:pPr>
       <w:r>
+        <w:lastRenderedPageBreak/>
         <w:t xml:space="preserve">Montreal (CA) – Williams et al., 2022, </w:t>
       </w:r>
-      <w:hyperlink r:id="rId12" w:history="1">
+      <w:hyperlink r:id="rId13" w:history="1">
         <w:r>
           <w:rPr>
             <w:rStyle w:val="Hyperlink"/>
@@ -278,11 +362,23 @@
         </w:r>
       </w:hyperlink>
       <w:r>
-        <w:t xml:space="preserve"> – chamber based CH4 and flasks for C isotopes, CO2/CH4 and ethane/methane.  Detailed emission factors for many components on SI pg s17.  NG gate = 2.44E3 [0.74E3 – 4.9E3 </w:t>
-      </w:r>
-      <w:r>
-        <w:lastRenderedPageBreak/>
-        <w:t>95%CI] g/hr.  Sewer manholes = 0.567 [0.025 – 1.946] g/hr. Historic landfills = 14.6 [8.5 – 26.8] mg/hr/m2.  Most (all?) were highly skewed.</w:t>
+        <w:t xml:space="preserve"> – chamber based CH4 and flasks for C isotopes, CO2/CH4 and ethane/methane.  Detailed emission factors for many components on SI </w:t>
+      </w:r>
+      <w:proofErr w:type="spellStart"/>
+      <w:r>
+        <w:t>pg</w:t>
+      </w:r>
+      <w:proofErr w:type="spellEnd"/>
+      <w:r>
+        <w:t xml:space="preserve"> s17.  NG gate = 2.44E3 [0.74E3 – 4.9E3 95%CI] g/hr.  Sewer manholes = 0.567 [0.025 – 1.946] g/hr. Historic landfills = 14.6 [8.5 – 26.8] mg/</w:t>
+      </w:r>
+      <w:proofErr w:type="spellStart"/>
+      <w:r>
+        <w:t>hr</w:t>
+      </w:r>
+      <w:proofErr w:type="spellEnd"/>
+      <w:r>
+        <w:t>/m2.  Most (all?) were highly skewed.</w:t>
       </w:r>
     </w:p>
     <w:p>
@@ -292,7 +388,7 @@
       <w:r>
         <w:t xml:space="preserve">EST 2023, </w:t>
       </w:r>
-      <w:hyperlink r:id="rId13" w:history="1">
+      <w:hyperlink r:id="rId14" w:history="1">
         <w:r>
           <w:rPr>
             <w:rStyle w:val="Hyperlink"/>
@@ -346,15 +442,69 @@
           <w:color w:val="auto"/>
           <w:u w:val="none"/>
         </w:rPr>
-        <w:t>Using this estimate they scaled to national emissions of 1.2 MMT CO2e/yr from sewers.</w:t>
-      </w:r>
-      <w:r>
-        <w:rPr>
-          <w:rStyle w:val="Hyperlink"/>
-          <w:color w:val="auto"/>
-          <w:u w:val="none"/>
-        </w:rPr>
-        <w:t xml:space="preserve">  This is compared to 10.9 ± 7 MMT CO2e/yr from wastewater entirely.  Mentions some relationships with temperature.</w:t>
+        <w:t>Using this estimate they scaled to national emissions of 1.2 MMT CO2e/</w:t>
+      </w:r>
+      <w:proofErr w:type="spellStart"/>
+      <w:r>
+        <w:rPr>
+          <w:rStyle w:val="Hyperlink"/>
+          <w:color w:val="auto"/>
+          <w:u w:val="none"/>
+        </w:rPr>
+        <w:t>yr</w:t>
+      </w:r>
+      <w:proofErr w:type="spellEnd"/>
+      <w:r>
+        <w:rPr>
+          <w:rStyle w:val="Hyperlink"/>
+          <w:color w:val="auto"/>
+          <w:u w:val="none"/>
+        </w:rPr>
+        <w:t xml:space="preserve"> from sewers.</w:t>
+      </w:r>
+      <w:r>
+        <w:rPr>
+          <w:rStyle w:val="Hyperlink"/>
+          <w:color w:val="auto"/>
+          <w:u w:val="none"/>
+        </w:rPr>
+        <w:t xml:space="preserve">  This is compared to 10.9 ± 7 MMT CO2e/</w:t>
+      </w:r>
+      <w:proofErr w:type="spellStart"/>
+      <w:r>
+        <w:rPr>
+          <w:rStyle w:val="Hyperlink"/>
+          <w:color w:val="auto"/>
+          <w:u w:val="none"/>
+        </w:rPr>
+        <w:t>yr</w:t>
+      </w:r>
+      <w:proofErr w:type="spellEnd"/>
+      <w:r>
+        <w:rPr>
+          <w:rStyle w:val="Hyperlink"/>
+          <w:color w:val="auto"/>
+          <w:u w:val="none"/>
+        </w:rPr>
+        <w:t xml:space="preserve"> from wastewater entirely.  </w:t>
+      </w:r>
+      <w:proofErr w:type="gramStart"/>
+      <w:r>
+        <w:rPr>
+          <w:rStyle w:val="Hyperlink"/>
+          <w:color w:val="auto"/>
+          <w:u w:val="none"/>
+        </w:rPr>
+        <w:t>Mentions</w:t>
+      </w:r>
+      <w:proofErr w:type="gramEnd"/>
+      <w:r>
+        <w:rPr>
+          <w:rStyle w:val="Hyperlink"/>
+          <w:color w:val="auto"/>
+          <w:u w:val="none"/>
+        </w:rPr>
+        <w:t xml:space="preserve"> some relationships with temperature.</w:t>
       </w:r>
     </w:p>
     <w:p>
@@ -372,7 +522,7 @@
       <w:r>
         <w:t xml:space="preserve">Moore et al., 2023, </w:t>
       </w:r>
-      <w:hyperlink r:id="rId14" w:history="1">
+      <w:hyperlink r:id="rId15" w:history="1">
         <w:r>
           <w:rPr>
             <w:rStyle w:val="Hyperlink"/>
@@ -381,14 +531,30 @@
         </w:r>
       </w:hyperlink>
       <w:r>
-        <w:t xml:space="preserve"> - 63 plants across US discussing biochemical oxygen demand (BOD) and flow based emission factors.  BOD was ~constant with size and flow was log-linear.  ~2x IPPC/EPA EF on average.  Also stresses that variability in operations over time and facility to facility are important and make these EF’s more “rough estimates”.  Mentions of diurnal patterns from previous work.</w:t>
+        <w:t xml:space="preserve"> - 63 plants across US discussing biochemical oxygen demand (BOD) and </w:t>
+      </w:r>
+      <w:proofErr w:type="gramStart"/>
+      <w:r>
+        <w:t>flow based</w:t>
+      </w:r>
+      <w:proofErr w:type="gramEnd"/>
+      <w:r>
+        <w:t xml:space="preserve"> emission factors.  BOD was ~constant with size and flow was </w:t>
+      </w:r>
+      <w:proofErr w:type="gramStart"/>
+      <w:r>
+        <w:t>log-linear</w:t>
+      </w:r>
+      <w:proofErr w:type="gramEnd"/>
+      <w:r>
+        <w:t>.  ~2x IPPC/EPA EF on average.  Also stresses that variability in operations over time and facility to facility are important and make these EF’s more “rough estimates”.  Mentions of diurnal patterns from previous work.</w:t>
       </w:r>
     </w:p>
     <w:p>
       <w:pPr>
         <w:ind w:left="1440"/>
       </w:pPr>
-      <w:hyperlink r:id="rId15" w:history="1">
+      <w:hyperlink r:id="rId16" w:history="1">
         <w:r>
           <w:rPr>
             <w:rStyle w:val="Hyperlink"/>
@@ -402,8 +568,13 @@
       <w:r>
         <w:t xml:space="preserve">Unread.  </w:t>
       </w:r>
-      <w:r>
-        <w:t xml:space="preserve">International </w:t>
+      <w:proofErr w:type="gramStart"/>
+      <w:r>
+        <w:t>International</w:t>
+      </w:r>
+      <w:proofErr w:type="gramEnd"/>
+      <w:r>
+        <w:t xml:space="preserve"> </w:t>
       </w:r>
       <w:r>
         <w:t>article</w:t>
@@ -425,7 +596,7 @@
       <w:r>
         <w:t xml:space="preserve">Multiple US cities – Lamb et al., 2015, </w:t>
       </w:r>
-      <w:hyperlink r:id="rId16" w:history="1">
+      <w:hyperlink r:id="rId17" w:history="1">
         <w:r>
           <w:rPr>
             <w:rStyle w:val="Hyperlink"/>
@@ -452,7 +623,7 @@
       <w:r>
         <w:t xml:space="preserve">LA – Zeng et al., 2023, </w:t>
       </w:r>
-      <w:hyperlink r:id="rId17" w:history="1">
+      <w:hyperlink r:id="rId18" w:history="1">
         <w:r>
           <w:rPr>
             <w:rStyle w:val="Hyperlink"/>
@@ -480,7 +651,7 @@
       <w:r>
         <w:t xml:space="preserve">DC – Karion et al., 2023, </w:t>
       </w:r>
-      <w:hyperlink r:id="rId18" w:history="1">
+      <w:hyperlink r:id="rId19" w:history="1">
         <w:r>
           <w:rPr>
             <w:rStyle w:val="Hyperlink"/>
@@ -499,7 +670,7 @@
       <w:r>
         <w:t xml:space="preserve">Baltimore – Karion et al., 2023, </w:t>
       </w:r>
-      <w:hyperlink r:id="rId19" w:history="1">
+      <w:hyperlink r:id="rId20" w:history="1">
         <w:r>
           <w:rPr>
             <w:rStyle w:val="Hyperlink"/>
@@ -521,7 +692,7 @@
       <w:r>
         <w:t xml:space="preserve"> </w:t>
       </w:r>
-      <w:hyperlink r:id="rId20" w:history="1">
+      <w:hyperlink r:id="rId21" w:history="1">
         <w:r>
           <w:rPr>
             <w:rStyle w:val="Hyperlink"/>
@@ -530,30 +701,13 @@
         </w:r>
       </w:hyperlink>
       <w:r>
-        <w:t xml:space="preserve"> - CH4 seasonality is linear in dormant season only as 0.021x+11 g/m2yr.  NG sector is linear as 0.025x+6.4 g/m2yr</w:t>
-      </w:r>
-    </w:p>
-    <w:p>
-      <w:pPr>
-        <w:ind w:left="1440"/>
-      </w:pPr>
-      <w:r>
-        <w:t xml:space="preserve">EST 2024, </w:t>
-      </w:r>
-      <w:hyperlink r:id="rId21" w:history="1">
-        <w:r>
-          <w:rPr>
-            <w:rStyle w:val="Hyperlink"/>
-          </w:rPr>
-          <w:t>https://doi.org/10.1021/acs.est.3c03160</w:t>
-        </w:r>
-      </w:hyperlink>
-      <w:r>
-        <w:t>.  Unread F</w:t>
-      </w:r>
-      <w:r>
-        <w:t>elix Vogel et al., using vehicle based measurements to understand NG leaks in urban centers.  Could provide some useful information beyond previous papers.</w:t>
-      </w:r>
+        <w:t xml:space="preserve"> - CH4 seasonality is linear in dormant season only as 0.021x+11 g/m2yr.  NG sector is linear as 0.025x+6.4 g/</w:t>
+      </w:r>
+      <w:proofErr w:type="gramStart"/>
+      <w:r>
+        <w:t>m2yr</w:t>
+      </w:r>
+      <w:proofErr w:type="gramEnd"/>
     </w:p>
     <w:p>
       <w:pPr>
@@ -568,6 +722,36 @@
           <w:rPr>
             <w:rStyle w:val="Hyperlink"/>
           </w:rPr>
+          <w:t>https://doi.org/10.1021/acs.est.3c03160</w:t>
+        </w:r>
+      </w:hyperlink>
+      <w:r>
+        <w:t>.  Unread F</w:t>
+      </w:r>
+      <w:r>
+        <w:t xml:space="preserve">elix Vogel et al., using </w:t>
+      </w:r>
+      <w:proofErr w:type="gramStart"/>
+      <w:r>
+        <w:t>vehicle based</w:t>
+      </w:r>
+      <w:proofErr w:type="gramEnd"/>
+      <w:r>
+        <w:t xml:space="preserve"> measurements to understand NG leaks in urban centers.  Could provide some useful information beyond previous papers.</w:t>
+      </w:r>
+    </w:p>
+    <w:p>
+      <w:pPr>
+        <w:ind w:left="1440"/>
+      </w:pPr>
+      <w:r>
+        <w:t xml:space="preserve">EST 2024, </w:t>
+      </w:r>
+      <w:hyperlink r:id="rId23" w:history="1">
+        <w:r>
+          <w:rPr>
+            <w:rStyle w:val="Hyperlink"/>
+          </w:rPr>
           <w:t>https://doi.org/10.1021/acs.est.3c10316</w:t>
         </w:r>
       </w:hyperlink>
@@ -599,7 +783,7 @@
       <w:r>
         <w:t xml:space="preserve">PLOS one – 2023 </w:t>
       </w:r>
-      <w:hyperlink r:id="rId23" w:history="1">
+      <w:hyperlink r:id="rId24" w:history="1">
         <w:r>
           <w:rPr>
             <w:rStyle w:val="Hyperlink"/>
@@ -617,7 +801,15 @@
         <w:t>1/3 produced measurable CH4 (all produced N2O too).  Used to build EFs</w:t>
       </w:r>
       <w:r>
-        <w:t xml:space="preserve"> – older (&gt;30) individuals emitted slightly more and women were more likely to emit</w:t>
+        <w:t xml:space="preserve"> – older (&gt;30) individuals emitted slightly </w:t>
+      </w:r>
+      <w:proofErr w:type="gramStart"/>
+      <w:r>
+        <w:t>more</w:t>
+      </w:r>
+      <w:proofErr w:type="gramEnd"/>
+      <w:r>
+        <w:t xml:space="preserve"> and women were more likely to emit</w:t>
       </w:r>
       <w:r>
         <w:t>.  Specific to UK</w:t>
@@ -650,7 +842,15 @@
         <w:t>.</w:t>
       </w:r>
       <w:r>
-        <w:t xml:space="preserve">  They state “if the greater London area were a managed grassland, soil emissions of CH4 would be equivalent to that of human breath in the same area” – so emissions are small (0.05% of national inventory).  But, census data is easily available – so it wouldn’t be a hard one to add.  </w:t>
+        <w:t xml:space="preserve">  They state “if the greater London area were a managed grassland, soil emissions of CH4 would be equivalent to that of human breath in the same area” – so emissions are small (0.05% of national inventory).  </w:t>
+      </w:r>
+      <w:proofErr w:type="gramStart"/>
+      <w:r>
+        <w:t>But,</w:t>
+      </w:r>
+      <w:proofErr w:type="gramEnd"/>
+      <w:r>
+        <w:t xml:space="preserve"> census data is easily available – so it wouldn’t be a hard one to add.  </w:t>
       </w:r>
       <w:r>
         <w:t>There are s</w:t>
@@ -659,10 +859,26 @@
         <w:t xml:space="preserve">ome other </w:t>
       </w:r>
       <w:r>
-        <w:t>relevant work in their citations</w:t>
-      </w:r>
-      <w:r>
-        <w:t>, though they also seem to be limited N people or regions.</w:t>
+        <w:t xml:space="preserve">relevant </w:t>
+      </w:r>
+      <w:proofErr w:type="gramStart"/>
+      <w:r>
+        <w:t>work</w:t>
+      </w:r>
+      <w:proofErr w:type="gramEnd"/>
+      <w:r>
+        <w:t xml:space="preserve"> in their citations</w:t>
+      </w:r>
+      <w:r>
+        <w:t xml:space="preserve">, though they also seem to be </w:t>
+      </w:r>
+      <w:proofErr w:type="gramStart"/>
+      <w:r>
+        <w:t>limited</w:t>
+      </w:r>
+      <w:proofErr w:type="gramEnd"/>
+      <w:r>
+        <w:t xml:space="preserve"> N people or regions.</w:t>
       </w:r>
     </w:p>
     <w:p>
@@ -684,7 +900,7 @@
         <w:tab/>
         <w:t xml:space="preserve">RECAPP2 – </w:t>
       </w:r>
-      <w:hyperlink r:id="rId24" w:history="1">
+      <w:hyperlink r:id="rId25" w:history="1">
         <w:r>
           <w:rPr>
             <w:rStyle w:val="Hyperlink"/>
@@ -702,7 +918,15 @@
       </w:pPr>
       <w:r>
         <w:tab/>
-        <w:t>Many models beyond just WETCHARTS (Wetchimp, NASA’s LPJ-WSL, SOCCR)</w:t>
+        <w:t>Many models beyond just WETCHARTS (</w:t>
+      </w:r>
+      <w:proofErr w:type="spellStart"/>
+      <w:r>
+        <w:t>Wetchimp</w:t>
+      </w:r>
+      <w:proofErr w:type="spellEnd"/>
+      <w:r>
+        <w:t>, NASA’s LPJ-WSL, SOCCR)</w:t>
       </w:r>
     </w:p>
     <w:p>
@@ -718,7 +942,7 @@
       <w:r>
         <w:t xml:space="preserve">AGU Advances </w:t>
       </w:r>
-      <w:hyperlink r:id="rId25" w:history="1">
+      <w:hyperlink r:id="rId26" w:history="1">
         <w:r>
           <w:rPr>
             <w:rStyle w:val="Hyperlink"/>
@@ -746,7 +970,7 @@
       <w:r>
         <w:t xml:space="preserve">UK – Boothroyd et al., 2018, </w:t>
       </w:r>
-      <w:hyperlink r:id="rId26" w:history="1">
+      <w:hyperlink r:id="rId27" w:history="1">
         <w:r>
           <w:rPr>
             <w:rStyle w:val="Hyperlink"/>
@@ -776,7 +1000,15 @@
         <w:t xml:space="preserve"> and C13-CH4 measurements.  </w:t>
       </w:r>
       <w:r>
-        <w:t>2.043 tonnes/km/yr.</w:t>
+        <w:t xml:space="preserve">2.043 </w:t>
+      </w:r>
+      <w:proofErr w:type="spellStart"/>
+      <w:r>
+        <w:t>tonnes</w:t>
+      </w:r>
+      <w:proofErr w:type="spellEnd"/>
+      <w:r>
+        <w:t>/km/yr.</w:t>
       </w:r>
     </w:p>
     <w:p>
@@ -829,7 +1061,7 @@
         </w:rPr>
         <w:t xml:space="preserve">Omara et al., (many familiar Harvard and EDF folks) 2023 – ESD </w:t>
       </w:r>
-      <w:hyperlink r:id="rId27" w:history="1">
+      <w:hyperlink r:id="rId28" w:history="1">
         <w:r>
           <w:rPr>
             <w:rStyle w:val="Hyperlink"/>
@@ -868,7 +1100,7 @@
       <w:r>
         <w:t xml:space="preserve">Riddick et al., Atmosphere – 2024 </w:t>
       </w:r>
-      <w:hyperlink r:id="rId28" w:history="1">
+      <w:hyperlink r:id="rId29" w:history="1">
         <w:r>
           <w:rPr>
             <w:rStyle w:val="Hyperlink"/>
@@ -891,9 +1123,10 @@
         <w:ind w:left="1440"/>
       </w:pPr>
       <w:r>
+        <w:lastRenderedPageBreak/>
         <w:t xml:space="preserve">Conrad et al., Communications Earth and Environment – 2023 </w:t>
       </w:r>
-      <w:hyperlink r:id="rId29" w:history="1">
+      <w:hyperlink r:id="rId30" w:history="1">
         <w:r>
           <w:rPr>
             <w:rStyle w:val="Hyperlink"/>
@@ -916,10 +1149,9 @@
         <w:ind w:left="1440"/>
       </w:pPr>
       <w:r>
-        <w:lastRenderedPageBreak/>
         <w:t xml:space="preserve">GFEI inventory – Scarpelli et al., ACP 2022 </w:t>
       </w:r>
-      <w:hyperlink r:id="rId30" w:history="1">
+      <w:hyperlink r:id="rId31" w:history="1">
         <w:r>
           <w:rPr>
             <w:rStyle w:val="Hyperlink"/>
@@ -947,7 +1179,7 @@
       <w:r>
         <w:t xml:space="preserve">Fiddler et al., JGR Atmospheres – 2024 </w:t>
       </w:r>
-      <w:hyperlink r:id="rId31" w:history="1">
+      <w:hyperlink r:id="rId32" w:history="1">
         <w:r>
           <w:rPr>
             <w:rStyle w:val="Hyperlink"/>
@@ -962,13 +1194,29 @@
         <w:t xml:space="preserve">Unread </w:t>
       </w:r>
       <w:r>
-        <w:t>FIREX – AQ emission factors – including one for CH4.  I’m not sure how well the underlying activity data can be accessed, but worth looking at if we consider this sector.</w:t>
+        <w:t xml:space="preserve">FIREX – AQ emission factors – including one for CH4.  I’m not sure how well the underlying activity data can be accessed, but </w:t>
+      </w:r>
+      <w:proofErr w:type="gramStart"/>
+      <w:r>
+        <w:t>worth</w:t>
+      </w:r>
+      <w:proofErr w:type="gramEnd"/>
+      <w:r>
+        <w:t xml:space="preserve"> looking at if we consider this sector.</w:t>
       </w:r>
     </w:p>
     <w:p>
       <w:r>
         <w:tab/>
-        <w:t>Ag (priority = low, complexity = ?)</w:t>
+        <w:t xml:space="preserve">Ag (priority = low, complexity </w:t>
+      </w:r>
+      <w:proofErr w:type="gramStart"/>
+      <w:r>
+        <w:t>= ?</w:t>
+      </w:r>
+      <w:proofErr w:type="gramEnd"/>
+      <w:r>
+        <w:t>)</w:t>
       </w:r>
     </w:p>
     <w:p>
@@ -993,7 +1241,7 @@
       <w:r>
         <w:t xml:space="preserve">sectoral optimization in Colorado </w:t>
       </w:r>
-      <w:hyperlink r:id="rId32" w:history="1">
+      <w:hyperlink r:id="rId33" w:history="1">
         <w:r>
           <w:rPr>
             <w:rStyle w:val="Hyperlink"/>
@@ -1020,9 +1268,29 @@
           <w:color w:val="auto"/>
           <w:u w:val="none"/>
         </w:rPr>
-        <w:t xml:space="preserve">Unread 2024 EST paper on agricultural ponds.  Discusses a method to estimate emissions, uses Australia to demo and compare to reported emissions.  41 kt/yr or 0.238 t/ha/yr.  </w:t>
-      </w:r>
-      <w:hyperlink r:id="rId33" w:history="1">
+        <w:t>Unread 2024 EST paper on agricultural ponds.  Discusses a method to estimate emissions, uses Australia to demo and compare to reported emissions.  41 kt/</w:t>
+      </w:r>
+      <w:proofErr w:type="spellStart"/>
+      <w:r>
+        <w:rPr>
+          <w:rStyle w:val="Hyperlink"/>
+          <w:rFonts w:ascii="Times New Roman" w:eastAsia="Times New Roman" w:hAnsi="Times New Roman" w:cs="Times New Roman"/>
+          <w:color w:val="auto"/>
+          <w:u w:val="none"/>
+        </w:rPr>
+        <w:t>yr</w:t>
+      </w:r>
+      <w:proofErr w:type="spellEnd"/>
+      <w:r>
+        <w:rPr>
+          <w:rStyle w:val="Hyperlink"/>
+          <w:rFonts w:ascii="Times New Roman" w:eastAsia="Times New Roman" w:hAnsi="Times New Roman" w:cs="Times New Roman"/>
+          <w:color w:val="auto"/>
+          <w:u w:val="none"/>
+        </w:rPr>
+        <w:t xml:space="preserve"> or 0.238 t/ha/yr.  </w:t>
+      </w:r>
+      <w:hyperlink r:id="rId34" w:history="1">
         <w:r>
           <w:rPr>
             <w:rStyle w:val="Hyperlink"/>
@@ -1067,7 +1335,27 @@
           <w:color w:val="auto"/>
           <w:u w:val="none"/>
         </w:rPr>
-        <w:t xml:space="preserve"> (priority = low, complexity = ?)</w:t>
+        <w:t xml:space="preserve"> (priority = low, complexity </w:t>
+      </w:r>
+      <w:proofErr w:type="gramStart"/>
+      <w:r>
+        <w:rPr>
+          <w:rStyle w:val="Hyperlink"/>
+          <w:rFonts w:ascii="Times New Roman" w:eastAsia="Times New Roman" w:hAnsi="Times New Roman" w:cs="Times New Roman"/>
+          <w:color w:val="auto"/>
+          <w:u w:val="none"/>
+        </w:rPr>
+        <w:t>= ?</w:t>
+      </w:r>
+      <w:proofErr w:type="gramEnd"/>
+      <w:r>
+        <w:rPr>
+          <w:rStyle w:val="Hyperlink"/>
+          <w:rFonts w:ascii="Times New Roman" w:eastAsia="Times New Roman" w:hAnsi="Times New Roman" w:cs="Times New Roman"/>
+          <w:color w:val="auto"/>
+          <w:u w:val="none"/>
+        </w:rPr>
+        <w:t>)</w:t>
       </w:r>
     </w:p>
     <w:p>
@@ -1092,7 +1380,7 @@
         </w:rPr>
         <w:t xml:space="preserve">2024 Nature Chemical Engineering global paper using lifecycle modeling to estimate lifetime emissions from cradle to gate.  Some aspects/methods and data sets could be of value, though we’d want point emissions, not to assign lifecycle emissions at the point of production.  </w:t>
       </w:r>
-      <w:hyperlink r:id="rId34" w:history="1">
+      <w:hyperlink r:id="rId35" w:history="1">
         <w:r>
           <w:rPr>
             <w:rStyle w:val="Hyperlink"/>
@@ -1140,7 +1428,7 @@
       <w:r>
         <w:t xml:space="preserve">Toronto (CA) - </w:t>
       </w:r>
-      <w:hyperlink r:id="rId35" w:history="1">
+      <w:hyperlink r:id="rId36" w:history="1">
         <w:r>
           <w:rPr>
             <w:rStyle w:val="Hyperlink"/>
@@ -1161,7 +1449,7 @@
         </w:rPr>
         <w:t xml:space="preserve">Scarpelli Canada GEPA – </w:t>
       </w:r>
-      <w:hyperlink r:id="rId36" w:history="1">
+      <w:hyperlink r:id="rId37" w:history="1">
         <w:r>
           <w:rPr>
             <w:rStyle w:val="Hyperlink"/>
@@ -1180,7 +1468,7 @@
       <w:r>
         <w:t xml:space="preserve">New to me, but Climate TRACE – global (national for some, facility level for others).  Seems to be primarily built from models relying on machine learning + measurements, but very few publications (much more policy-focused, Al Gore sponsored).  </w:t>
       </w:r>
-      <w:hyperlink r:id="rId37" w:history="1">
+      <w:hyperlink r:id="rId38" w:history="1">
         <w:r>
           <w:rPr>
             <w:rStyle w:val="Hyperlink"/>
@@ -1191,7 +1479,7 @@
       <w:r>
         <w:t xml:space="preserve">.  </w:t>
       </w:r>
-      <w:hyperlink r:id="rId38" w:history="1">
+      <w:hyperlink r:id="rId39" w:history="1">
         <w:r>
           <w:rPr>
             <w:rStyle w:val="Hyperlink"/>
@@ -1215,264 +1503,282 @@
           <w:b/>
           <w:bCs/>
         </w:rPr>
-        <w:t>New datasets to consider</w:t>
-      </w:r>
-    </w:p>
-    <w:p>
-      <w:pPr>
-        <w:ind w:left="720"/>
-      </w:pPr>
-      <w:r>
-        <w:t xml:space="preserve">FEMA structure data – building occupancy type (industrial, residential, etc.) map for the whole US.  </w:t>
-      </w:r>
-      <w:hyperlink r:id="rId39" w:history="1">
-        <w:r>
-          <w:rPr>
-            <w:rStyle w:val="Hyperlink"/>
-          </w:rPr>
-          <w:t>https://gis-fema.hub.arcgis.com/pages/usa-structures</w:t>
-        </w:r>
-      </w:hyperlink>
-    </w:p>
-    <w:p>
-      <w:pPr>
-        <w:ind w:left="720"/>
-      </w:pPr>
-      <w:r>
-        <w:t xml:space="preserve">Census house heating fuel – one of many census data tables available at national to county levels.  </w:t>
-      </w:r>
-      <w:hyperlink r:id="rId40" w:history="1">
-        <w:r>
-          <w:rPr>
-            <w:rStyle w:val="Hyperlink"/>
-          </w:rPr>
-          <w:t>https://data.census.gov/table/ACSDT5Y2020.B25040?q=B25040</w:t>
-        </w:r>
-      </w:hyperlink>
-    </w:p>
-    <w:p>
-      <w:pPr>
-        <w:ind w:left="720"/>
-        <w:rPr>
-          <w:rStyle w:val="Hyperlink"/>
-        </w:rPr>
-      </w:pPr>
-      <w:r>
-        <w:t xml:space="preserve">EPA FRS database that primarily includes facility information data for pretty much anything of environmental interest.  </w:t>
-      </w:r>
-      <w:hyperlink r:id="rId41" w:history="1">
-        <w:r>
-          <w:rPr>
-            <w:rStyle w:val="Hyperlink"/>
-          </w:rPr>
-          <w:t>https://www.epa.gov/frs</w:t>
-        </w:r>
-      </w:hyperlink>
-    </w:p>
-    <w:p>
-      <w:pPr>
-        <w:ind w:left="720"/>
-      </w:pPr>
-      <w:r>
-        <w:t xml:space="preserve">Waste Business Journal for landfills that Joe mentioned was used in combination with LMOP to scale up emissions beyond GHGRP for the GHGI.  </w:t>
-      </w:r>
-      <w:hyperlink r:id="rId42" w:history="1">
-        <w:r>
-          <w:rPr>
-            <w:rStyle w:val="Hyperlink"/>
-          </w:rPr>
-          <w:t>https://www.wasteinfo.com/diratlas.htm</w:t>
-        </w:r>
-      </w:hyperlink>
-      <w:r>
-        <w:t xml:space="preserve">  </w:t>
-      </w:r>
-      <w:r>
-        <w:lastRenderedPageBreak/>
-        <w:t>discussed</w:t>
-      </w:r>
-      <w:r>
-        <w:t xml:space="preserve"> in </w:t>
-      </w:r>
-      <w:hyperlink r:id="rId43" w:history="1">
-        <w:r>
-          <w:rPr>
-            <w:rStyle w:val="Hyperlink"/>
-          </w:rPr>
-          <w:t>https://www.epa.gov/sites/production/files/2021-04/documents/us-ghg-inventory-2021-annex-3-additional-source-or-sink-categorie</w:t>
-        </w:r>
-        <w:r>
-          <w:rPr>
-            <w:rStyle w:val="Hyperlink"/>
-          </w:rPr>
-          <w:t>s</w:t>
-        </w:r>
-        <w:r>
-          <w:rPr>
-            <w:rStyle w:val="Hyperlink"/>
-          </w:rPr>
-          <w:t>-part-b.pdf</w:t>
-        </w:r>
-      </w:hyperlink>
-      <w:r>
-        <w:t xml:space="preserve"> </w:t>
-      </w:r>
-    </w:p>
-    <w:p>
-      <w:pPr>
-        <w:ind w:left="720"/>
-      </w:pPr>
-      <w:r>
-        <w:t>USDA Census Ag Atlas Maps</w:t>
-      </w:r>
-      <w:r>
-        <w:t xml:space="preserve"> – used by GEPA v2 for several agricultural datasets </w:t>
-      </w:r>
-      <w:hyperlink r:id="rId44" w:history="1">
-        <w:r>
-          <w:rPr>
-            <w:rStyle w:val="Hyperlink"/>
-          </w:rPr>
-          <w:t>https://www.nass.usda.gov/Publications/AgCensus/2017/Online_Resources/Ag_Atlas_Maps/index.php</w:t>
-        </w:r>
-      </w:hyperlink>
-      <w:r>
-        <w:t xml:space="preserve"> </w:t>
-      </w:r>
-    </w:p>
-    <w:p>
-      <w:pPr>
-        <w:ind w:left="720"/>
-      </w:pPr>
-      <w:r>
-        <w:t xml:space="preserve">USDA CropScape </w:t>
-      </w:r>
-      <w:r>
-        <w:t xml:space="preserve">– used by GEPA v2 for high resolution cropland type </w:t>
-      </w:r>
-      <w:hyperlink r:id="rId45" w:history="1">
-        <w:r>
-          <w:rPr>
-            <w:rStyle w:val="Hyperlink"/>
-          </w:rPr>
-          <w:t>https://nassgeodata.gmu.edu/CropScape/</w:t>
-        </w:r>
-      </w:hyperlink>
-      <w:r>
-        <w:t xml:space="preserve"> </w:t>
-      </w:r>
-    </w:p>
-    <w:p>
-      <w:pPr>
-        <w:ind w:left="720"/>
-      </w:pPr>
-      <w:r>
-        <w:t xml:space="preserve">Enverus </w:t>
-      </w:r>
-      <w:r>
-        <w:t xml:space="preserve">(formerly drillinginfo) </w:t>
-      </w:r>
-      <w:r>
-        <w:t xml:space="preserve">data </w:t>
-      </w:r>
-      <w:r>
-        <w:t xml:space="preserve">– </w:t>
-      </w:r>
-      <w:r>
-        <w:t xml:space="preserve">seems to be a product for sale, though they have university partnerships </w:t>
-      </w:r>
-      <w:hyperlink r:id="rId46" w:history="1">
-        <w:r>
-          <w:rPr>
-            <w:rStyle w:val="Hyperlink"/>
-          </w:rPr>
-          <w:t>https://www.enverus.com/university-partnerships</w:t>
-        </w:r>
-      </w:hyperlink>
-      <w:r>
-        <w:t>.  Used by GEPA v2 for multiple O&amp;G sectors’ activity data.</w:t>
-      </w:r>
-    </w:p>
-    <w:p>
-      <w:pPr>
-        <w:ind w:left="720"/>
-      </w:pPr>
-      <w:r>
-        <w:t xml:space="preserve">Mine safety and health administration – used by GEPA v2 for coal mine locations and some mobile combustion sources.  </w:t>
-      </w:r>
-      <w:hyperlink r:id="rId47" w:history="1">
-        <w:r>
-          <w:rPr>
-            <w:rStyle w:val="Hyperlink"/>
-          </w:rPr>
-          <w:t>https://www.msha.gov/data-and-reports/mine-data-retrieval-system</w:t>
-        </w:r>
-      </w:hyperlink>
-      <w:r>
-        <w:t xml:space="preserve"> </w:t>
-      </w:r>
-    </w:p>
-    <w:p>
-      <w:pPr>
-        <w:ind w:left="720"/>
-      </w:pPr>
-      <w:r>
-        <w:t xml:space="preserve">DOT datasets – used by GEPA v2 for mobile combustion sources.  </w:t>
-      </w:r>
-      <w:hyperlink r:id="rId48" w:history="1">
-        <w:r>
-          <w:rPr>
-            <w:rStyle w:val="Hyperlink"/>
-          </w:rPr>
-          <w:t>https://www.fhwa.dot.gov/policyinformation/statistics/2012/</w:t>
-        </w:r>
-      </w:hyperlink>
-    </w:p>
-    <w:p>
-      <w:pPr>
-        <w:ind w:left="720"/>
-      </w:pPr>
-      <w:r>
-        <w:t xml:space="preserve">National waterway network – used by GEPA v2 for mobile combustion.  </w:t>
-      </w:r>
-      <w:hyperlink r:id="rId49" w:history="1">
-        <w:r>
-          <w:rPr>
-            <w:rStyle w:val="Hyperlink"/>
-          </w:rPr>
-          <w:t>https://data-usdot.opendata.arcgis.com/datasets/usdot::navigable-waterway-network-lines/about</w:t>
-        </w:r>
-      </w:hyperlink>
-      <w:r>
-        <w:t xml:space="preserve"> </w:t>
-      </w:r>
-    </w:p>
-    <w:p>
-      <w:pPr>
+        <w:t xml:space="preserve">New datasets to </w:t>
+      </w:r>
+      <w:proofErr w:type="gramStart"/>
+      <w:r>
         <w:rPr>
           <w:b/>
           <w:bCs/>
         </w:rPr>
-      </w:pPr>
-      <w:r>
+        <w:t>consider</w:t>
+      </w:r>
+      <w:proofErr w:type="gramEnd"/>
+    </w:p>
+    <w:p>
+      <w:pPr>
+        <w:ind w:left="720"/>
+      </w:pPr>
+      <w:r>
+        <w:t xml:space="preserve">FEMA structure data – building occupancy type (industrial, residential, etc.) map for the whole US.  </w:t>
+      </w:r>
+      <w:hyperlink r:id="rId40" w:history="1">
+        <w:r>
+          <w:rPr>
+            <w:rStyle w:val="Hyperlink"/>
+          </w:rPr>
+          <w:t>https://gis-fema.hub.arcgis.com/pages/usa-structures</w:t>
+        </w:r>
+      </w:hyperlink>
+    </w:p>
+    <w:p>
+      <w:pPr>
+        <w:ind w:left="720"/>
+      </w:pPr>
+      <w:r>
+        <w:t xml:space="preserve">Census house heating fuel – one of many census data tables available at national to county levels.  </w:t>
+      </w:r>
+      <w:hyperlink r:id="rId41" w:history="1">
+        <w:r>
+          <w:rPr>
+            <w:rStyle w:val="Hyperlink"/>
+          </w:rPr>
+          <w:t>https://data.census.gov/table/ACSDT5Y2020.B25040?q=B25040</w:t>
+        </w:r>
+      </w:hyperlink>
+    </w:p>
+    <w:p>
+      <w:pPr>
+        <w:ind w:left="720"/>
+        <w:rPr>
+          <w:rStyle w:val="Hyperlink"/>
+        </w:rPr>
+      </w:pPr>
+      <w:r>
+        <w:lastRenderedPageBreak/>
+        <w:t xml:space="preserve">EPA FRS database that primarily includes facility information data for pretty much anything of environmental interest.  </w:t>
+      </w:r>
+      <w:hyperlink r:id="rId42" w:history="1">
+        <w:r>
+          <w:rPr>
+            <w:rStyle w:val="Hyperlink"/>
+          </w:rPr>
+          <w:t>https://www.epa.gov/frs</w:t>
+        </w:r>
+      </w:hyperlink>
+    </w:p>
+    <w:p>
+      <w:pPr>
+        <w:ind w:left="720"/>
+      </w:pPr>
+      <w:r>
+        <w:t xml:space="preserve">Waste Business Journal for landfills that Joe mentioned was used in combination with LMOP to scale up emissions beyond GHGRP for the GHGI.  </w:t>
+      </w:r>
+      <w:hyperlink r:id="rId43" w:history="1">
+        <w:r>
+          <w:rPr>
+            <w:rStyle w:val="Hyperlink"/>
+          </w:rPr>
+          <w:t>https://www.wasteinfo.com/diratlas.htm</w:t>
+        </w:r>
+      </w:hyperlink>
+      <w:r>
+        <w:t xml:space="preserve">  </w:t>
+      </w:r>
+      <w:r>
+        <w:t>discussed</w:t>
+      </w:r>
+      <w:r>
+        <w:t xml:space="preserve"> in </w:t>
+      </w:r>
+      <w:hyperlink r:id="rId44" w:history="1">
+        <w:r>
+          <w:rPr>
+            <w:rStyle w:val="Hyperlink"/>
+          </w:rPr>
+          <w:t>https://www.epa.gov/sites/production/files/2021-04/documents/us-ghg-inventory-2021-annex-3-additional-source-or-sink-categories-part-b.pdf</w:t>
+        </w:r>
+      </w:hyperlink>
+      <w:r>
+        <w:t xml:space="preserve"> </w:t>
+      </w:r>
+    </w:p>
+    <w:p>
+      <w:pPr>
+        <w:ind w:left="720"/>
+      </w:pPr>
+      <w:r>
+        <w:t>USDA Census Ag Atlas Maps</w:t>
+      </w:r>
+      <w:r>
+        <w:t xml:space="preserve"> – used by GEPA v2 for several agricultural datasets </w:t>
+      </w:r>
+      <w:hyperlink r:id="rId45" w:history="1">
+        <w:r>
+          <w:rPr>
+            <w:rStyle w:val="Hyperlink"/>
+          </w:rPr>
+          <w:t>https://www.nass.usda.gov/Publications/AgCensus/2017/Online_Resources/Ag_Atlas_Maps/index.php</w:t>
+        </w:r>
+      </w:hyperlink>
+      <w:r>
+        <w:t xml:space="preserve"> </w:t>
+      </w:r>
+    </w:p>
+    <w:p>
+      <w:pPr>
+        <w:ind w:left="720"/>
+      </w:pPr>
+      <w:r>
+        <w:t xml:space="preserve">USDA </w:t>
+      </w:r>
+      <w:proofErr w:type="spellStart"/>
+      <w:r>
+        <w:t>CropScape</w:t>
+      </w:r>
+      <w:proofErr w:type="spellEnd"/>
+      <w:r>
+        <w:t xml:space="preserve"> </w:t>
+      </w:r>
+      <w:r>
+        <w:t xml:space="preserve">– used by GEPA v2 for high resolution cropland type </w:t>
+      </w:r>
+      <w:hyperlink r:id="rId46" w:history="1">
+        <w:r>
+          <w:rPr>
+            <w:rStyle w:val="Hyperlink"/>
+          </w:rPr>
+          <w:t>https://nassgeodata.gmu.edu/CropScape/</w:t>
+        </w:r>
+      </w:hyperlink>
+      <w:r>
+        <w:t xml:space="preserve"> </w:t>
+      </w:r>
+    </w:p>
+    <w:p>
+      <w:pPr>
+        <w:ind w:left="720"/>
+      </w:pPr>
+      <w:proofErr w:type="spellStart"/>
+      <w:r>
+        <w:t>Enverus</w:t>
+      </w:r>
+      <w:proofErr w:type="spellEnd"/>
+      <w:r>
+        <w:t xml:space="preserve"> </w:t>
+      </w:r>
+      <w:r>
+        <w:t xml:space="preserve">(formerly </w:t>
+      </w:r>
+      <w:proofErr w:type="spellStart"/>
+      <w:r>
+        <w:t>drillinginfo</w:t>
+      </w:r>
+      <w:proofErr w:type="spellEnd"/>
+      <w:r>
+        <w:t xml:space="preserve">) </w:t>
+      </w:r>
+      <w:r>
+        <w:t xml:space="preserve">data </w:t>
+      </w:r>
+      <w:r>
+        <w:t xml:space="preserve">– </w:t>
+      </w:r>
+      <w:r>
+        <w:t xml:space="preserve">seems to be a product for sale, though they have university partnerships </w:t>
+      </w:r>
+      <w:hyperlink r:id="rId47" w:history="1">
+        <w:r>
+          <w:rPr>
+            <w:rStyle w:val="Hyperlink"/>
+          </w:rPr>
+          <w:t>https://www.enverus.com/university-partnerships</w:t>
+        </w:r>
+      </w:hyperlink>
+      <w:r>
+        <w:t>.  Used by GEPA v2 for multiple O&amp;G sectors’ activity data.</w:t>
+      </w:r>
+    </w:p>
+    <w:p>
+      <w:pPr>
+        <w:ind w:left="720"/>
+      </w:pPr>
+      <w:r>
+        <w:t xml:space="preserve">Mine safety and health administration – used by GEPA v2 for coal mine locations and some mobile combustion sources.  </w:t>
+      </w:r>
+      <w:hyperlink r:id="rId48" w:history="1">
+        <w:r>
+          <w:rPr>
+            <w:rStyle w:val="Hyperlink"/>
+          </w:rPr>
+          <w:t>https://www.msha.gov/data-and-reports/mine-data-retrieval-system</w:t>
+        </w:r>
+      </w:hyperlink>
+      <w:r>
+        <w:t xml:space="preserve"> </w:t>
+      </w:r>
+    </w:p>
+    <w:p>
+      <w:pPr>
+        <w:ind w:left="720"/>
+      </w:pPr>
+      <w:r>
+        <w:t xml:space="preserve">DOT datasets – used by GEPA v2 for mobile combustion sources.  </w:t>
+      </w:r>
+      <w:hyperlink r:id="rId49" w:history="1">
+        <w:r>
+          <w:rPr>
+            <w:rStyle w:val="Hyperlink"/>
+          </w:rPr>
+          <w:t>https://www.fhwa.dot.gov/policyinformation/statistics/2012/</w:t>
+        </w:r>
+      </w:hyperlink>
+    </w:p>
+    <w:p>
+      <w:pPr>
+        <w:ind w:left="720"/>
+      </w:pPr>
+      <w:r>
+        <w:t xml:space="preserve">National waterway network – used by GEPA v2 for mobile combustion.  </w:t>
+      </w:r>
+      <w:hyperlink r:id="rId50" w:history="1">
+        <w:r>
+          <w:rPr>
+            <w:rStyle w:val="Hyperlink"/>
+          </w:rPr>
+          <w:t>https://data-usdot.opendata.arcgis.com/datasets/usdot::navigable-waterway-network-lines/about</w:t>
+        </w:r>
+      </w:hyperlink>
+      <w:r>
+        <w:t xml:space="preserve"> </w:t>
+      </w:r>
+    </w:p>
+    <w:p>
+      <w:pPr>
         <w:rPr>
           <w:b/>
           <w:bCs/>
         </w:rPr>
-        <w:t xml:space="preserve">People we </w:t>
-      </w:r>
+      </w:pPr>
       <w:r>
         <w:rPr>
           <w:b/>
           <w:bCs/>
         </w:rPr>
-        <w:t>could</w:t>
+        <w:t xml:space="preserve">People we </w:t>
       </w:r>
       <w:r>
         <w:rPr>
           <w:b/>
           <w:bCs/>
         </w:rPr>
+        <w:t>could</w:t>
+      </w:r>
+      <w:r>
+        <w:rPr>
+          <w:b/>
+          <w:bCs/>
+        </w:rPr>
         <w:t xml:space="preserve"> reach out to</w:t>
       </w:r>
     </w:p>
@@ -1480,8 +1786,13 @@
       <w:pPr>
         <w:ind w:left="720"/>
       </w:pPr>
-      <w:r>
-        <w:t>Of course those on the papers above.</w:t>
+      <w:proofErr w:type="gramStart"/>
+      <w:r>
+        <w:t>Of course</w:t>
+      </w:r>
+      <w:proofErr w:type="gramEnd"/>
+      <w:r>
+        <w:t xml:space="preserve"> those on the papers above.</w:t>
       </w:r>
     </w:p>
     <w:p>
@@ -1492,8 +1803,13 @@
         <w:t>Madison Barney (Lucy Hutyra lab) – emailed Joe about work she was doing on a Boston CH4 inventory</w:t>
       </w:r>
       <w:r>
-        <w:t xml:space="preserve"> – focusing at the time on wetland emissions</w:t>
-      </w:r>
+        <w:t xml:space="preserve"> – focusing at the time on wetland </w:t>
+      </w:r>
+      <w:proofErr w:type="gramStart"/>
+      <w:r>
+        <w:t>emissions</w:t>
+      </w:r>
+      <w:proofErr w:type="gramEnd"/>
     </w:p>
     <w:p>
       <w:pPr>
@@ -1534,11 +1850,16 @@
         <w:ind w:left="720"/>
       </w:pPr>
       <w:r>
-        <w:t>Moore et al from wastewater paper – Roisin said she knows them and can get us in touch for a conv</w:t>
+        <w:t xml:space="preserve">Moore et al from wastewater paper – Roisin said she knows them and can get us in touch for a </w:t>
+      </w:r>
+      <w:proofErr w:type="gramStart"/>
+      <w:r>
+        <w:t>conv</w:t>
       </w:r>
       <w:r>
         <w:t>ersation</w:t>
       </w:r>
+      <w:proofErr w:type="gramEnd"/>
     </w:p>
     <w:p>
       <w:pPr>
@@ -1564,8 +1885,13 @@
         <w:t>Maryann Sargent</w:t>
       </w:r>
       <w:r>
-        <w:t xml:space="preserve"> and Steve Wofsy</w:t>
-      </w:r>
+        <w:t xml:space="preserve"> and Steve </w:t>
+      </w:r>
+      <w:proofErr w:type="spellStart"/>
+      <w:r>
+        <w:t>Wofsy</w:t>
+      </w:r>
+      <w:proofErr w:type="spellEnd"/>
     </w:p>
     <w:p>
       <w:pPr>
@@ -1580,9 +1906,10 @@
         <w:ind w:left="720"/>
       </w:pPr>
       <w:r>
+        <w:lastRenderedPageBreak/>
         <w:t>Debra Wunch – developed Flame-GTA inventory (</w:t>
       </w:r>
-      <w:hyperlink r:id="rId50" w:history="1">
+      <w:hyperlink r:id="rId51" w:history="1">
         <w:r>
           <w:rPr>
             <w:rStyle w:val="Hyperlink"/>
@@ -1596,7 +1923,7 @@
       <w:r>
         <w:t xml:space="preserve">and has done lots of work on urban CH4 (e.g., </w:t>
       </w:r>
-      <w:hyperlink r:id="rId51" w:history="1">
+      <w:hyperlink r:id="rId52" w:history="1">
         <w:r>
           <w:rPr>
             <w:rStyle w:val="Hyperlink"/>
@@ -1613,9 +1940,13 @@
         <w:ind w:left="720"/>
       </w:pPr>
       <w:r>
-        <w:lastRenderedPageBreak/>
-        <w:t>EDF – in general, and especially if we eventually have interest in NG production</w:t>
-      </w:r>
+        <w:t xml:space="preserve">EDF – in general, and especially if we eventually have interest in NG </w:t>
+      </w:r>
+      <w:proofErr w:type="gramStart"/>
+      <w:r>
+        <w:t>production</w:t>
+      </w:r>
+      <w:proofErr w:type="gramEnd"/>
     </w:p>
     <w:p>
       <w:pPr>
@@ -1630,16 +1961,31 @@
         <w:ind w:left="720"/>
       </w:pPr>
       <w:r>
-        <w:t>GRAAPES/NOAA/James Whetstone – already offered whatever support they can provide in terms of bringing about a better final product</w:t>
-      </w:r>
-    </w:p>
-    <w:p>
-      <w:pPr>
-        <w:ind w:left="720"/>
-      </w:pPr>
-      <w:r>
-        <w:t>ConEd or other utilities – we have some tie-ins from the CH4 workshop</w:t>
-      </w:r>
+        <w:t xml:space="preserve">GRAAPES/NOAA/James Whetstone – already offered whatever support they can provide in terms of bringing about a better final </w:t>
+      </w:r>
+      <w:proofErr w:type="gramStart"/>
+      <w:r>
+        <w:t>product</w:t>
+      </w:r>
+      <w:proofErr w:type="gramEnd"/>
+    </w:p>
+    <w:p>
+      <w:pPr>
+        <w:ind w:left="720"/>
+      </w:pPr>
+      <w:proofErr w:type="spellStart"/>
+      <w:r>
+        <w:t>ConEd</w:t>
+      </w:r>
+      <w:proofErr w:type="spellEnd"/>
+      <w:r>
+        <w:t xml:space="preserve"> or other utilities – we have some tie-ins from the CH4 </w:t>
+      </w:r>
+      <w:proofErr w:type="gramStart"/>
+      <w:r>
+        <w:t>workshop</w:t>
+      </w:r>
+      <w:proofErr w:type="gramEnd"/>
     </w:p>
     <w:p>
       <w:pPr>
@@ -1648,7 +1994,7 @@
       <w:r>
         <w:t>Jean Bogner (</w:t>
       </w:r>
-      <w:hyperlink r:id="rId52" w:history="1">
+      <w:hyperlink r:id="rId53" w:history="1">
         <w:r>
           <w:rPr>
             <w:rStyle w:val="Hyperlink"/>
@@ -1668,8 +2014,13 @@
         <w:ind w:left="720"/>
       </w:pPr>
       <w:r>
-        <w:t>Grant Allen – Joe’s old PI has experience with many sectors, including what seems like a lot of work on urban areas and wetlands</w:t>
-      </w:r>
+        <w:t xml:space="preserve">Grant Allen – Joe’s old PI has experience with many sectors, including what seems like a lot of work on urban areas and </w:t>
+      </w:r>
+      <w:proofErr w:type="gramStart"/>
+      <w:r>
+        <w:t>wetlands</w:t>
+      </w:r>
+      <w:proofErr w:type="gramEnd"/>
     </w:p>
     <w:p>
       <w:pPr>
@@ -2443,6 +2794,7 @@
   <w:style w:type="character" w:default="1" w:styleId="DefaultParagraphFont">
     <w:name w:val="Default Paragraph Font"/>
     <w:uiPriority w:val="1"/>
+    <w:semiHidden/>
     <w:unhideWhenUsed/>
   </w:style>
   <w:style w:type="table" w:default="1" w:styleId="TableNormal">

</xml_diff>

<commit_message>
Adding a new O&G paper by Omara et al.
</commit_message>
<xml_diff>
--- a/Inventory_lit_review.docx
+++ b/Inventory_lit_review.docx
@@ -39,17 +39,8 @@
           <w:b/>
           <w:bCs/>
         </w:rPr>
-        <w:t xml:space="preserve"> improve </w:t>
-      </w:r>
-      <w:proofErr w:type="gramStart"/>
-      <w:r>
-        <w:rPr>
-          <w:b/>
-          <w:bCs/>
-        </w:rPr>
-        <w:t>sectors</w:t>
-      </w:r>
-      <w:proofErr w:type="gramEnd"/>
+        <w:t xml:space="preserve"> improve sectors</w:t>
+      </w:r>
     </w:p>
     <w:p>
       <w:pPr>
@@ -81,21 +72,7 @@
         <w:rPr>
           <w:rStyle w:val="citationrow"/>
         </w:rPr>
-        <w:t xml:space="preserve">.  Global study that looks at an empirical relationship between waste composition, moisture, and temperature to adjust the waste decay rate used in landfill emission estimates using IPCC methods.  Showed improved comparisons with measurements (though N is small, ~200), though certainly not a perfect agreement with measurements.  A </w:t>
-      </w:r>
-      <w:proofErr w:type="spellStart"/>
-      <w:r>
-        <w:rPr>
-          <w:rStyle w:val="citationrow"/>
-        </w:rPr>
-        <w:t>followup</w:t>
-      </w:r>
-      <w:proofErr w:type="spellEnd"/>
-      <w:r>
-        <w:rPr>
-          <w:rStyle w:val="citationrow"/>
-        </w:rPr>
-        <w:t xml:space="preserve"> appears to be in the works, preprint = </w:t>
+        <w:t xml:space="preserve">.  Global study that looks at an empirical relationship between waste composition, moisture, and temperature to adjust the waste decay rate used in landfill emission estimates using IPCC methods.  Showed improved comparisons with measurements (though N is small, ~200), though certainly not a perfect agreement with measurements.  A followup appears to be in the works, preprint = </w:t>
       </w:r>
       <w:r>
         <w:rPr>
@@ -142,23 +119,13 @@
         </w:rPr>
         <w:t xml:space="preserve">  </w:t>
       </w:r>
-      <w:proofErr w:type="spellStart"/>
       <w:r>
         <w:rPr>
           <w:rStyle w:val="Hyperlink"/>
           <w:color w:val="auto"/>
           <w:u w:val="none"/>
         </w:rPr>
-        <w:t>Sciav</w:t>
-      </w:r>
-      <w:proofErr w:type="spellEnd"/>
-      <w:r>
-        <w:rPr>
-          <w:rStyle w:val="Hyperlink"/>
-          <w:color w:val="auto"/>
-          <w:u w:val="none"/>
-        </w:rPr>
-        <w:t xml:space="preserve"> + AVIRIS study looking at many landfills showing </w:t>
+        <w:t xml:space="preserve">Sciav + AVIRIS study looking at many landfills showing </w:t>
       </w:r>
       <w:r>
         <w:rPr>
@@ -245,15 +212,7 @@
         </w:rPr>
       </w:pPr>
       <w:r>
-        <w:t xml:space="preserve">Hamburg + Utrecht (EU) – </w:t>
-      </w:r>
-      <w:proofErr w:type="spellStart"/>
-      <w:r>
-        <w:t>Maazallahi</w:t>
-      </w:r>
-      <w:proofErr w:type="spellEnd"/>
-      <w:r>
-        <w:t xml:space="preserve"> et al., 2020, </w:t>
+        <w:t xml:space="preserve">Hamburg + Utrecht (EU) – Maazallahi et al., 2020, </w:t>
       </w:r>
       <w:hyperlink r:id="rId10" w:history="1">
         <w:r>
@@ -323,15 +282,7 @@
         <w:ind w:left="1440"/>
       </w:pPr>
       <w:r>
-        <w:t xml:space="preserve">Paris (EU) – </w:t>
-      </w:r>
-      <w:proofErr w:type="spellStart"/>
-      <w:r>
-        <w:t>Defratyka</w:t>
-      </w:r>
-      <w:proofErr w:type="spellEnd"/>
-      <w:r>
-        <w:t xml:space="preserve"> et al., 2021, </w:t>
+        <w:t xml:space="preserve">Paris (EU) – Defratyka et al., 2021, </w:t>
       </w:r>
       <w:hyperlink r:id="rId12" w:history="1">
         <w:r>
@@ -362,23 +313,7 @@
         </w:r>
       </w:hyperlink>
       <w:r>
-        <w:t xml:space="preserve"> – chamber based CH4 and flasks for C isotopes, CO2/CH4 and ethane/methane.  Detailed emission factors for many components on SI </w:t>
-      </w:r>
-      <w:proofErr w:type="spellStart"/>
-      <w:r>
-        <w:t>pg</w:t>
-      </w:r>
-      <w:proofErr w:type="spellEnd"/>
-      <w:r>
-        <w:t xml:space="preserve"> s17.  NG gate = 2.44E3 [0.74E3 – 4.9E3 95%CI] g/hr.  Sewer manholes = 0.567 [0.025 – 1.946] g/hr. Historic landfills = 14.6 [8.5 – 26.8] mg/</w:t>
-      </w:r>
-      <w:proofErr w:type="spellStart"/>
-      <w:r>
-        <w:t>hr</w:t>
-      </w:r>
-      <w:proofErr w:type="spellEnd"/>
-      <w:r>
-        <w:t>/m2.  Most (all?) were highly skewed.</w:t>
+        <w:t xml:space="preserve"> – chamber based CH4 and flasks for C isotopes, CO2/CH4 and ethane/methane.  Detailed emission factors for many components on SI pg s17.  NG gate = 2.44E3 [0.74E3 – 4.9E3 95%CI] g/hr.  Sewer manholes = 0.567 [0.025 – 1.946] g/hr. Historic landfills = 14.6 [8.5 – 26.8] mg/hr/m2.  Most (all?) were highly skewed.</w:t>
       </w:r>
     </w:p>
     <w:p>
@@ -442,69 +377,15 @@
           <w:color w:val="auto"/>
           <w:u w:val="none"/>
         </w:rPr>
-        <w:t>Using this estimate they scaled to national emissions of 1.2 MMT CO2e/</w:t>
-      </w:r>
-      <w:proofErr w:type="spellStart"/>
+        <w:t>Using this estimate they scaled to national emissions of 1.2 MMT CO2e/yr from sewers.</w:t>
+      </w:r>
       <w:r>
         <w:rPr>
           <w:rStyle w:val="Hyperlink"/>
           <w:color w:val="auto"/>
           <w:u w:val="none"/>
         </w:rPr>
-        <w:t>yr</w:t>
-      </w:r>
-      <w:proofErr w:type="spellEnd"/>
-      <w:r>
-        <w:rPr>
-          <w:rStyle w:val="Hyperlink"/>
-          <w:color w:val="auto"/>
-          <w:u w:val="none"/>
-        </w:rPr>
-        <w:t xml:space="preserve"> from sewers.</w:t>
-      </w:r>
-      <w:r>
-        <w:rPr>
-          <w:rStyle w:val="Hyperlink"/>
-          <w:color w:val="auto"/>
-          <w:u w:val="none"/>
-        </w:rPr>
-        <w:t xml:space="preserve">  This is compared to 10.9 ± 7 MMT CO2e/</w:t>
-      </w:r>
-      <w:proofErr w:type="spellStart"/>
-      <w:r>
-        <w:rPr>
-          <w:rStyle w:val="Hyperlink"/>
-          <w:color w:val="auto"/>
-          <w:u w:val="none"/>
-        </w:rPr>
-        <w:t>yr</w:t>
-      </w:r>
-      <w:proofErr w:type="spellEnd"/>
-      <w:r>
-        <w:rPr>
-          <w:rStyle w:val="Hyperlink"/>
-          <w:color w:val="auto"/>
-          <w:u w:val="none"/>
-        </w:rPr>
-        <w:t xml:space="preserve"> from wastewater entirely.  </w:t>
-      </w:r>
-      <w:proofErr w:type="gramStart"/>
-      <w:r>
-        <w:rPr>
-          <w:rStyle w:val="Hyperlink"/>
-          <w:color w:val="auto"/>
-          <w:u w:val="none"/>
-        </w:rPr>
-        <w:t>Mentions</w:t>
-      </w:r>
-      <w:proofErr w:type="gramEnd"/>
-      <w:r>
-        <w:rPr>
-          <w:rStyle w:val="Hyperlink"/>
-          <w:color w:val="auto"/>
-          <w:u w:val="none"/>
-        </w:rPr>
-        <w:t xml:space="preserve"> some relationships with temperature.</w:t>
+        <w:t xml:space="preserve">  This is compared to 10.9 ± 7 MMT CO2e/yr from wastewater entirely.  Mentions some relationships with temperature.</w:t>
       </w:r>
     </w:p>
     <w:p>
@@ -531,23 +412,7 @@
         </w:r>
       </w:hyperlink>
       <w:r>
-        <w:t xml:space="preserve"> - 63 plants across US discussing biochemical oxygen demand (BOD) and </w:t>
-      </w:r>
-      <w:proofErr w:type="gramStart"/>
-      <w:r>
-        <w:t>flow based</w:t>
-      </w:r>
-      <w:proofErr w:type="gramEnd"/>
-      <w:r>
-        <w:t xml:space="preserve"> emission factors.  BOD was ~constant with size and flow was </w:t>
-      </w:r>
-      <w:proofErr w:type="gramStart"/>
-      <w:r>
-        <w:t>log-linear</w:t>
-      </w:r>
-      <w:proofErr w:type="gramEnd"/>
-      <w:r>
-        <w:t>.  ~2x IPPC/EPA EF on average.  Also stresses that variability in operations over time and facility to facility are important and make these EF’s more “rough estimates”.  Mentions of diurnal patterns from previous work.</w:t>
+        <w:t xml:space="preserve"> - 63 plants across US discussing biochemical oxygen demand (BOD) and flow based emission factors.  BOD was ~constant with size and flow was log-linear.  ~2x IPPC/EPA EF on average.  Also stresses that variability in operations over time and facility to facility are important and make these EF’s more “rough estimates”.  Mentions of diurnal patterns from previous work.</w:t>
       </w:r>
     </w:p>
     <w:p>
@@ -568,13 +433,8 @@
       <w:r>
         <w:t xml:space="preserve">Unread.  </w:t>
       </w:r>
-      <w:proofErr w:type="gramStart"/>
-      <w:r>
-        <w:t>International</w:t>
-      </w:r>
-      <w:proofErr w:type="gramEnd"/>
-      <w:r>
-        <w:t xml:space="preserve"> </w:t>
+      <w:r>
+        <w:t xml:space="preserve">International </w:t>
       </w:r>
       <w:r>
         <w:t>article</w:t>
@@ -701,13 +561,8 @@
         </w:r>
       </w:hyperlink>
       <w:r>
-        <w:t xml:space="preserve"> - CH4 seasonality is linear in dormant season only as 0.021x+11 g/m2yr.  NG sector is linear as 0.025x+6.4 g/</w:t>
-      </w:r>
-      <w:proofErr w:type="gramStart"/>
-      <w:r>
-        <w:t>m2yr</w:t>
-      </w:r>
-      <w:proofErr w:type="gramEnd"/>
+        <w:t xml:space="preserve"> - CH4 seasonality is linear in dormant season only as 0.021x+11 g/m2yr.  NG sector is linear as 0.025x+6.4 g/m2yr</w:t>
+      </w:r>
     </w:p>
     <w:p>
       <w:pPr>
@@ -729,15 +584,7 @@
         <w:t>.  Unread F</w:t>
       </w:r>
       <w:r>
-        <w:t xml:space="preserve">elix Vogel et al., using </w:t>
-      </w:r>
-      <w:proofErr w:type="gramStart"/>
-      <w:r>
-        <w:t>vehicle based</w:t>
-      </w:r>
-      <w:proofErr w:type="gramEnd"/>
-      <w:r>
-        <w:t xml:space="preserve"> measurements to understand NG leaks in urban centers.  Could provide some useful information beyond previous papers.</w:t>
+        <w:t>elix Vogel et al., using vehicle based measurements to understand NG leaks in urban centers.  Could provide some useful information beyond previous papers.</w:t>
       </w:r>
     </w:p>
     <w:p>
@@ -801,15 +648,7 @@
         <w:t>1/3 produced measurable CH4 (all produced N2O too).  Used to build EFs</w:t>
       </w:r>
       <w:r>
-        <w:t xml:space="preserve"> – older (&gt;30) individuals emitted slightly </w:t>
-      </w:r>
-      <w:proofErr w:type="gramStart"/>
-      <w:r>
-        <w:t>more</w:t>
-      </w:r>
-      <w:proofErr w:type="gramEnd"/>
-      <w:r>
-        <w:t xml:space="preserve"> and women were more likely to emit</w:t>
+        <w:t xml:space="preserve"> – older (&gt;30) individuals emitted slightly more and women were more likely to emit</w:t>
       </w:r>
       <w:r>
         <w:t>.  Specific to UK</w:t>
@@ -842,15 +681,7 @@
         <w:t>.</w:t>
       </w:r>
       <w:r>
-        <w:t xml:space="preserve">  They state “if the greater London area were a managed grassland, soil emissions of CH4 would be equivalent to that of human breath in the same area” – so emissions are small (0.05% of national inventory).  </w:t>
-      </w:r>
-      <w:proofErr w:type="gramStart"/>
-      <w:r>
-        <w:t>But,</w:t>
-      </w:r>
-      <w:proofErr w:type="gramEnd"/>
-      <w:r>
-        <w:t xml:space="preserve"> census data is easily available – so it wouldn’t be a hard one to add.  </w:t>
+        <w:t xml:space="preserve">  They state “if the greater London area were a managed grassland, soil emissions of CH4 would be equivalent to that of human breath in the same area” – so emissions are small (0.05% of national inventory).  But, census data is easily available – so it wouldn’t be a hard one to add.  </w:t>
       </w:r>
       <w:r>
         <w:t>There are s</w:t>
@@ -859,26 +690,10 @@
         <w:t xml:space="preserve">ome other </w:t>
       </w:r>
       <w:r>
-        <w:t xml:space="preserve">relevant </w:t>
-      </w:r>
-      <w:proofErr w:type="gramStart"/>
-      <w:r>
-        <w:t>work</w:t>
-      </w:r>
-      <w:proofErr w:type="gramEnd"/>
-      <w:r>
-        <w:t xml:space="preserve"> in their citations</w:t>
-      </w:r>
-      <w:r>
-        <w:t xml:space="preserve">, though they also seem to be </w:t>
-      </w:r>
-      <w:proofErr w:type="gramStart"/>
-      <w:r>
-        <w:t>limited</w:t>
-      </w:r>
-      <w:proofErr w:type="gramEnd"/>
-      <w:r>
-        <w:t xml:space="preserve"> N people or regions.</w:t>
+        <w:t>relevant work in their citations</w:t>
+      </w:r>
+      <w:r>
+        <w:t>, though they also seem to be limited N people or regions.</w:t>
       </w:r>
     </w:p>
     <w:p>
@@ -918,15 +733,7 @@
       </w:pPr>
       <w:r>
         <w:tab/>
-        <w:t>Many models beyond just WETCHARTS (</w:t>
-      </w:r>
-      <w:proofErr w:type="spellStart"/>
-      <w:r>
-        <w:t>Wetchimp</w:t>
-      </w:r>
-      <w:proofErr w:type="spellEnd"/>
-      <w:r>
-        <w:t>, NASA’s LPJ-WSL, SOCCR)</w:t>
+        <w:t>Many models beyond just WETCHARTS (Wetchimp, NASA’s LPJ-WSL, SOCCR)</w:t>
       </w:r>
     </w:p>
     <w:p>
@@ -1000,15 +807,7 @@
         <w:t xml:space="preserve"> and C13-CH4 measurements.  </w:t>
       </w:r>
       <w:r>
-        <w:t xml:space="preserve">2.043 </w:t>
-      </w:r>
-      <w:proofErr w:type="spellStart"/>
-      <w:r>
-        <w:t>tonnes</w:t>
-      </w:r>
-      <w:proofErr w:type="spellEnd"/>
-      <w:r>
-        <w:t>/km/yr.</w:t>
+        <w:t>2.043 tonnes/km/yr.</w:t>
       </w:r>
     </w:p>
     <w:p>
@@ -1047,12 +846,6 @@
         <w:rPr>
           <w:rStyle w:val="c-bibliographic-informationvalue"/>
         </w:rPr>
-        <w:t xml:space="preserve">Lower priority – GRAAPES themselves are more focused here.  </w:t>
-      </w:r>
-      <w:r>
-        <w:rPr>
-          <w:rStyle w:val="c-bibliographic-informationvalue"/>
-        </w:rPr>
         <w:t xml:space="preserve">Unread </w:t>
       </w:r>
       <w:r>
@@ -1096,11 +889,47 @@
     <w:p>
       <w:pPr>
         <w:ind w:left="1440"/>
-      </w:pPr>
-      <w:r>
+        <w:rPr>
+          <w:rStyle w:val="Hyperlink"/>
+          <w:rFonts w:ascii="Times New Roman" w:eastAsia="Times New Roman" w:hAnsi="Times New Roman" w:cs="Times New Roman"/>
+          <w:color w:val="auto"/>
+          <w:sz w:val="24"/>
+          <w:szCs w:val="24"/>
+          <w:u w:val="none"/>
+        </w:rPr>
+      </w:pPr>
+      <w:r>
+        <w:rPr>
+          <w:rStyle w:val="Hyperlink"/>
+          <w:rFonts w:ascii="Times New Roman" w:eastAsia="Times New Roman" w:hAnsi="Times New Roman" w:cs="Times New Roman"/>
+          <w:color w:val="auto"/>
+          <w:sz w:val="24"/>
+          <w:szCs w:val="24"/>
+          <w:u w:val="none"/>
+        </w:rPr>
+        <w:t>Unread Omara et al., (</w:t>
+      </w:r>
+      <w:hyperlink r:id="rId29" w:history="1">
+        <w:r>
+          <w:rPr>
+            <w:rStyle w:val="Hyperlink"/>
+          </w:rPr>
+          <w:t>https://doi.org/10.5194/essd-2024-72</w:t>
+        </w:r>
+      </w:hyperlink>
+      <w:r>
+        <w:t>) 2024 – ESD.  They compile facility-scale measurements across the supply chain including MethaneAir measurements to build a 10 km2 national inventory based on measurements rather than emission factors (from what I can tell).  Mean loss rate of 2.6% nationally, though it varies by basin.</w:t>
+      </w:r>
+    </w:p>
+    <w:p>
+      <w:pPr>
+        <w:ind w:left="1440"/>
+      </w:pPr>
+      <w:r>
+        <w:lastRenderedPageBreak/>
         <w:t xml:space="preserve">Riddick et al., Atmosphere – 2024 </w:t>
       </w:r>
-      <w:hyperlink r:id="rId29" w:history="1">
+      <w:hyperlink r:id="rId30" w:history="1">
         <w:r>
           <w:rPr>
             <w:rStyle w:val="Hyperlink"/>
@@ -1123,10 +952,9 @@
         <w:ind w:left="1440"/>
       </w:pPr>
       <w:r>
-        <w:lastRenderedPageBreak/>
         <w:t xml:space="preserve">Conrad et al., Communications Earth and Environment – 2023 </w:t>
       </w:r>
-      <w:hyperlink r:id="rId30" w:history="1">
+      <w:hyperlink r:id="rId31" w:history="1">
         <w:r>
           <w:rPr>
             <w:rStyle w:val="Hyperlink"/>
@@ -1151,7 +979,7 @@
       <w:r>
         <w:t xml:space="preserve">GFEI inventory – Scarpelli et al., ACP 2022 </w:t>
       </w:r>
-      <w:hyperlink r:id="rId31" w:history="1">
+      <w:hyperlink r:id="rId32" w:history="1">
         <w:r>
           <w:rPr>
             <w:rStyle w:val="Hyperlink"/>
@@ -1179,7 +1007,7 @@
       <w:r>
         <w:t xml:space="preserve">Fiddler et al., JGR Atmospheres – 2024 </w:t>
       </w:r>
-      <w:hyperlink r:id="rId32" w:history="1">
+      <w:hyperlink r:id="rId33" w:history="1">
         <w:r>
           <w:rPr>
             <w:rStyle w:val="Hyperlink"/>
@@ -1194,29 +1022,13 @@
         <w:t xml:space="preserve">Unread </w:t>
       </w:r>
       <w:r>
-        <w:t xml:space="preserve">FIREX – AQ emission factors – including one for CH4.  I’m not sure how well the underlying activity data can be accessed, but </w:t>
-      </w:r>
-      <w:proofErr w:type="gramStart"/>
-      <w:r>
-        <w:t>worth</w:t>
-      </w:r>
-      <w:proofErr w:type="gramEnd"/>
-      <w:r>
-        <w:t xml:space="preserve"> looking at if we consider this sector.</w:t>
+        <w:t>FIREX – AQ emission factors – including one for CH4.  I’m not sure how well the underlying activity data can be accessed, but worth looking at if we consider this sector.</w:t>
       </w:r>
     </w:p>
     <w:p>
       <w:r>
         <w:tab/>
-        <w:t xml:space="preserve">Ag (priority = low, complexity </w:t>
-      </w:r>
-      <w:proofErr w:type="gramStart"/>
-      <w:r>
-        <w:t>= ?</w:t>
-      </w:r>
-      <w:proofErr w:type="gramEnd"/>
-      <w:r>
-        <w:t>)</w:t>
+        <w:t>Ag (priority = low, complexity = ?)</w:t>
       </w:r>
     </w:p>
     <w:p>
@@ -1241,7 +1053,7 @@
       <w:r>
         <w:t xml:space="preserve">sectoral optimization in Colorado </w:t>
       </w:r>
-      <w:hyperlink r:id="rId33" w:history="1">
+      <w:hyperlink r:id="rId34" w:history="1">
         <w:r>
           <w:rPr>
             <w:rStyle w:val="Hyperlink"/>
@@ -1268,9 +1080,17 @@
           <w:color w:val="auto"/>
           <w:u w:val="none"/>
         </w:rPr>
-        <w:t>Unread 2024 EST paper on agricultural ponds.  Discusses a method to estimate emissions, uses Australia to demo and compare to reported emissions.  41 kt/</w:t>
-      </w:r>
-      <w:proofErr w:type="spellStart"/>
+        <w:t xml:space="preserve">Unread 2024 EST paper on agricultural ponds.  Discusses a method to estimate emissions, uses Australia to demo and compare to reported emissions.  41 kt/yr or 0.238 t/ha/yr.  </w:t>
+      </w:r>
+      <w:hyperlink r:id="rId35" w:history="1">
+        <w:r>
+          <w:rPr>
+            <w:rStyle w:val="Hyperlink"/>
+            <w:rFonts w:ascii="Times New Roman" w:eastAsia="Times New Roman" w:hAnsi="Times New Roman" w:cs="Times New Roman"/>
+          </w:rPr>
+          <w:t>https://doi.org/10.1021/acs.est.3c08898</w:t>
+        </w:r>
+      </w:hyperlink>
       <w:r>
         <w:rPr>
           <w:rStyle w:val="Hyperlink"/>
@@ -1278,27 +1098,18 @@
           <w:color w:val="auto"/>
           <w:u w:val="none"/>
         </w:rPr>
-        <w:t>yr</w:t>
-      </w:r>
-      <w:proofErr w:type="spellEnd"/>
-      <w:r>
+        <w:t xml:space="preserve"> </w:t>
+      </w:r>
+    </w:p>
+    <w:p>
+      <w:pPr>
         <w:rPr>
           <w:rStyle w:val="Hyperlink"/>
           <w:rFonts w:ascii="Times New Roman" w:eastAsia="Times New Roman" w:hAnsi="Times New Roman" w:cs="Times New Roman"/>
           <w:color w:val="auto"/>
           <w:u w:val="none"/>
         </w:rPr>
-        <w:t xml:space="preserve"> or 0.238 t/ha/yr.  </w:t>
-      </w:r>
-      <w:hyperlink r:id="rId34" w:history="1">
-        <w:r>
-          <w:rPr>
-            <w:rStyle w:val="Hyperlink"/>
-            <w:rFonts w:ascii="Times New Roman" w:eastAsia="Times New Roman" w:hAnsi="Times New Roman" w:cs="Times New Roman"/>
-          </w:rPr>
-          <w:t>https://doi.org/10.1021/acs.est.3c08898</w:t>
-        </w:r>
-      </w:hyperlink>
+      </w:pPr>
       <w:r>
         <w:rPr>
           <w:rStyle w:val="Hyperlink"/>
@@ -1306,17 +1117,22 @@
           <w:color w:val="auto"/>
           <w:u w:val="none"/>
         </w:rPr>
-        <w:t xml:space="preserve"> </w:t>
-      </w:r>
-    </w:p>
-    <w:p>
-      <w:pPr>
+        <w:tab/>
+        <w:t>Chemical Production</w:t>
+      </w:r>
+      <w:r>
         <w:rPr>
           <w:rStyle w:val="Hyperlink"/>
           <w:rFonts w:ascii="Times New Roman" w:eastAsia="Times New Roman" w:hAnsi="Times New Roman" w:cs="Times New Roman"/>
           <w:color w:val="auto"/>
           <w:u w:val="none"/>
         </w:rPr>
+        <w:t xml:space="preserve"> (priority = low, complexity = ?)</w:t>
+      </w:r>
+    </w:p>
+    <w:p>
+      <w:pPr>
+        <w:ind w:left="1440"/>
       </w:pPr>
       <w:r>
         <w:rPr>
@@ -1325,8 +1141,7 @@
           <w:color w:val="auto"/>
           <w:u w:val="none"/>
         </w:rPr>
-        <w:tab/>
-        <w:t>Chemical Production</w:t>
+        <w:t xml:space="preserve">Unread </w:t>
       </w:r>
       <w:r>
         <w:rPr>
@@ -1335,64 +1150,117 @@
           <w:color w:val="auto"/>
           <w:u w:val="none"/>
         </w:rPr>
-        <w:t xml:space="preserve"> (priority = low, complexity </w:t>
-      </w:r>
-      <w:proofErr w:type="gramStart"/>
-      <w:r>
-        <w:rPr>
-          <w:rStyle w:val="Hyperlink"/>
-          <w:rFonts w:ascii="Times New Roman" w:eastAsia="Times New Roman" w:hAnsi="Times New Roman" w:cs="Times New Roman"/>
+        <w:t xml:space="preserve">2024 Nature Chemical Engineering global paper using lifecycle modeling to estimate lifetime emissions from cradle to gate.  Some aspects/methods and data sets could be of value, though we’d want point emissions, not to assign lifecycle emissions at the point of production.  </w:t>
+      </w:r>
+      <w:hyperlink r:id="rId36" w:history="1">
+        <w:r>
+          <w:rPr>
+            <w:rStyle w:val="Hyperlink"/>
+          </w:rPr>
+          <w:t>https://doi.org/10.1038/s44286-024-00047-z</w:t>
+        </w:r>
+      </w:hyperlink>
+      <w:r>
+        <w:rPr>
+          <w:rStyle w:val="c-bibliographic-informationvalue"/>
+        </w:rPr>
+        <w:t xml:space="preserve"> </w:t>
+      </w:r>
+    </w:p>
+    <w:p>
+      <w:pPr>
+        <w:rPr>
+          <w:b/>
+          <w:bCs/>
+        </w:rPr>
+      </w:pPr>
+      <w:r>
+        <w:rPr>
+          <w:b/>
+          <w:bCs/>
+        </w:rPr>
+        <w:t>CH4 Inventories generally</w:t>
+      </w:r>
+    </w:p>
+    <w:p>
+      <w:pPr>
+        <w:ind w:firstLine="720"/>
+      </w:pPr>
+      <w:r>
+        <w:t>Sargent, Mckain, Karion, Pitt, Zeng (maybe), GEPA, EDGAR, Scarpelli, Lamb, GTA-flame</w:t>
+      </w:r>
+    </w:p>
+    <w:p>
+      <w:pPr>
+        <w:ind w:firstLine="720"/>
+        <w:rPr>
+          <w:rStyle w:val="Hyperlink"/>
+        </w:rPr>
+      </w:pPr>
+      <w:r>
+        <w:t xml:space="preserve">Toronto (CA) - </w:t>
+      </w:r>
+      <w:hyperlink r:id="rId37" w:history="1">
+        <w:r>
+          <w:rPr>
+            <w:rStyle w:val="Hyperlink"/>
+          </w:rPr>
+          <w:t>https://doi.org/10.1016/j.atmosenv.2021.118319</w:t>
+        </w:r>
+      </w:hyperlink>
+    </w:p>
+    <w:p>
+      <w:pPr>
+        <w:ind w:firstLine="720"/>
+      </w:pPr>
+      <w:r>
+        <w:rPr>
+          <w:rStyle w:val="Hyperlink"/>
           <w:color w:val="auto"/>
           <w:u w:val="none"/>
         </w:rPr>
-        <w:t>= ?</w:t>
-      </w:r>
-      <w:proofErr w:type="gramEnd"/>
-      <w:r>
-        <w:rPr>
-          <w:rStyle w:val="Hyperlink"/>
-          <w:rFonts w:ascii="Times New Roman" w:eastAsia="Times New Roman" w:hAnsi="Times New Roman" w:cs="Times New Roman"/>
-          <w:color w:val="auto"/>
-          <w:u w:val="none"/>
-        </w:rPr>
-        <w:t>)</w:t>
-      </w:r>
-    </w:p>
-    <w:p>
-      <w:pPr>
-        <w:ind w:left="1440"/>
-      </w:pPr>
-      <w:r>
-        <w:rPr>
-          <w:rStyle w:val="Hyperlink"/>
-          <w:rFonts w:ascii="Times New Roman" w:eastAsia="Times New Roman" w:hAnsi="Times New Roman" w:cs="Times New Roman"/>
-          <w:color w:val="auto"/>
-          <w:u w:val="none"/>
-        </w:rPr>
-        <w:t xml:space="preserve">Unread </w:t>
-      </w:r>
-      <w:r>
-        <w:rPr>
-          <w:rStyle w:val="Hyperlink"/>
-          <w:rFonts w:ascii="Times New Roman" w:eastAsia="Times New Roman" w:hAnsi="Times New Roman" w:cs="Times New Roman"/>
-          <w:color w:val="auto"/>
-          <w:u w:val="none"/>
-        </w:rPr>
-        <w:t xml:space="preserve">2024 Nature Chemical Engineering global paper using lifecycle modeling to estimate lifetime emissions from cradle to gate.  Some aspects/methods and data sets could be of value, though we’d want point emissions, not to assign lifecycle emissions at the point of production.  </w:t>
-      </w:r>
-      <w:hyperlink r:id="rId35" w:history="1">
-        <w:r>
-          <w:rPr>
-            <w:rStyle w:val="Hyperlink"/>
-          </w:rPr>
-          <w:t>https://doi.org/10.1038/s44286-024-00047-z</w:t>
-        </w:r>
-      </w:hyperlink>
-      <w:r>
-        <w:rPr>
-          <w:rStyle w:val="c-bibliographic-informationvalue"/>
-        </w:rPr>
+        <w:t xml:space="preserve">Scarpelli Canada GEPA – </w:t>
+      </w:r>
+      <w:hyperlink r:id="rId38" w:history="1">
+        <w:r>
+          <w:rPr>
+            <w:rStyle w:val="Hyperlink"/>
+          </w:rPr>
+          <w:t>https://doi.org/10.1088/1748-9326/ac40b1</w:t>
+        </w:r>
+      </w:hyperlink>
+      <w:r>
         <w:t xml:space="preserve"> </w:t>
+      </w:r>
+    </w:p>
+    <w:p>
+      <w:pPr>
+        <w:ind w:left="720"/>
+      </w:pPr>
+      <w:r>
+        <w:t xml:space="preserve">New to me, but Climate TRACE – global (national for some, facility level for others).  Seems to be primarily built from models relying on machine learning + measurements, but very few publications (much more policy-focused, Al Gore sponsored).  </w:t>
+      </w:r>
+      <w:hyperlink r:id="rId39" w:history="1">
+        <w:r>
+          <w:rPr>
+            <w:rStyle w:val="Hyperlink"/>
+          </w:rPr>
+          <w:t>https://climatetrace.org/</w:t>
+        </w:r>
+      </w:hyperlink>
+      <w:r>
+        <w:t xml:space="preserve">.  </w:t>
+      </w:r>
+      <w:hyperlink r:id="rId40" w:history="1">
+        <w:r>
+          <w:rPr>
+            <w:rStyle w:val="Hyperlink"/>
+          </w:rPr>
+          <w:t>https://doi.org/10.3390/rs16071290</w:t>
+        </w:r>
+      </w:hyperlink>
+      <w:r>
+        <w:t xml:space="preserve">.  Only one publication I could find, but the inventory seems to be global, looking at multiple GHGs, at facility-scale when possible. </w:t>
       </w:r>
     </w:p>
     <w:p>
@@ -1407,54 +1275,91 @@
           <w:b/>
           <w:bCs/>
         </w:rPr>
-        <w:t>CH4 Inventories generally</w:t>
-      </w:r>
-    </w:p>
-    <w:p>
-      <w:pPr>
-        <w:ind w:firstLine="720"/>
-      </w:pPr>
-      <w:r>
-        <w:t>Sargent, Mckain, Karion, Pitt, Zeng (maybe), GEPA, EDGAR, Scarpelli, Lamb, GTA-flame</w:t>
-      </w:r>
-    </w:p>
-    <w:p>
-      <w:pPr>
-        <w:ind w:firstLine="720"/>
-        <w:rPr>
-          <w:rStyle w:val="Hyperlink"/>
-        </w:rPr>
-      </w:pPr>
-      <w:r>
-        <w:t xml:space="preserve">Toronto (CA) - </w:t>
-      </w:r>
-      <w:hyperlink r:id="rId36" w:history="1">
-        <w:r>
-          <w:rPr>
-            <w:rStyle w:val="Hyperlink"/>
-          </w:rPr>
-          <w:t>https://doi.org/10.1016/j.atmosenv.2021.118319</w:t>
-        </w:r>
-      </w:hyperlink>
-    </w:p>
-    <w:p>
-      <w:pPr>
-        <w:ind w:firstLine="720"/>
-      </w:pPr>
-      <w:r>
-        <w:rPr>
-          <w:rStyle w:val="Hyperlink"/>
-          <w:color w:val="auto"/>
-          <w:u w:val="none"/>
-        </w:rPr>
-        <w:t xml:space="preserve">Scarpelli Canada GEPA – </w:t>
-      </w:r>
-      <w:hyperlink r:id="rId37" w:history="1">
-        <w:r>
-          <w:rPr>
-            <w:rStyle w:val="Hyperlink"/>
-          </w:rPr>
-          <w:t>https://doi.org/10.1088/1748-9326/ac40b1</w:t>
+        <w:t>New datasets to consider</w:t>
+      </w:r>
+    </w:p>
+    <w:p>
+      <w:pPr>
+        <w:ind w:left="720"/>
+      </w:pPr>
+      <w:r>
+        <w:t xml:space="preserve">FEMA structure data – building occupancy type (industrial, residential, etc.) map for the whole US.  </w:t>
+      </w:r>
+      <w:hyperlink r:id="rId41" w:history="1">
+        <w:r>
+          <w:rPr>
+            <w:rStyle w:val="Hyperlink"/>
+          </w:rPr>
+          <w:t>https://gis-fema.hub.arcgis.com/pages/usa-structures</w:t>
+        </w:r>
+      </w:hyperlink>
+    </w:p>
+    <w:p>
+      <w:pPr>
+        <w:ind w:left="720"/>
+      </w:pPr>
+      <w:r>
+        <w:lastRenderedPageBreak/>
+        <w:t xml:space="preserve">Census house heating fuel – one of many census data tables available at national to county levels.  </w:t>
+      </w:r>
+      <w:hyperlink r:id="rId42" w:history="1">
+        <w:r>
+          <w:rPr>
+            <w:rStyle w:val="Hyperlink"/>
+          </w:rPr>
+          <w:t>https://data.census.gov/table/ACSDT5Y2020.B25040?q=B25040</w:t>
+        </w:r>
+      </w:hyperlink>
+    </w:p>
+    <w:p>
+      <w:pPr>
+        <w:ind w:left="720"/>
+        <w:rPr>
+          <w:rStyle w:val="Hyperlink"/>
+        </w:rPr>
+      </w:pPr>
+      <w:r>
+        <w:t xml:space="preserve">EPA FRS database that primarily includes facility information data for pretty much anything of environmental interest.  </w:t>
+      </w:r>
+      <w:hyperlink r:id="rId43" w:history="1">
+        <w:r>
+          <w:rPr>
+            <w:rStyle w:val="Hyperlink"/>
+          </w:rPr>
+          <w:t>https://www.epa.gov/frs</w:t>
+        </w:r>
+      </w:hyperlink>
+    </w:p>
+    <w:p>
+      <w:pPr>
+        <w:ind w:left="720"/>
+      </w:pPr>
+      <w:r>
+        <w:t xml:space="preserve">Waste Business Journal for landfills that Joe mentioned was used in combination with LMOP to scale up emissions beyond GHGRP for the GHGI.  </w:t>
+      </w:r>
+      <w:hyperlink r:id="rId44" w:history="1">
+        <w:r>
+          <w:rPr>
+            <w:rStyle w:val="Hyperlink"/>
+          </w:rPr>
+          <w:t>https://www.wasteinfo.com/diratlas.htm</w:t>
+        </w:r>
+      </w:hyperlink>
+      <w:r>
+        <w:t xml:space="preserve">  </w:t>
+      </w:r>
+      <w:r>
+        <w:t>discussed</w:t>
+      </w:r>
+      <w:r>
+        <w:t xml:space="preserve"> in </w:t>
+      </w:r>
+      <w:hyperlink r:id="rId45" w:history="1">
+        <w:r>
+          <w:rPr>
+            <w:rStyle w:val="Hyperlink"/>
+          </w:rPr>
+          <w:t>https://www.epa.gov/sites/production/files/2021-04/documents/us-ghg-inventory-2021-annex-3-additional-source-or-sink-categories-part-b.pdf</w:t>
         </w:r>
       </w:hyperlink>
       <w:r>
@@ -1466,29 +1371,128 @@
         <w:ind w:left="720"/>
       </w:pPr>
       <w:r>
-        <w:t xml:space="preserve">New to me, but Climate TRACE – global (national for some, facility level for others).  Seems to be primarily built from models relying on machine learning + measurements, but very few publications (much more policy-focused, Al Gore sponsored).  </w:t>
-      </w:r>
-      <w:hyperlink r:id="rId38" w:history="1">
-        <w:r>
-          <w:rPr>
-            <w:rStyle w:val="Hyperlink"/>
-          </w:rPr>
-          <w:t>https://climatetrace.org/</w:t>
-        </w:r>
-      </w:hyperlink>
-      <w:r>
-        <w:t xml:space="preserve">.  </w:t>
-      </w:r>
-      <w:hyperlink r:id="rId39" w:history="1">
-        <w:r>
-          <w:rPr>
-            <w:rStyle w:val="Hyperlink"/>
-          </w:rPr>
-          <w:t>https://doi.org/10.3390/rs16071290</w:t>
-        </w:r>
-      </w:hyperlink>
-      <w:r>
-        <w:t xml:space="preserve">.  Only one publication I could find, but the inventory seems to be global, looking at multiple GHGs, at facility-scale when possible. </w:t>
+        <w:t>USDA Census Ag Atlas Maps</w:t>
+      </w:r>
+      <w:r>
+        <w:t xml:space="preserve"> – used by GEPA v2 for several agricultural datasets </w:t>
+      </w:r>
+      <w:hyperlink r:id="rId46" w:history="1">
+        <w:r>
+          <w:rPr>
+            <w:rStyle w:val="Hyperlink"/>
+          </w:rPr>
+          <w:t>https://www.nass.usda.gov/Publications/AgCensus/2017/Online_Resources/Ag_Atlas_Maps/index.php</w:t>
+        </w:r>
+      </w:hyperlink>
+      <w:r>
+        <w:t xml:space="preserve"> </w:t>
+      </w:r>
+    </w:p>
+    <w:p>
+      <w:pPr>
+        <w:ind w:left="720"/>
+      </w:pPr>
+      <w:r>
+        <w:t xml:space="preserve">USDA CropScape </w:t>
+      </w:r>
+      <w:r>
+        <w:t xml:space="preserve">– used by GEPA v2 for high resolution cropland type </w:t>
+      </w:r>
+      <w:hyperlink r:id="rId47" w:history="1">
+        <w:r>
+          <w:rPr>
+            <w:rStyle w:val="Hyperlink"/>
+          </w:rPr>
+          <w:t>https://nassgeodata.gmu.edu/CropScape/</w:t>
+        </w:r>
+      </w:hyperlink>
+      <w:r>
+        <w:t xml:space="preserve"> </w:t>
+      </w:r>
+    </w:p>
+    <w:p>
+      <w:pPr>
+        <w:ind w:left="720"/>
+      </w:pPr>
+      <w:r>
+        <w:t xml:space="preserve">Enverus </w:t>
+      </w:r>
+      <w:r>
+        <w:t xml:space="preserve">(formerly drillinginfo) </w:t>
+      </w:r>
+      <w:r>
+        <w:t xml:space="preserve">data </w:t>
+      </w:r>
+      <w:r>
+        <w:t xml:space="preserve">– </w:t>
+      </w:r>
+      <w:r>
+        <w:t xml:space="preserve">seems to be a product for sale, though they have university partnerships </w:t>
+      </w:r>
+      <w:hyperlink r:id="rId48" w:history="1">
+        <w:r>
+          <w:rPr>
+            <w:rStyle w:val="Hyperlink"/>
+          </w:rPr>
+          <w:t>https://www.enverus.com/university-partnerships</w:t>
+        </w:r>
+      </w:hyperlink>
+      <w:r>
+        <w:t>.  Used by GEPA v2 for multiple O&amp;G sectors’ activity data.</w:t>
+      </w:r>
+    </w:p>
+    <w:p>
+      <w:pPr>
+        <w:ind w:left="720"/>
+      </w:pPr>
+      <w:r>
+        <w:t xml:space="preserve">Mine safety and health administration – used by GEPA v2 for coal mine locations and some mobile combustion sources.  </w:t>
+      </w:r>
+      <w:hyperlink r:id="rId49" w:history="1">
+        <w:r>
+          <w:rPr>
+            <w:rStyle w:val="Hyperlink"/>
+          </w:rPr>
+          <w:t>https://www.msha.gov/data-and-reports/mine-data-retrieval-system</w:t>
+        </w:r>
+      </w:hyperlink>
+      <w:r>
+        <w:t xml:space="preserve"> </w:t>
+      </w:r>
+    </w:p>
+    <w:p>
+      <w:pPr>
+        <w:ind w:left="720"/>
+      </w:pPr>
+      <w:r>
+        <w:t xml:space="preserve">DOT datasets – used by GEPA v2 for mobile combustion sources.  </w:t>
+      </w:r>
+      <w:hyperlink r:id="rId50" w:history="1">
+        <w:r>
+          <w:rPr>
+            <w:rStyle w:val="Hyperlink"/>
+          </w:rPr>
+          <w:t>https://www.fhwa.dot.gov/policyinformation/statistics/2012/</w:t>
+        </w:r>
+      </w:hyperlink>
+    </w:p>
+    <w:p>
+      <w:pPr>
+        <w:ind w:left="720"/>
+      </w:pPr>
+      <w:r>
+        <w:t xml:space="preserve">National waterway network – used by GEPA v2 for mobile combustion.  </w:t>
+      </w:r>
+      <w:hyperlink r:id="rId51" w:history="1">
+        <w:r>
+          <w:rPr>
+            <w:rStyle w:val="Hyperlink"/>
+          </w:rPr>
+          <w:t>https://data-usdot.opendata.arcgis.com/datasets/usdot::navigable-waterway-network-lines/about</w:t>
+        </w:r>
+      </w:hyperlink>
+      <w:r>
+        <w:t xml:space="preserve"> </w:t>
       </w:r>
     </w:p>
     <w:p>
@@ -1503,282 +1507,20 @@
           <w:b/>
           <w:bCs/>
         </w:rPr>
-        <w:t xml:space="preserve">New datasets to </w:t>
-      </w:r>
-      <w:proofErr w:type="gramStart"/>
+        <w:t xml:space="preserve">People we </w:t>
+      </w:r>
       <w:r>
         <w:rPr>
           <w:b/>
           <w:bCs/>
         </w:rPr>
-        <w:t>consider</w:t>
-      </w:r>
-      <w:proofErr w:type="gramEnd"/>
-    </w:p>
-    <w:p>
-      <w:pPr>
-        <w:ind w:left="720"/>
-      </w:pPr>
-      <w:r>
-        <w:t xml:space="preserve">FEMA structure data – building occupancy type (industrial, residential, etc.) map for the whole US.  </w:t>
-      </w:r>
-      <w:hyperlink r:id="rId40" w:history="1">
-        <w:r>
-          <w:rPr>
-            <w:rStyle w:val="Hyperlink"/>
-          </w:rPr>
-          <w:t>https://gis-fema.hub.arcgis.com/pages/usa-structures</w:t>
-        </w:r>
-      </w:hyperlink>
-    </w:p>
-    <w:p>
-      <w:pPr>
-        <w:ind w:left="720"/>
-      </w:pPr>
-      <w:r>
-        <w:t xml:space="preserve">Census house heating fuel – one of many census data tables available at national to county levels.  </w:t>
-      </w:r>
-      <w:hyperlink r:id="rId41" w:history="1">
-        <w:r>
-          <w:rPr>
-            <w:rStyle w:val="Hyperlink"/>
-          </w:rPr>
-          <w:t>https://data.census.gov/table/ACSDT5Y2020.B25040?q=B25040</w:t>
-        </w:r>
-      </w:hyperlink>
-    </w:p>
-    <w:p>
-      <w:pPr>
-        <w:ind w:left="720"/>
-        <w:rPr>
-          <w:rStyle w:val="Hyperlink"/>
-        </w:rPr>
-      </w:pPr>
-      <w:r>
-        <w:lastRenderedPageBreak/>
-        <w:t xml:space="preserve">EPA FRS database that primarily includes facility information data for pretty much anything of environmental interest.  </w:t>
-      </w:r>
-      <w:hyperlink r:id="rId42" w:history="1">
-        <w:r>
-          <w:rPr>
-            <w:rStyle w:val="Hyperlink"/>
-          </w:rPr>
-          <w:t>https://www.epa.gov/frs</w:t>
-        </w:r>
-      </w:hyperlink>
-    </w:p>
-    <w:p>
-      <w:pPr>
-        <w:ind w:left="720"/>
-      </w:pPr>
-      <w:r>
-        <w:t xml:space="preserve">Waste Business Journal for landfills that Joe mentioned was used in combination with LMOP to scale up emissions beyond GHGRP for the GHGI.  </w:t>
-      </w:r>
-      <w:hyperlink r:id="rId43" w:history="1">
-        <w:r>
-          <w:rPr>
-            <w:rStyle w:val="Hyperlink"/>
-          </w:rPr>
-          <w:t>https://www.wasteinfo.com/diratlas.htm</w:t>
-        </w:r>
-      </w:hyperlink>
-      <w:r>
-        <w:t xml:space="preserve">  </w:t>
-      </w:r>
-      <w:r>
-        <w:t>discussed</w:t>
-      </w:r>
-      <w:r>
-        <w:t xml:space="preserve"> in </w:t>
-      </w:r>
-      <w:hyperlink r:id="rId44" w:history="1">
-        <w:r>
-          <w:rPr>
-            <w:rStyle w:val="Hyperlink"/>
-          </w:rPr>
-          <w:t>https://www.epa.gov/sites/production/files/2021-04/documents/us-ghg-inventory-2021-annex-3-additional-source-or-sink-categories-part-b.pdf</w:t>
-        </w:r>
-      </w:hyperlink>
-      <w:r>
-        <w:t xml:space="preserve"> </w:t>
-      </w:r>
-    </w:p>
-    <w:p>
-      <w:pPr>
-        <w:ind w:left="720"/>
-      </w:pPr>
-      <w:r>
-        <w:t>USDA Census Ag Atlas Maps</w:t>
-      </w:r>
-      <w:r>
-        <w:t xml:space="preserve"> – used by GEPA v2 for several agricultural datasets </w:t>
-      </w:r>
-      <w:hyperlink r:id="rId45" w:history="1">
-        <w:r>
-          <w:rPr>
-            <w:rStyle w:val="Hyperlink"/>
-          </w:rPr>
-          <w:t>https://www.nass.usda.gov/Publications/AgCensus/2017/Online_Resources/Ag_Atlas_Maps/index.php</w:t>
-        </w:r>
-      </w:hyperlink>
-      <w:r>
-        <w:t xml:space="preserve"> </w:t>
-      </w:r>
-    </w:p>
-    <w:p>
-      <w:pPr>
-        <w:ind w:left="720"/>
-      </w:pPr>
-      <w:r>
-        <w:t xml:space="preserve">USDA </w:t>
-      </w:r>
-      <w:proofErr w:type="spellStart"/>
-      <w:r>
-        <w:t>CropScape</w:t>
-      </w:r>
-      <w:proofErr w:type="spellEnd"/>
-      <w:r>
-        <w:t xml:space="preserve"> </w:t>
-      </w:r>
-      <w:r>
-        <w:t xml:space="preserve">– used by GEPA v2 for high resolution cropland type </w:t>
-      </w:r>
-      <w:hyperlink r:id="rId46" w:history="1">
-        <w:r>
-          <w:rPr>
-            <w:rStyle w:val="Hyperlink"/>
-          </w:rPr>
-          <w:t>https://nassgeodata.gmu.edu/CropScape/</w:t>
-        </w:r>
-      </w:hyperlink>
-      <w:r>
-        <w:t xml:space="preserve"> </w:t>
-      </w:r>
-    </w:p>
-    <w:p>
-      <w:pPr>
-        <w:ind w:left="720"/>
-      </w:pPr>
-      <w:proofErr w:type="spellStart"/>
-      <w:r>
-        <w:t>Enverus</w:t>
-      </w:r>
-      <w:proofErr w:type="spellEnd"/>
-      <w:r>
-        <w:t xml:space="preserve"> </w:t>
-      </w:r>
-      <w:r>
-        <w:t xml:space="preserve">(formerly </w:t>
-      </w:r>
-      <w:proofErr w:type="spellStart"/>
-      <w:r>
-        <w:t>drillinginfo</w:t>
-      </w:r>
-      <w:proofErr w:type="spellEnd"/>
-      <w:r>
-        <w:t xml:space="preserve">) </w:t>
-      </w:r>
-      <w:r>
-        <w:t xml:space="preserve">data </w:t>
-      </w:r>
-      <w:r>
-        <w:t xml:space="preserve">– </w:t>
-      </w:r>
-      <w:r>
-        <w:t xml:space="preserve">seems to be a product for sale, though they have university partnerships </w:t>
-      </w:r>
-      <w:hyperlink r:id="rId47" w:history="1">
-        <w:r>
-          <w:rPr>
-            <w:rStyle w:val="Hyperlink"/>
-          </w:rPr>
-          <w:t>https://www.enverus.com/university-partnerships</w:t>
-        </w:r>
-      </w:hyperlink>
-      <w:r>
-        <w:t>.  Used by GEPA v2 for multiple O&amp;G sectors’ activity data.</w:t>
-      </w:r>
-    </w:p>
-    <w:p>
-      <w:pPr>
-        <w:ind w:left="720"/>
-      </w:pPr>
-      <w:r>
-        <w:t xml:space="preserve">Mine safety and health administration – used by GEPA v2 for coal mine locations and some mobile combustion sources.  </w:t>
-      </w:r>
-      <w:hyperlink r:id="rId48" w:history="1">
-        <w:r>
-          <w:rPr>
-            <w:rStyle w:val="Hyperlink"/>
-          </w:rPr>
-          <w:t>https://www.msha.gov/data-and-reports/mine-data-retrieval-system</w:t>
-        </w:r>
-      </w:hyperlink>
-      <w:r>
-        <w:t xml:space="preserve"> </w:t>
-      </w:r>
-    </w:p>
-    <w:p>
-      <w:pPr>
-        <w:ind w:left="720"/>
-      </w:pPr>
-      <w:r>
-        <w:t xml:space="preserve">DOT datasets – used by GEPA v2 for mobile combustion sources.  </w:t>
-      </w:r>
-      <w:hyperlink r:id="rId49" w:history="1">
-        <w:r>
-          <w:rPr>
-            <w:rStyle w:val="Hyperlink"/>
-          </w:rPr>
-          <w:t>https://www.fhwa.dot.gov/policyinformation/statistics/2012/</w:t>
-        </w:r>
-      </w:hyperlink>
-    </w:p>
-    <w:p>
-      <w:pPr>
-        <w:ind w:left="720"/>
-      </w:pPr>
-      <w:r>
-        <w:t xml:space="preserve">National waterway network – used by GEPA v2 for mobile combustion.  </w:t>
-      </w:r>
-      <w:hyperlink r:id="rId50" w:history="1">
-        <w:r>
-          <w:rPr>
-            <w:rStyle w:val="Hyperlink"/>
-          </w:rPr>
-          <w:t>https://data-usdot.opendata.arcgis.com/datasets/usdot::navigable-waterway-network-lines/about</w:t>
-        </w:r>
-      </w:hyperlink>
-      <w:r>
-        <w:t xml:space="preserve"> </w:t>
-      </w:r>
-    </w:p>
-    <w:p>
-      <w:pPr>
+        <w:t>could</w:t>
+      </w:r>
+      <w:r>
         <w:rPr>
           <w:b/>
           <w:bCs/>
         </w:rPr>
-      </w:pPr>
-      <w:r>
-        <w:rPr>
-          <w:b/>
-          <w:bCs/>
-        </w:rPr>
-        <w:t xml:space="preserve">People we </w:t>
-      </w:r>
-      <w:r>
-        <w:rPr>
-          <w:b/>
-          <w:bCs/>
-        </w:rPr>
-        <w:t>could</w:t>
-      </w:r>
-      <w:r>
-        <w:rPr>
-          <w:b/>
-          <w:bCs/>
-        </w:rPr>
         <w:t xml:space="preserve"> reach out to</w:t>
       </w:r>
     </w:p>
@@ -1786,13 +1528,8 @@
       <w:pPr>
         <w:ind w:left="720"/>
       </w:pPr>
-      <w:proofErr w:type="gramStart"/>
-      <w:r>
-        <w:t>Of course</w:t>
-      </w:r>
-      <w:proofErr w:type="gramEnd"/>
-      <w:r>
-        <w:t xml:space="preserve"> those on the papers above.</w:t>
+      <w:r>
+        <w:t>Of course those on the papers above.</w:t>
       </w:r>
     </w:p>
     <w:p>
@@ -1803,13 +1540,8 @@
         <w:t>Madison Barney (Lucy Hutyra lab) – emailed Joe about work she was doing on a Boston CH4 inventory</w:t>
       </w:r>
       <w:r>
-        <w:t xml:space="preserve"> – focusing at the time on wetland </w:t>
-      </w:r>
-      <w:proofErr w:type="gramStart"/>
-      <w:r>
-        <w:t>emissions</w:t>
-      </w:r>
-      <w:proofErr w:type="gramEnd"/>
+        <w:t xml:space="preserve"> – focusing at the time on wetland emissions</w:t>
+      </w:r>
     </w:p>
     <w:p>
       <w:pPr>
@@ -1850,16 +1582,11 @@
         <w:ind w:left="720"/>
       </w:pPr>
       <w:r>
-        <w:t xml:space="preserve">Moore et al from wastewater paper – Roisin said she knows them and can get us in touch for a </w:t>
-      </w:r>
-      <w:proofErr w:type="gramStart"/>
-      <w:r>
-        <w:t>conv</w:t>
+        <w:t>Moore et al from wastewater paper – Roisin said she knows them and can get us in touch for a conv</w:t>
       </w:r>
       <w:r>
         <w:t>ersation</w:t>
       </w:r>
-      <w:proofErr w:type="gramEnd"/>
     </w:p>
     <w:p>
       <w:pPr>
@@ -1882,16 +1609,12 @@
         <w:ind w:left="720"/>
       </w:pPr>
       <w:r>
+        <w:lastRenderedPageBreak/>
         <w:t>Maryann Sargent</w:t>
       </w:r>
       <w:r>
-        <w:t xml:space="preserve"> and Steve </w:t>
-      </w:r>
-      <w:proofErr w:type="spellStart"/>
-      <w:r>
-        <w:t>Wofsy</w:t>
-      </w:r>
-      <w:proofErr w:type="spellEnd"/>
+        <w:t xml:space="preserve"> and Steve Wofsy</w:t>
+      </w:r>
     </w:p>
     <w:p>
       <w:pPr>
@@ -1906,10 +1629,9 @@
         <w:ind w:left="720"/>
       </w:pPr>
       <w:r>
-        <w:lastRenderedPageBreak/>
         <w:t>Debra Wunch – developed Flame-GTA inventory (</w:t>
       </w:r>
-      <w:hyperlink r:id="rId51" w:history="1">
+      <w:hyperlink r:id="rId52" w:history="1">
         <w:r>
           <w:rPr>
             <w:rStyle w:val="Hyperlink"/>
@@ -1923,7 +1645,7 @@
       <w:r>
         <w:t xml:space="preserve">and has done lots of work on urban CH4 (e.g., </w:t>
       </w:r>
-      <w:hyperlink r:id="rId52" w:history="1">
+      <w:hyperlink r:id="rId53" w:history="1">
         <w:r>
           <w:rPr>
             <w:rStyle w:val="Hyperlink"/>
@@ -1940,13 +1662,8 @@
         <w:ind w:left="720"/>
       </w:pPr>
       <w:r>
-        <w:t xml:space="preserve">EDF – in general, and especially if we eventually have interest in NG </w:t>
-      </w:r>
-      <w:proofErr w:type="gramStart"/>
-      <w:r>
-        <w:t>production</w:t>
-      </w:r>
-      <w:proofErr w:type="gramEnd"/>
+        <w:t>EDF – in general, and especially if we eventually have interest in NG production</w:t>
+      </w:r>
     </w:p>
     <w:p>
       <w:pPr>
@@ -1961,31 +1678,16 @@
         <w:ind w:left="720"/>
       </w:pPr>
       <w:r>
-        <w:t xml:space="preserve">GRAAPES/NOAA/James Whetstone – already offered whatever support they can provide in terms of bringing about a better final </w:t>
-      </w:r>
-      <w:proofErr w:type="gramStart"/>
-      <w:r>
-        <w:t>product</w:t>
-      </w:r>
-      <w:proofErr w:type="gramEnd"/>
-    </w:p>
-    <w:p>
-      <w:pPr>
-        <w:ind w:left="720"/>
-      </w:pPr>
-      <w:proofErr w:type="spellStart"/>
-      <w:r>
-        <w:t>ConEd</w:t>
-      </w:r>
-      <w:proofErr w:type="spellEnd"/>
-      <w:r>
-        <w:t xml:space="preserve"> or other utilities – we have some tie-ins from the CH4 </w:t>
-      </w:r>
-      <w:proofErr w:type="gramStart"/>
-      <w:r>
-        <w:t>workshop</w:t>
-      </w:r>
-      <w:proofErr w:type="gramEnd"/>
+        <w:t>GRAAPES/NOAA/James Whetstone – already offered whatever support they can provide in terms of bringing about a better final product</w:t>
+      </w:r>
+    </w:p>
+    <w:p>
+      <w:pPr>
+        <w:ind w:left="720"/>
+      </w:pPr>
+      <w:r>
+        <w:t>ConEd or other utilities – we have some tie-ins from the CH4 workshop</w:t>
+      </w:r>
     </w:p>
     <w:p>
       <w:pPr>
@@ -1994,7 +1696,7 @@
       <w:r>
         <w:t>Jean Bogner (</w:t>
       </w:r>
-      <w:hyperlink r:id="rId53" w:history="1">
+      <w:hyperlink r:id="rId54" w:history="1">
         <w:r>
           <w:rPr>
             <w:rStyle w:val="Hyperlink"/>
@@ -2014,13 +1716,8 @@
         <w:ind w:left="720"/>
       </w:pPr>
       <w:r>
-        <w:t xml:space="preserve">Grant Allen – Joe’s old PI has experience with many sectors, including what seems like a lot of work on urban areas and </w:t>
-      </w:r>
-      <w:proofErr w:type="gramStart"/>
-      <w:r>
-        <w:t>wetlands</w:t>
-      </w:r>
-      <w:proofErr w:type="gramEnd"/>
+        <w:t>Grant Allen – Joe’s old PI has experience with many sectors, including what seems like a lot of work on urban areas and wetlands</w:t>
+      </w:r>
     </w:p>
     <w:p>
       <w:pPr>

</xml_diff>

<commit_message>
Add mention of AVIRIS Science paper SI including emission data
</commit_message>
<xml_diff>
--- a/Inventory_lit_review.docx
+++ b/Inventory_lit_review.docx
@@ -142,6 +142,14 @@
           <w:u w:val="none"/>
         </w:rPr>
         <w:t xml:space="preserve"> poor agreement with GHGRP.  No clear discussion of alternative bottom-up methods unfortunately.</w:t>
+      </w:r>
+      <w:r>
+        <w:rPr>
+          <w:rStyle w:val="Hyperlink"/>
+          <w:color w:val="auto"/>
+          <w:u w:val="none"/>
+        </w:rPr>
+        <w:t xml:space="preserve">  SI includes emission rates/dates/landfill names/GHGRP IDs – so this can be used to test any new potential approaches.</w:t>
       </w:r>
     </w:p>
     <w:p>

</xml_diff>

<commit_message>
Add additional papers, update 1 or 2 that I've read since.
</commit_message>
<xml_diff>
--- a/Inventory_lit_review.docx
+++ b/Inventory_lit_review.docx
@@ -39,8 +39,17 @@
           <w:b/>
           <w:bCs/>
         </w:rPr>
-        <w:t xml:space="preserve"> improve sectors</w:t>
-      </w:r>
+        <w:t xml:space="preserve"> improve </w:t>
+      </w:r>
+      <w:proofErr w:type="gramStart"/>
+      <w:r>
+        <w:rPr>
+          <w:b/>
+          <w:bCs/>
+        </w:rPr>
+        <w:t>sectors</w:t>
+      </w:r>
+      <w:proofErr w:type="gramEnd"/>
     </w:p>
     <w:p>
       <w:pPr>
@@ -72,12 +81,26 @@
         <w:rPr>
           <w:rStyle w:val="citationrow"/>
         </w:rPr>
-        <w:t xml:space="preserve">.  Global study that looks at an empirical relationship between waste composition, moisture, and temperature to adjust the waste decay rate used in landfill emission estimates using IPCC methods.  Showed improved comparisons with measurements (though N is small, ~200), though certainly not a perfect agreement with measurements.  A followup appears to be in the works, preprint = </w:t>
-      </w:r>
+        <w:t xml:space="preserve">.  Global study that looks at an empirical relationship between waste composition, moisture, and temperature to adjust the waste decay rate used in landfill emission estimates using IPCC methods.  Showed improved comparisons with measurements (though N is small, ~200), though certainly not a perfect agreement with measurements.  A </w:t>
+      </w:r>
+      <w:proofErr w:type="spellStart"/>
       <w:r>
         <w:rPr>
           <w:rStyle w:val="citationrow"/>
         </w:rPr>
+        <w:t>followup</w:t>
+      </w:r>
+      <w:proofErr w:type="spellEnd"/>
+      <w:r>
+        <w:rPr>
+          <w:rStyle w:val="citationrow"/>
+        </w:rPr>
+        <w:t xml:space="preserve"> appears to be in the works, preprint = </w:t>
+      </w:r>
+      <w:r>
+        <w:rPr>
+          <w:rStyle w:val="citationrow"/>
+        </w:rPr>
         <w:t>https://doi.org/10.21203/rs.3.rs-3423080/v1</w:t>
       </w:r>
       <w:r>
@@ -125,7 +148,33 @@
           <w:color w:val="auto"/>
           <w:u w:val="none"/>
         </w:rPr>
-        <w:t xml:space="preserve">Sciav + AVIRIS study looking at many landfills showing </w:t>
+        <w:t xml:space="preserve">Cusworth </w:t>
+      </w:r>
+      <w:proofErr w:type="spellStart"/>
+      <w:r>
+        <w:rPr>
+          <w:rStyle w:val="Hyperlink"/>
+          <w:color w:val="auto"/>
+          <w:u w:val="none"/>
+        </w:rPr>
+        <w:t>S</w:t>
+      </w:r>
+      <w:r>
+        <w:rPr>
+          <w:rStyle w:val="Hyperlink"/>
+          <w:color w:val="auto"/>
+          <w:u w:val="none"/>
+        </w:rPr>
+        <w:t>ciav</w:t>
+      </w:r>
+      <w:proofErr w:type="spellEnd"/>
+      <w:r>
+        <w:rPr>
+          <w:rStyle w:val="Hyperlink"/>
+          <w:color w:val="auto"/>
+          <w:u w:val="none"/>
+        </w:rPr>
+        <w:t xml:space="preserve"> + AVIRIS study looking at many landfills showing </w:t>
       </w:r>
       <w:r>
         <w:rPr>
@@ -141,15 +190,47 @@
           <w:color w:val="auto"/>
           <w:u w:val="none"/>
         </w:rPr>
-        <w:t xml:space="preserve"> poor agreement with GHGRP.  No clear discussion of alternative bottom-up methods unfortunately.</w:t>
-      </w:r>
-      <w:r>
-        <w:rPr>
-          <w:rStyle w:val="Hyperlink"/>
-          <w:color w:val="auto"/>
-          <w:u w:val="none"/>
-        </w:rPr>
-        <w:t xml:space="preserve">  SI includes emission rates/dates/landfill names/GHGRP IDs – so this can be used to test any new potential approaches.</w:t>
+        <w:t xml:space="preserve"> poor agreement with GHGRP</w:t>
+      </w:r>
+      <w:r>
+        <w:rPr>
+          <w:rStyle w:val="Hyperlink"/>
+          <w:color w:val="auto"/>
+          <w:u w:val="none"/>
+        </w:rPr>
+        <w:t xml:space="preserve"> (R2 &lt; 0.1)</w:t>
+      </w:r>
+      <w:r>
+        <w:rPr>
+          <w:rStyle w:val="Hyperlink"/>
+          <w:color w:val="auto"/>
+          <w:u w:val="none"/>
+        </w:rPr>
+        <w:t>.  No clear discussion of alternative bottom-up methods unfortunately.</w:t>
+      </w:r>
+      <w:r>
+        <w:rPr>
+          <w:rStyle w:val="Hyperlink"/>
+          <w:color w:val="auto"/>
+          <w:u w:val="none"/>
+        </w:rPr>
+        <w:t xml:space="preserve">  SI includes emission rates/dates/landfill names/GHGRP IDs – so this can be used to test any potential </w:t>
+      </w:r>
+      <w:r>
+        <w:rPr>
+          <w:rStyle w:val="Hyperlink"/>
+          <w:color w:val="auto"/>
+          <w:u w:val="none"/>
+        </w:rPr>
+        <w:t xml:space="preserve">new </w:t>
+      </w:r>
+      <w:r>
+        <w:rPr>
+          <w:rStyle w:val="Hyperlink"/>
+          <w:color w:val="auto"/>
+          <w:u w:val="none"/>
+        </w:rPr>
+        <w:t>approaches.</w:t>
       </w:r>
     </w:p>
     <w:p>
@@ -178,7 +259,87 @@
           <w:color w:val="auto"/>
           <w:u w:val="none"/>
         </w:rPr>
-        <w:t>.  Unread.  National 25 km2 inversion over US in 2019 including detailed sectoral, state, and urban estimates.  Includes some detailed investigation of landfills.</w:t>
+        <w:t xml:space="preserve">.  </w:t>
+      </w:r>
+      <w:r>
+        <w:rPr>
+          <w:rStyle w:val="Hyperlink"/>
+          <w:color w:val="auto"/>
+          <w:u w:val="none"/>
+        </w:rPr>
+        <w:t>Jacob lab n</w:t>
+      </w:r>
+      <w:r>
+        <w:rPr>
+          <w:rStyle w:val="Hyperlink"/>
+          <w:color w:val="auto"/>
+          <w:u w:val="none"/>
+        </w:rPr>
+        <w:t xml:space="preserve">ational 25 km2 </w:t>
+      </w:r>
+      <w:r>
+        <w:rPr>
+          <w:rStyle w:val="Hyperlink"/>
+          <w:color w:val="auto"/>
+          <w:u w:val="none"/>
+        </w:rPr>
+        <w:t xml:space="preserve">TROPOMI CH4 </w:t>
+      </w:r>
+      <w:r>
+        <w:rPr>
+          <w:rStyle w:val="Hyperlink"/>
+          <w:color w:val="auto"/>
+          <w:u w:val="none"/>
+        </w:rPr>
+        <w:t xml:space="preserve">inversion over US in 2019 including detailed sectoral, state, and urban estimates.  Includes some investigation of </w:t>
+      </w:r>
+      <w:r>
+        <w:rPr>
+          <w:rStyle w:val="Hyperlink"/>
+          <w:color w:val="auto"/>
+          <w:u w:val="none"/>
+        </w:rPr>
+        <w:t xml:space="preserve">individual </w:t>
+      </w:r>
+      <w:r>
+        <w:rPr>
+          <w:rStyle w:val="Hyperlink"/>
+          <w:color w:val="auto"/>
+          <w:u w:val="none"/>
+        </w:rPr>
+        <w:t>landfills</w:t>
+      </w:r>
+      <w:r>
+        <w:rPr>
+          <w:rStyle w:val="Hyperlink"/>
+          <w:color w:val="auto"/>
+          <w:u w:val="none"/>
+        </w:rPr>
+        <w:t xml:space="preserve"> too</w:t>
+      </w:r>
+      <w:r>
+        <w:rPr>
+          <w:rStyle w:val="Hyperlink"/>
+          <w:color w:val="auto"/>
+          <w:u w:val="none"/>
+        </w:rPr>
+        <w:t>.</w:t>
+      </w:r>
+      <w:r>
+        <w:rPr>
+          <w:rStyle w:val="Hyperlink"/>
+          <w:color w:val="auto"/>
+          <w:u w:val="none"/>
+        </w:rPr>
+        <w:t xml:space="preserve">  Compares well with Joe’s estimate for NY and reasonably well with several other studies focused on individual cities/landfills.  Like the above, very poor agreement between GHGRP and measured landfill emissions.  Sectoral is at the national scale only, state/urban estimates are total only.  All individual states/sectors/urban areas and the landfills they could isolate are in the SI – good for comparison of landfills or totals.</w:t>
+      </w:r>
+      <w:r>
+        <w:rPr>
+          <w:rStyle w:val="Hyperlink"/>
+          <w:color w:val="auto"/>
+          <w:u w:val="none"/>
+        </w:rPr>
+        <w:t xml:space="preserve">  Many good references in the intro that may have relevant EF or activity data discussion for various sectors.</w:t>
       </w:r>
     </w:p>
     <w:p>
@@ -220,7 +381,15 @@
         </w:rPr>
       </w:pPr>
       <w:r>
-        <w:t xml:space="preserve">Hamburg + Utrecht (EU) – Maazallahi et al., 2020, </w:t>
+        <w:t xml:space="preserve">Hamburg + Utrecht (EU) – </w:t>
+      </w:r>
+      <w:proofErr w:type="spellStart"/>
+      <w:r>
+        <w:t>Maazallahi</w:t>
+      </w:r>
+      <w:proofErr w:type="spellEnd"/>
+      <w:r>
+        <w:t xml:space="preserve"> et al., 2020, </w:t>
       </w:r>
       <w:hyperlink r:id="rId10" w:history="1">
         <w:r>
@@ -282,7 +451,11 @@
         </w:r>
       </w:hyperlink>
       <w:r>
-        <w:t xml:space="preserve"> - car-based CH4 and C2H6 + samples for C and H isotopes.   1.6 L/km road/min in Bucharest, 0.6 L/km road/min in Ploiesti.  Mostly biogenic.  Thermogenic value for Bucharest was 0.5-0.66 L/min/km road.</w:t>
+        <w:t xml:space="preserve"> - car-based CH4 and C2H6 + samples for C </w:t>
+      </w:r>
+      <w:r>
+        <w:lastRenderedPageBreak/>
+        <w:t>and H isotopes.   1.6 L/km road/min in Bucharest, 0.6 L/km road/min in Ploiesti.  Mostly biogenic.  Thermogenic value for Bucharest was 0.5-0.66 L/min/km road.</w:t>
       </w:r>
     </w:p>
     <w:p>
@@ -290,7 +463,15 @@
         <w:ind w:left="1440"/>
       </w:pPr>
       <w:r>
-        <w:t xml:space="preserve">Paris (EU) – Defratyka et al., 2021, </w:t>
+        <w:t xml:space="preserve">Paris (EU) – </w:t>
+      </w:r>
+      <w:proofErr w:type="spellStart"/>
+      <w:r>
+        <w:t>Defratyka</w:t>
+      </w:r>
+      <w:proofErr w:type="spellEnd"/>
+      <w:r>
+        <w:t xml:space="preserve"> et al., 2021, </w:t>
       </w:r>
       <w:hyperlink r:id="rId12" w:history="1">
         <w:r>
@@ -309,7 +490,6 @@
         <w:ind w:left="1440"/>
       </w:pPr>
       <w:r>
-        <w:lastRenderedPageBreak/>
         <w:t xml:space="preserve">Montreal (CA) – Williams et al., 2022, </w:t>
       </w:r>
       <w:hyperlink r:id="rId13" w:history="1">
@@ -321,7 +501,23 @@
         </w:r>
       </w:hyperlink>
       <w:r>
-        <w:t xml:space="preserve"> – chamber based CH4 and flasks for C isotopes, CO2/CH4 and ethane/methane.  Detailed emission factors for many components on SI pg s17.  NG gate = 2.44E3 [0.74E3 – 4.9E3 95%CI] g/hr.  Sewer manholes = 0.567 [0.025 – 1.946] g/hr. Historic landfills = 14.6 [8.5 – 26.8] mg/hr/m2.  Most (all?) were highly skewed.</w:t>
+        <w:t xml:space="preserve"> – chamber based CH4 and flasks for C isotopes, CO2/CH4 and ethane/methane.  Detailed emission factors for many components on SI </w:t>
+      </w:r>
+      <w:proofErr w:type="spellStart"/>
+      <w:r>
+        <w:t>pg</w:t>
+      </w:r>
+      <w:proofErr w:type="spellEnd"/>
+      <w:r>
+        <w:t xml:space="preserve"> s17.  NG gate = 2.44E3 [0.74E3 – 4.9E3 95%CI] g/hr.  Sewer manholes = 0.567 [0.025 – 1.946] g/hr. Historic landfills = 14.6 [8.5 – 26.8] mg/</w:t>
+      </w:r>
+      <w:proofErr w:type="spellStart"/>
+      <w:r>
+        <w:t>hr</w:t>
+      </w:r>
+      <w:proofErr w:type="spellEnd"/>
+      <w:r>
+        <w:t>/m2.  Most (all?) were highly skewed.</w:t>
       </w:r>
     </w:p>
     <w:p>
@@ -385,15 +581,69 @@
           <w:color w:val="auto"/>
           <w:u w:val="none"/>
         </w:rPr>
-        <w:t>Using this estimate they scaled to national emissions of 1.2 MMT CO2e/yr from sewers.</w:t>
-      </w:r>
-      <w:r>
-        <w:rPr>
-          <w:rStyle w:val="Hyperlink"/>
-          <w:color w:val="auto"/>
-          <w:u w:val="none"/>
-        </w:rPr>
-        <w:t xml:space="preserve">  This is compared to 10.9 ± 7 MMT CO2e/yr from wastewater entirely.  Mentions some relationships with temperature.</w:t>
+        <w:t>Using this estimate they scaled to national emissions of 1.2 MMT CO2e/</w:t>
+      </w:r>
+      <w:proofErr w:type="spellStart"/>
+      <w:r>
+        <w:rPr>
+          <w:rStyle w:val="Hyperlink"/>
+          <w:color w:val="auto"/>
+          <w:u w:val="none"/>
+        </w:rPr>
+        <w:t>yr</w:t>
+      </w:r>
+      <w:proofErr w:type="spellEnd"/>
+      <w:r>
+        <w:rPr>
+          <w:rStyle w:val="Hyperlink"/>
+          <w:color w:val="auto"/>
+          <w:u w:val="none"/>
+        </w:rPr>
+        <w:t xml:space="preserve"> from sewers.</w:t>
+      </w:r>
+      <w:r>
+        <w:rPr>
+          <w:rStyle w:val="Hyperlink"/>
+          <w:color w:val="auto"/>
+          <w:u w:val="none"/>
+        </w:rPr>
+        <w:t xml:space="preserve">  This is compared to 10.9 ± 7 MMT CO2e/</w:t>
+      </w:r>
+      <w:proofErr w:type="spellStart"/>
+      <w:r>
+        <w:rPr>
+          <w:rStyle w:val="Hyperlink"/>
+          <w:color w:val="auto"/>
+          <w:u w:val="none"/>
+        </w:rPr>
+        <w:t>yr</w:t>
+      </w:r>
+      <w:proofErr w:type="spellEnd"/>
+      <w:r>
+        <w:rPr>
+          <w:rStyle w:val="Hyperlink"/>
+          <w:color w:val="auto"/>
+          <w:u w:val="none"/>
+        </w:rPr>
+        <w:t xml:space="preserve"> from wastewater entirely.  </w:t>
+      </w:r>
+      <w:proofErr w:type="gramStart"/>
+      <w:r>
+        <w:rPr>
+          <w:rStyle w:val="Hyperlink"/>
+          <w:color w:val="auto"/>
+          <w:u w:val="none"/>
+        </w:rPr>
+        <w:t>Mentions</w:t>
+      </w:r>
+      <w:proofErr w:type="gramEnd"/>
+      <w:r>
+        <w:rPr>
+          <w:rStyle w:val="Hyperlink"/>
+          <w:color w:val="auto"/>
+          <w:u w:val="none"/>
+        </w:rPr>
+        <w:t xml:space="preserve"> some relationships with temperature.</w:t>
       </w:r>
     </w:p>
     <w:p>
@@ -420,7 +670,23 @@
         </w:r>
       </w:hyperlink>
       <w:r>
-        <w:t xml:space="preserve"> - 63 plants across US discussing biochemical oxygen demand (BOD) and flow based emission factors.  BOD was ~constant with size and flow was log-linear.  ~2x IPPC/EPA EF on average.  Also stresses that variability in operations over time and facility to facility are important and make these EF’s more “rough estimates”.  Mentions of diurnal patterns from previous work.</w:t>
+        <w:t xml:space="preserve"> - 63 plants across US discussing biochemical oxygen demand (BOD) and </w:t>
+      </w:r>
+      <w:proofErr w:type="gramStart"/>
+      <w:r>
+        <w:t>flow based</w:t>
+      </w:r>
+      <w:proofErr w:type="gramEnd"/>
+      <w:r>
+        <w:t xml:space="preserve"> emission factors.  BOD was ~constant with size and flow was </w:t>
+      </w:r>
+      <w:proofErr w:type="gramStart"/>
+      <w:r>
+        <w:t>log-linear</w:t>
+      </w:r>
+      <w:proofErr w:type="gramEnd"/>
+      <w:r>
+        <w:t>.  ~2x IPPC/EPA EF on average.  Also stresses that variability in operations over time and facility to facility are important and make these EF’s more “rough estimates”.  Mentions of diurnal patterns from previous work.</w:t>
       </w:r>
     </w:p>
     <w:p>
@@ -441,14 +707,43 @@
       <w:r>
         <w:t xml:space="preserve">Unread.  </w:t>
       </w:r>
-      <w:r>
-        <w:t xml:space="preserve">International </w:t>
+      <w:proofErr w:type="gramStart"/>
+      <w:r>
+        <w:t>International</w:t>
+      </w:r>
+      <w:proofErr w:type="gramEnd"/>
+      <w:r>
+        <w:t xml:space="preserve"> </w:t>
       </w:r>
       <w:r>
         <w:t>article</w:t>
       </w:r>
       <w:r>
         <w:t xml:space="preserve"> discussing wastewater emissions – it doesn’t seem to be directly relevant but some of their references seem like they could be of value for the CH4 inventory.</w:t>
+      </w:r>
+    </w:p>
+    <w:p>
+      <w:pPr>
+        <w:ind w:left="1440"/>
+      </w:pPr>
+      <w:hyperlink r:id="rId17" w:history="1">
+        <w:r>
+          <w:rPr>
+            <w:rStyle w:val="Hyperlink"/>
+          </w:rPr>
+          <w:t>https://doi.org/10.1016/j.biortech.2024.130897</w:t>
+        </w:r>
+      </w:hyperlink>
+      <w:r>
+        <w:t xml:space="preserve">.  Unread.  Italy-focused article that clearly outlines </w:t>
+      </w:r>
+      <w:proofErr w:type="gramStart"/>
+      <w:r>
+        <w:t>EF’s</w:t>
+      </w:r>
+      <w:proofErr w:type="gramEnd"/>
+      <w:r>
+        <w:t xml:space="preserve"> for each type of wastewater treatment.  Could easily be applied – if we have such detailed data on the type of treatment at each facility (not sure if we do).</w:t>
       </w:r>
     </w:p>
     <w:p>
@@ -464,7 +759,7 @@
       <w:r>
         <w:t xml:space="preserve">Multiple US cities – Lamb et al., 2015, </w:t>
       </w:r>
-      <w:hyperlink r:id="rId17" w:history="1">
+      <w:hyperlink r:id="rId18" w:history="1">
         <w:r>
           <w:rPr>
             <w:rStyle w:val="Hyperlink"/>
@@ -489,9 +784,10 @@
         <w:ind w:left="2160"/>
       </w:pPr>
       <w:r>
+        <w:lastRenderedPageBreak/>
         <w:t xml:space="preserve">LA – Zeng et al., 2023, </w:t>
       </w:r>
-      <w:hyperlink r:id="rId18" w:history="1">
+      <w:hyperlink r:id="rId19" w:history="1">
         <w:r>
           <w:rPr>
             <w:rStyle w:val="Hyperlink"/>
@@ -519,7 +815,7 @@
       <w:r>
         <w:t xml:space="preserve">DC – Karion et al., 2023, </w:t>
       </w:r>
-      <w:hyperlink r:id="rId19" w:history="1">
+      <w:hyperlink r:id="rId20" w:history="1">
         <w:r>
           <w:rPr>
             <w:rStyle w:val="Hyperlink"/>
@@ -538,7 +834,7 @@
       <w:r>
         <w:t xml:space="preserve">Baltimore – Karion et al., 2023, </w:t>
       </w:r>
-      <w:hyperlink r:id="rId20" w:history="1">
+      <w:hyperlink r:id="rId21" w:history="1">
         <w:r>
           <w:rPr>
             <w:rStyle w:val="Hyperlink"/>
@@ -560,7 +856,7 @@
       <w:r>
         <w:t xml:space="preserve"> </w:t>
       </w:r>
-      <w:hyperlink r:id="rId21" w:history="1">
+      <w:hyperlink r:id="rId22" w:history="1">
         <w:r>
           <w:rPr>
             <w:rStyle w:val="Hyperlink"/>
@@ -569,18 +865,22 @@
         </w:r>
       </w:hyperlink>
       <w:r>
-        <w:t xml:space="preserve"> - CH4 seasonality is linear in dormant season only as 0.021x+11 g/m2yr.  NG sector is linear as 0.025x+6.4 g/m2yr</w:t>
-      </w:r>
+        <w:t xml:space="preserve"> - CH4 seasonality is linear in dormant season only as 0.021x+11 g/m2yr.  NG sector is linear as 0.025x+6.4 g/</w:t>
+      </w:r>
+      <w:proofErr w:type="gramStart"/>
+      <w:r>
+        <w:t>m2yr</w:t>
+      </w:r>
+      <w:proofErr w:type="gramEnd"/>
     </w:p>
     <w:p>
       <w:pPr>
         <w:ind w:left="1440"/>
       </w:pPr>
       <w:r>
-        <w:lastRenderedPageBreak/>
         <w:t xml:space="preserve">EST 2024, </w:t>
       </w:r>
-      <w:hyperlink r:id="rId22" w:history="1">
+      <w:hyperlink r:id="rId23" w:history="1">
         <w:r>
           <w:rPr>
             <w:rStyle w:val="Hyperlink"/>
@@ -592,7 +892,15 @@
         <w:t>.  Unread F</w:t>
       </w:r>
       <w:r>
-        <w:t>elix Vogel et al., using vehicle based measurements to understand NG leaks in urban centers.  Could provide some useful information beyond previous papers.</w:t>
+        <w:t xml:space="preserve">elix Vogel et al., using </w:t>
+      </w:r>
+      <w:proofErr w:type="gramStart"/>
+      <w:r>
+        <w:t>vehicle based</w:t>
+      </w:r>
+      <w:proofErr w:type="gramEnd"/>
+      <w:r>
+        <w:t xml:space="preserve"> measurements to understand NG leaks in urban centers.  Could provide some useful information beyond previous papers.</w:t>
       </w:r>
     </w:p>
     <w:p>
@@ -602,7 +910,7 @@
       <w:r>
         <w:t xml:space="preserve">EST 2024, </w:t>
       </w:r>
-      <w:hyperlink r:id="rId23" w:history="1">
+      <w:hyperlink r:id="rId24" w:history="1">
         <w:r>
           <w:rPr>
             <w:rStyle w:val="Hyperlink"/>
@@ -638,7 +946,7 @@
       <w:r>
         <w:t xml:space="preserve">PLOS one – 2023 </w:t>
       </w:r>
-      <w:hyperlink r:id="rId24" w:history="1">
+      <w:hyperlink r:id="rId25" w:history="1">
         <w:r>
           <w:rPr>
             <w:rStyle w:val="Hyperlink"/>
@@ -656,7 +964,15 @@
         <w:t>1/3 produced measurable CH4 (all produced N2O too).  Used to build EFs</w:t>
       </w:r>
       <w:r>
-        <w:t xml:space="preserve"> – older (&gt;30) individuals emitted slightly more and women were more likely to emit</w:t>
+        <w:t xml:space="preserve"> – older (&gt;30) individuals emitted slightly </w:t>
+      </w:r>
+      <w:proofErr w:type="gramStart"/>
+      <w:r>
+        <w:t>more</w:t>
+      </w:r>
+      <w:proofErr w:type="gramEnd"/>
+      <w:r>
+        <w:t xml:space="preserve"> and women were more likely to emit</w:t>
       </w:r>
       <w:r>
         <w:t>.  Specific to UK</w:t>
@@ -689,7 +1005,15 @@
         <w:t>.</w:t>
       </w:r>
       <w:r>
-        <w:t xml:space="preserve">  They state “if the greater London area were a managed grassland, soil emissions of CH4 would be equivalent to that of human breath in the same area” – so emissions are small (0.05% of national inventory).  But, census data is easily available – so it wouldn’t be a hard one to add.  </w:t>
+        <w:t xml:space="preserve">  They state “if the greater London area were a managed grassland, soil emissions of CH4 would be equivalent to that of human breath in the same area” – so emissions are small (0.05% of national inventory).  </w:t>
+      </w:r>
+      <w:proofErr w:type="gramStart"/>
+      <w:r>
+        <w:t>But,</w:t>
+      </w:r>
+      <w:proofErr w:type="gramEnd"/>
+      <w:r>
+        <w:t xml:space="preserve"> census data is easily available – so it wouldn’t be a hard one to add.  </w:t>
       </w:r>
       <w:r>
         <w:t>There are s</w:t>
@@ -698,10 +1022,26 @@
         <w:t xml:space="preserve">ome other </w:t>
       </w:r>
       <w:r>
-        <w:t>relevant work in their citations</w:t>
-      </w:r>
-      <w:r>
-        <w:t>, though they also seem to be limited N people or regions.</w:t>
+        <w:t xml:space="preserve">relevant </w:t>
+      </w:r>
+      <w:proofErr w:type="gramStart"/>
+      <w:r>
+        <w:t>work</w:t>
+      </w:r>
+      <w:proofErr w:type="gramEnd"/>
+      <w:r>
+        <w:t xml:space="preserve"> in their citations</w:t>
+      </w:r>
+      <w:r>
+        <w:t xml:space="preserve">, though they also seem to be </w:t>
+      </w:r>
+      <w:proofErr w:type="gramStart"/>
+      <w:r>
+        <w:t>limited</w:t>
+      </w:r>
+      <w:proofErr w:type="gramEnd"/>
+      <w:r>
+        <w:t xml:space="preserve"> N people or regions.</w:t>
       </w:r>
     </w:p>
     <w:p>
@@ -723,7 +1063,7 @@
         <w:tab/>
         <w:t xml:space="preserve">RECAPP2 – </w:t>
       </w:r>
-      <w:hyperlink r:id="rId25" w:history="1">
+      <w:hyperlink r:id="rId26" w:history="1">
         <w:r>
           <w:rPr>
             <w:rStyle w:val="Hyperlink"/>
@@ -741,7 +1081,15 @@
       </w:pPr>
       <w:r>
         <w:tab/>
-        <w:t>Many models beyond just WETCHARTS (Wetchimp, NASA’s LPJ-WSL, SOCCR)</w:t>
+        <w:t>Many models beyond just WETCHARTS (</w:t>
+      </w:r>
+      <w:proofErr w:type="spellStart"/>
+      <w:r>
+        <w:t>Wetchimp</w:t>
+      </w:r>
+      <w:proofErr w:type="spellEnd"/>
+      <w:r>
+        <w:t>, NASA’s LPJ-WSL, SOCCR)</w:t>
       </w:r>
     </w:p>
     <w:p>
@@ -757,7 +1105,7 @@
       <w:r>
         <w:t xml:space="preserve">AGU Advances </w:t>
       </w:r>
-      <w:hyperlink r:id="rId26" w:history="1">
+      <w:hyperlink r:id="rId27" w:history="1">
         <w:r>
           <w:rPr>
             <w:rStyle w:val="Hyperlink"/>
@@ -767,6 +1115,104 @@
       </w:hyperlink>
       <w:r>
         <w:t xml:space="preserve"> which uses fluxes from 119 site-years of data in a random forest model to produce global 0.25 deg wetland maps.</w:t>
+      </w:r>
+    </w:p>
+    <w:p>
+      <w:pPr>
+        <w:ind w:left="1440"/>
+      </w:pPr>
+      <w:r>
+        <w:t xml:space="preserve">East et al., 2024 – Unread GRL </w:t>
+      </w:r>
+      <w:hyperlink r:id="rId28" w:history="1">
+        <w:r>
+          <w:rPr>
+            <w:rStyle w:val="Hyperlink"/>
+          </w:rPr>
+          <w:t>https://doi.org/10.1029/2024GL108494</w:t>
+        </w:r>
+      </w:hyperlink>
+      <w:r>
+        <w:t xml:space="preserve"> Comparing 22 different OH model and 24 wetland inventories in GEOS-Chem to see what best recreates the observed (</w:t>
+      </w:r>
+      <w:proofErr w:type="spellStart"/>
+      <w:r>
+        <w:t>obspack</w:t>
+      </w:r>
+      <w:proofErr w:type="spellEnd"/>
+      <w:r>
+        <w:t xml:space="preserve">) seasonality in the N hemisphere CH4.  They argue it’s wetlands and the interhemispheric OH is a lesser effect.  Features that fit </w:t>
+      </w:r>
+      <w:proofErr w:type="spellStart"/>
+      <w:r>
+        <w:t>obs</w:t>
+      </w:r>
+      <w:proofErr w:type="spellEnd"/>
+      <w:r>
+        <w:t xml:space="preserve"> are an 80 </w:t>
+      </w:r>
+      <w:proofErr w:type="spellStart"/>
+      <w:r>
+        <w:t>Tg</w:t>
+      </w:r>
+      <w:proofErr w:type="spellEnd"/>
+      <w:r>
+        <w:t>/</w:t>
+      </w:r>
+      <w:proofErr w:type="spellStart"/>
+      <w:r>
+        <w:t>yr</w:t>
+      </w:r>
+      <w:proofErr w:type="spellEnd"/>
+      <w:r>
+        <w:t xml:space="preserve"> poleward of 10 N to match </w:t>
+      </w:r>
+      <w:proofErr w:type="spellStart"/>
+      <w:r>
+        <w:t>obs</w:t>
+      </w:r>
+      <w:proofErr w:type="spellEnd"/>
+      <w:r>
+        <w:t xml:space="preserve">, significant South Asia emissions, Aug peak in </w:t>
+      </w:r>
+      <w:r>
+        <w:lastRenderedPageBreak/>
+        <w:t>boreal emissions continuing into Autumn.  LPJ-</w:t>
+      </w:r>
+      <w:proofErr w:type="spellStart"/>
+      <w:r>
+        <w:t>wsl</w:t>
+      </w:r>
+      <w:proofErr w:type="spellEnd"/>
+      <w:r>
+        <w:t xml:space="preserve"> driven with MERRA-2 MET was the only model setup that had these features.</w:t>
+      </w:r>
+    </w:p>
+    <w:p>
+      <w:pPr>
+        <w:ind w:left="1440"/>
+      </w:pPr>
+      <w:r>
+        <w:t xml:space="preserve">Cao et al., 2024 – Unread Environmental Pollution </w:t>
+      </w:r>
+      <w:hyperlink r:id="rId29" w:history="1">
+        <w:r>
+          <w:rPr>
+            <w:rStyle w:val="Hyperlink"/>
+          </w:rPr>
+          <w:t>https://doi.org/10.1016/j.envpol.2024.124204</w:t>
+        </w:r>
+      </w:hyperlink>
+      <w:r>
+        <w:t xml:space="preserve"> which is a 24 </w:t>
+      </w:r>
+      <w:proofErr w:type="spellStart"/>
+      <w:r>
+        <w:t>yr</w:t>
+      </w:r>
+      <w:proofErr w:type="spellEnd"/>
+      <w:r>
+        <w:t xml:space="preserve"> bibliometric meta-analysis review of wetlands and rivers.</w:t>
       </w:r>
     </w:p>
     <w:p>
@@ -785,7 +1231,7 @@
       <w:r>
         <w:t xml:space="preserve">UK – Boothroyd et al., 2018, </w:t>
       </w:r>
-      <w:hyperlink r:id="rId27" w:history="1">
+      <w:hyperlink r:id="rId30" w:history="1">
         <w:r>
           <w:rPr>
             <w:rStyle w:val="Hyperlink"/>
@@ -815,7 +1261,15 @@
         <w:t xml:space="preserve"> and C13-CH4 measurements.  </w:t>
       </w:r>
       <w:r>
-        <w:t>2.043 tonnes/km/yr.</w:t>
+        <w:t xml:space="preserve">2.043 </w:t>
+      </w:r>
+      <w:proofErr w:type="spellStart"/>
+      <w:r>
+        <w:t>tonnes</w:t>
+      </w:r>
+      <w:proofErr w:type="spellEnd"/>
+      <w:r>
+        <w:t>/km/yr.</w:t>
       </w:r>
     </w:p>
     <w:p>
@@ -862,7 +1316,7 @@
         </w:rPr>
         <w:t xml:space="preserve">Omara et al., (many familiar Harvard and EDF folks) 2023 – ESD </w:t>
       </w:r>
-      <w:hyperlink r:id="rId28" w:history="1">
+      <w:hyperlink r:id="rId31" w:history="1">
         <w:r>
           <w:rPr>
             <w:rStyle w:val="Hyperlink"/>
@@ -917,7 +1371,7 @@
         </w:rPr>
         <w:t>Unread Omara et al., (</w:t>
       </w:r>
-      <w:hyperlink r:id="rId29" w:history="1">
+      <w:hyperlink r:id="rId32" w:history="1">
         <w:r>
           <w:rPr>
             <w:rStyle w:val="Hyperlink"/>
@@ -926,7 +1380,15 @@
         </w:r>
       </w:hyperlink>
       <w:r>
-        <w:t>) 2024 – ESD.  They compile facility-scale measurements across the supply chain including MethaneAir measurements to build a 10 km2 national inventory based on measurements rather than emission factors (from what I can tell).  Mean loss rate of 2.6% nationally, though it varies by basin.</w:t>
+        <w:t xml:space="preserve">) 2024 – ESD.  They compile facility-scale measurements across the supply chain including </w:t>
+      </w:r>
+      <w:proofErr w:type="spellStart"/>
+      <w:r>
+        <w:t>MethaneAir</w:t>
+      </w:r>
+      <w:proofErr w:type="spellEnd"/>
+      <w:r>
+        <w:t xml:space="preserve"> measurements to build a 10 km2 national inventory based on measurements rather than emission factors (from what I can tell).  Mean loss rate of 2.6% nationally, though it varies by basin.</w:t>
       </w:r>
     </w:p>
     <w:p>
@@ -934,10 +1396,9 @@
         <w:ind w:left="1440"/>
       </w:pPr>
       <w:r>
-        <w:lastRenderedPageBreak/>
         <w:t xml:space="preserve">Riddick et al., Atmosphere – 2024 </w:t>
       </w:r>
-      <w:hyperlink r:id="rId30" w:history="1">
+      <w:hyperlink r:id="rId33" w:history="1">
         <w:r>
           <w:rPr>
             <w:rStyle w:val="Hyperlink"/>
@@ -962,7 +1423,7 @@
       <w:r>
         <w:t xml:space="preserve">Conrad et al., Communications Earth and Environment – 2023 </w:t>
       </w:r>
-      <w:hyperlink r:id="rId31" w:history="1">
+      <w:hyperlink r:id="rId34" w:history="1">
         <w:r>
           <w:rPr>
             <w:rStyle w:val="Hyperlink"/>
@@ -987,7 +1448,7 @@
       <w:r>
         <w:t xml:space="preserve">GFEI inventory – Scarpelli et al., ACP 2022 </w:t>
       </w:r>
-      <w:hyperlink r:id="rId32" w:history="1">
+      <w:hyperlink r:id="rId35" w:history="1">
         <w:r>
           <w:rPr>
             <w:rStyle w:val="Hyperlink"/>
@@ -1015,7 +1476,7 @@
       <w:r>
         <w:t xml:space="preserve">Fiddler et al., JGR Atmospheres – 2024 </w:t>
       </w:r>
-      <w:hyperlink r:id="rId33" w:history="1">
+      <w:hyperlink r:id="rId36" w:history="1">
         <w:r>
           <w:rPr>
             <w:rStyle w:val="Hyperlink"/>
@@ -1030,13 +1491,29 @@
         <w:t xml:space="preserve">Unread </w:t>
       </w:r>
       <w:r>
-        <w:t>FIREX – AQ emission factors – including one for CH4.  I’m not sure how well the underlying activity data can be accessed, but worth looking at if we consider this sector.</w:t>
+        <w:t xml:space="preserve">FIREX – AQ emission factors – including one for CH4.  I’m not sure how well the underlying activity data can be accessed, but </w:t>
+      </w:r>
+      <w:proofErr w:type="gramStart"/>
+      <w:r>
+        <w:t>worth</w:t>
+      </w:r>
+      <w:proofErr w:type="gramEnd"/>
+      <w:r>
+        <w:t xml:space="preserve"> looking at if we consider this sector.</w:t>
       </w:r>
     </w:p>
     <w:p>
       <w:r>
         <w:tab/>
-        <w:t>Ag (priority = low, complexity = ?)</w:t>
+        <w:t xml:space="preserve">Ag (priority = low, complexity </w:t>
+      </w:r>
+      <w:proofErr w:type="gramStart"/>
+      <w:r>
+        <w:t>= ?</w:t>
+      </w:r>
+      <w:proofErr w:type="gramEnd"/>
+      <w:r>
+        <w:t>)</w:t>
       </w:r>
     </w:p>
     <w:p>
@@ -1061,7 +1538,7 @@
       <w:r>
         <w:t xml:space="preserve">sectoral optimization in Colorado </w:t>
       </w:r>
-      <w:hyperlink r:id="rId34" w:history="1">
+      <w:hyperlink r:id="rId37" w:history="1">
         <w:r>
           <w:rPr>
             <w:rStyle w:val="Hyperlink"/>
@@ -1088,9 +1565,29 @@
           <w:color w:val="auto"/>
           <w:u w:val="none"/>
         </w:rPr>
-        <w:t xml:space="preserve">Unread 2024 EST paper on agricultural ponds.  Discusses a method to estimate emissions, uses Australia to demo and compare to reported emissions.  41 kt/yr or 0.238 t/ha/yr.  </w:t>
-      </w:r>
-      <w:hyperlink r:id="rId35" w:history="1">
+        <w:t>Unread 2024 EST paper on agricultural ponds.  Discusses a method to estimate emissions, uses Australia to demo and compare to reported emissions.  41 kt/</w:t>
+      </w:r>
+      <w:proofErr w:type="spellStart"/>
+      <w:r>
+        <w:rPr>
+          <w:rStyle w:val="Hyperlink"/>
+          <w:rFonts w:ascii="Times New Roman" w:eastAsia="Times New Roman" w:hAnsi="Times New Roman" w:cs="Times New Roman"/>
+          <w:color w:val="auto"/>
+          <w:u w:val="none"/>
+        </w:rPr>
+        <w:t>yr</w:t>
+      </w:r>
+      <w:proofErr w:type="spellEnd"/>
+      <w:r>
+        <w:rPr>
+          <w:rStyle w:val="Hyperlink"/>
+          <w:rFonts w:ascii="Times New Roman" w:eastAsia="Times New Roman" w:hAnsi="Times New Roman" w:cs="Times New Roman"/>
+          <w:color w:val="auto"/>
+          <w:u w:val="none"/>
+        </w:rPr>
+        <w:t xml:space="preserve"> or 0.238 t/ha/yr.  </w:t>
+      </w:r>
+      <w:hyperlink r:id="rId38" w:history="1">
         <w:r>
           <w:rPr>
             <w:rStyle w:val="Hyperlink"/>
@@ -1125,6 +1622,7 @@
           <w:color w:val="auto"/>
           <w:u w:val="none"/>
         </w:rPr>
+        <w:lastRenderedPageBreak/>
         <w:tab/>
         <w:t>Chemical Production</w:t>
       </w:r>
@@ -1135,7 +1633,27 @@
           <w:color w:val="auto"/>
           <w:u w:val="none"/>
         </w:rPr>
-        <w:t xml:space="preserve"> (priority = low, complexity = ?)</w:t>
+        <w:t xml:space="preserve"> (priority = low, complexity </w:t>
+      </w:r>
+      <w:proofErr w:type="gramStart"/>
+      <w:r>
+        <w:rPr>
+          <w:rStyle w:val="Hyperlink"/>
+          <w:rFonts w:ascii="Times New Roman" w:eastAsia="Times New Roman" w:hAnsi="Times New Roman" w:cs="Times New Roman"/>
+          <w:color w:val="auto"/>
+          <w:u w:val="none"/>
+        </w:rPr>
+        <w:t>= ?</w:t>
+      </w:r>
+      <w:proofErr w:type="gramEnd"/>
+      <w:r>
+        <w:rPr>
+          <w:rStyle w:val="Hyperlink"/>
+          <w:rFonts w:ascii="Times New Roman" w:eastAsia="Times New Roman" w:hAnsi="Times New Roman" w:cs="Times New Roman"/>
+          <w:color w:val="auto"/>
+          <w:u w:val="none"/>
+        </w:rPr>
+        <w:t>)</w:t>
       </w:r>
     </w:p>
     <w:p>
@@ -1160,7 +1678,7 @@
         </w:rPr>
         <w:t xml:space="preserve">2024 Nature Chemical Engineering global paper using lifecycle modeling to estimate lifetime emissions from cradle to gate.  Some aspects/methods and data sets could be of value, though we’d want point emissions, not to assign lifecycle emissions at the point of production.  </w:t>
       </w:r>
-      <w:hyperlink r:id="rId36" w:history="1">
+      <w:hyperlink r:id="rId39" w:history="1">
         <w:r>
           <w:rPr>
             <w:rStyle w:val="Hyperlink"/>
@@ -1208,7 +1726,7 @@
       <w:r>
         <w:t xml:space="preserve">Toronto (CA) - </w:t>
       </w:r>
-      <w:hyperlink r:id="rId37" w:history="1">
+      <w:hyperlink r:id="rId40" w:history="1">
         <w:r>
           <w:rPr>
             <w:rStyle w:val="Hyperlink"/>
@@ -1229,7 +1747,7 @@
         </w:rPr>
         <w:t xml:space="preserve">Scarpelli Canada GEPA – </w:t>
       </w:r>
-      <w:hyperlink r:id="rId38" w:history="1">
+      <w:hyperlink r:id="rId41" w:history="1">
         <w:r>
           <w:rPr>
             <w:rStyle w:val="Hyperlink"/>
@@ -1248,7 +1766,7 @@
       <w:r>
         <w:t xml:space="preserve">New to me, but Climate TRACE – global (national for some, facility level for others).  Seems to be primarily built from models relying on machine learning + measurements, but very few publications (much more policy-focused, Al Gore sponsored).  </w:t>
       </w:r>
-      <w:hyperlink r:id="rId39" w:history="1">
+      <w:hyperlink r:id="rId42" w:history="1">
         <w:r>
           <w:rPr>
             <w:rStyle w:val="Hyperlink"/>
@@ -1259,7 +1777,7 @@
       <w:r>
         <w:t xml:space="preserve">.  </w:t>
       </w:r>
-      <w:hyperlink r:id="rId40" w:history="1">
+      <w:hyperlink r:id="rId43" w:history="1">
         <w:r>
           <w:rPr>
             <w:rStyle w:val="Hyperlink"/>
@@ -1283,252 +1801,282 @@
           <w:b/>
           <w:bCs/>
         </w:rPr>
-        <w:t>New datasets to consider</w:t>
-      </w:r>
-    </w:p>
-    <w:p>
-      <w:pPr>
-        <w:ind w:left="720"/>
-      </w:pPr>
-      <w:r>
-        <w:t xml:space="preserve">FEMA structure data – building occupancy type (industrial, residential, etc.) map for the whole US.  </w:t>
-      </w:r>
-      <w:hyperlink r:id="rId41" w:history="1">
-        <w:r>
-          <w:rPr>
-            <w:rStyle w:val="Hyperlink"/>
-          </w:rPr>
-          <w:t>https://gis-fema.hub.arcgis.com/pages/usa-structures</w:t>
-        </w:r>
-      </w:hyperlink>
-    </w:p>
-    <w:p>
-      <w:pPr>
-        <w:ind w:left="720"/>
-      </w:pPr>
-      <w:r>
-        <w:lastRenderedPageBreak/>
-        <w:t xml:space="preserve">Census house heating fuel – one of many census data tables available at national to county levels.  </w:t>
-      </w:r>
-      <w:hyperlink r:id="rId42" w:history="1">
-        <w:r>
-          <w:rPr>
-            <w:rStyle w:val="Hyperlink"/>
-          </w:rPr>
-          <w:t>https://data.census.gov/table/ACSDT5Y2020.B25040?q=B25040</w:t>
-        </w:r>
-      </w:hyperlink>
-    </w:p>
-    <w:p>
-      <w:pPr>
-        <w:ind w:left="720"/>
-        <w:rPr>
-          <w:rStyle w:val="Hyperlink"/>
-        </w:rPr>
-      </w:pPr>
-      <w:r>
-        <w:t xml:space="preserve">EPA FRS database that primarily includes facility information data for pretty much anything of environmental interest.  </w:t>
-      </w:r>
-      <w:hyperlink r:id="rId43" w:history="1">
-        <w:r>
-          <w:rPr>
-            <w:rStyle w:val="Hyperlink"/>
-          </w:rPr>
-          <w:t>https://www.epa.gov/frs</w:t>
-        </w:r>
-      </w:hyperlink>
-    </w:p>
-    <w:p>
-      <w:pPr>
-        <w:ind w:left="720"/>
-      </w:pPr>
-      <w:r>
-        <w:t xml:space="preserve">Waste Business Journal for landfills that Joe mentioned was used in combination with LMOP to scale up emissions beyond GHGRP for the GHGI.  </w:t>
-      </w:r>
-      <w:hyperlink r:id="rId44" w:history="1">
-        <w:r>
-          <w:rPr>
-            <w:rStyle w:val="Hyperlink"/>
-          </w:rPr>
-          <w:t>https://www.wasteinfo.com/diratlas.htm</w:t>
-        </w:r>
-      </w:hyperlink>
-      <w:r>
-        <w:t xml:space="preserve">  </w:t>
-      </w:r>
-      <w:r>
-        <w:t>discussed</w:t>
-      </w:r>
-      <w:r>
-        <w:t xml:space="preserve"> in </w:t>
-      </w:r>
-      <w:hyperlink r:id="rId45" w:history="1">
-        <w:r>
-          <w:rPr>
-            <w:rStyle w:val="Hyperlink"/>
-          </w:rPr>
-          <w:t>https://www.epa.gov/sites/production/files/2021-04/documents/us-ghg-inventory-2021-annex-3-additional-source-or-sink-categories-part-b.pdf</w:t>
-        </w:r>
-      </w:hyperlink>
-      <w:r>
-        <w:t xml:space="preserve"> </w:t>
-      </w:r>
-    </w:p>
-    <w:p>
-      <w:pPr>
-        <w:ind w:left="720"/>
-      </w:pPr>
-      <w:r>
-        <w:t>USDA Census Ag Atlas Maps</w:t>
-      </w:r>
-      <w:r>
-        <w:t xml:space="preserve"> – used by GEPA v2 for several agricultural datasets </w:t>
-      </w:r>
-      <w:hyperlink r:id="rId46" w:history="1">
-        <w:r>
-          <w:rPr>
-            <w:rStyle w:val="Hyperlink"/>
-          </w:rPr>
-          <w:t>https://www.nass.usda.gov/Publications/AgCensus/2017/Online_Resources/Ag_Atlas_Maps/index.php</w:t>
-        </w:r>
-      </w:hyperlink>
-      <w:r>
-        <w:t xml:space="preserve"> </w:t>
-      </w:r>
-    </w:p>
-    <w:p>
-      <w:pPr>
-        <w:ind w:left="720"/>
-      </w:pPr>
-      <w:r>
-        <w:t xml:space="preserve">USDA CropScape </w:t>
-      </w:r>
-      <w:r>
-        <w:t xml:space="preserve">– used by GEPA v2 for high resolution cropland type </w:t>
-      </w:r>
-      <w:hyperlink r:id="rId47" w:history="1">
-        <w:r>
-          <w:rPr>
-            <w:rStyle w:val="Hyperlink"/>
-          </w:rPr>
-          <w:t>https://nassgeodata.gmu.edu/CropScape/</w:t>
-        </w:r>
-      </w:hyperlink>
-      <w:r>
-        <w:t xml:space="preserve"> </w:t>
-      </w:r>
-    </w:p>
-    <w:p>
-      <w:pPr>
-        <w:ind w:left="720"/>
-      </w:pPr>
-      <w:r>
-        <w:t xml:space="preserve">Enverus </w:t>
-      </w:r>
-      <w:r>
-        <w:t xml:space="preserve">(formerly drillinginfo) </w:t>
-      </w:r>
-      <w:r>
-        <w:t xml:space="preserve">data </w:t>
-      </w:r>
-      <w:r>
-        <w:t xml:space="preserve">– </w:t>
-      </w:r>
-      <w:r>
-        <w:t xml:space="preserve">seems to be a product for sale, though they have university partnerships </w:t>
-      </w:r>
-      <w:hyperlink r:id="rId48" w:history="1">
-        <w:r>
-          <w:rPr>
-            <w:rStyle w:val="Hyperlink"/>
-          </w:rPr>
-          <w:t>https://www.enverus.com/university-partnerships</w:t>
-        </w:r>
-      </w:hyperlink>
-      <w:r>
-        <w:t>.  Used by GEPA v2 for multiple O&amp;G sectors’ activity data.</w:t>
-      </w:r>
-    </w:p>
-    <w:p>
-      <w:pPr>
-        <w:ind w:left="720"/>
-      </w:pPr>
-      <w:r>
-        <w:t xml:space="preserve">Mine safety and health administration – used by GEPA v2 for coal mine locations and some mobile combustion sources.  </w:t>
-      </w:r>
-      <w:hyperlink r:id="rId49" w:history="1">
-        <w:r>
-          <w:rPr>
-            <w:rStyle w:val="Hyperlink"/>
-          </w:rPr>
-          <w:t>https://www.msha.gov/data-and-reports/mine-data-retrieval-system</w:t>
-        </w:r>
-      </w:hyperlink>
-      <w:r>
-        <w:t xml:space="preserve"> </w:t>
-      </w:r>
-    </w:p>
-    <w:p>
-      <w:pPr>
-        <w:ind w:left="720"/>
-      </w:pPr>
-      <w:r>
-        <w:t xml:space="preserve">DOT datasets – used by GEPA v2 for mobile combustion sources.  </w:t>
-      </w:r>
-      <w:hyperlink r:id="rId50" w:history="1">
-        <w:r>
-          <w:rPr>
-            <w:rStyle w:val="Hyperlink"/>
-          </w:rPr>
-          <w:t>https://www.fhwa.dot.gov/policyinformation/statistics/2012/</w:t>
-        </w:r>
-      </w:hyperlink>
-    </w:p>
-    <w:p>
-      <w:pPr>
-        <w:ind w:left="720"/>
-      </w:pPr>
-      <w:r>
-        <w:t xml:space="preserve">National waterway network – used by GEPA v2 for mobile combustion.  </w:t>
-      </w:r>
-      <w:hyperlink r:id="rId51" w:history="1">
-        <w:r>
-          <w:rPr>
-            <w:rStyle w:val="Hyperlink"/>
-          </w:rPr>
-          <w:t>https://data-usdot.opendata.arcgis.com/datasets/usdot::navigable-waterway-network-lines/about</w:t>
-        </w:r>
-      </w:hyperlink>
-      <w:r>
-        <w:t xml:space="preserve"> </w:t>
-      </w:r>
-    </w:p>
-    <w:p>
-      <w:pPr>
+        <w:t xml:space="preserve">New datasets to </w:t>
+      </w:r>
+      <w:proofErr w:type="gramStart"/>
+      <w:r>
         <w:rPr>
           <w:b/>
           <w:bCs/>
         </w:rPr>
-      </w:pPr>
-      <w:r>
+        <w:t>consider</w:t>
+      </w:r>
+      <w:proofErr w:type="gramEnd"/>
+    </w:p>
+    <w:p>
+      <w:pPr>
+        <w:ind w:left="720"/>
+      </w:pPr>
+      <w:r>
+        <w:t xml:space="preserve">FEMA structure data – building occupancy type (industrial, residential, etc.) map for the whole US.  </w:t>
+      </w:r>
+      <w:hyperlink r:id="rId44" w:history="1">
+        <w:r>
+          <w:rPr>
+            <w:rStyle w:val="Hyperlink"/>
+          </w:rPr>
+          <w:t>https://gis-fema.hub.arcgis.com/pages/usa-structures</w:t>
+        </w:r>
+      </w:hyperlink>
+    </w:p>
+    <w:p>
+      <w:pPr>
+        <w:ind w:left="720"/>
+      </w:pPr>
+      <w:r>
+        <w:t xml:space="preserve">Census house heating fuel – one of many census data tables available at national to county levels.  </w:t>
+      </w:r>
+      <w:hyperlink r:id="rId45" w:history="1">
+        <w:r>
+          <w:rPr>
+            <w:rStyle w:val="Hyperlink"/>
+          </w:rPr>
+          <w:t>https://data.census.gov/table/ACSDT5Y2020.B25040?q=B25040</w:t>
+        </w:r>
+      </w:hyperlink>
+    </w:p>
+    <w:p>
+      <w:pPr>
+        <w:ind w:left="720"/>
+        <w:rPr>
+          <w:rStyle w:val="Hyperlink"/>
+        </w:rPr>
+      </w:pPr>
+      <w:r>
+        <w:t xml:space="preserve">EPA FRS database that primarily includes facility information data for pretty much anything of environmental interest.  </w:t>
+      </w:r>
+      <w:hyperlink r:id="rId46" w:history="1">
+        <w:r>
+          <w:rPr>
+            <w:rStyle w:val="Hyperlink"/>
+          </w:rPr>
+          <w:t>https://www.epa.gov/frs</w:t>
+        </w:r>
+      </w:hyperlink>
+    </w:p>
+    <w:p>
+      <w:pPr>
+        <w:ind w:left="720"/>
+      </w:pPr>
+      <w:r>
+        <w:t xml:space="preserve">Waste Business Journal for landfills that Joe mentioned was used in combination with LMOP to scale up emissions beyond GHGRP for the GHGI.  </w:t>
+      </w:r>
+      <w:hyperlink r:id="rId47" w:history="1">
+        <w:r>
+          <w:rPr>
+            <w:rStyle w:val="Hyperlink"/>
+          </w:rPr>
+          <w:t>https://www.wasteinfo.com/diratlas.htm</w:t>
+        </w:r>
+      </w:hyperlink>
+      <w:r>
+        <w:t xml:space="preserve">  </w:t>
+      </w:r>
+      <w:r>
+        <w:t>discussed</w:t>
+      </w:r>
+      <w:r>
+        <w:t xml:space="preserve"> in </w:t>
+      </w:r>
+      <w:hyperlink r:id="rId48" w:history="1">
+        <w:r>
+          <w:rPr>
+            <w:rStyle w:val="Hyperlink"/>
+          </w:rPr>
+          <w:t>https://www.epa.gov/sites/production/files/2021-04/documents/us-ghg-inventory-2021-annex-3-additional-source-or-sink-categories-part-b.pdf</w:t>
+        </w:r>
+      </w:hyperlink>
+      <w:r>
+        <w:t xml:space="preserve"> </w:t>
+      </w:r>
+    </w:p>
+    <w:p>
+      <w:pPr>
+        <w:ind w:left="720"/>
+      </w:pPr>
+      <w:r>
+        <w:t>USDA Census Ag Atlas Maps</w:t>
+      </w:r>
+      <w:r>
+        <w:t xml:space="preserve"> – used by GEPA v2 for several agricultural datasets </w:t>
+      </w:r>
+      <w:hyperlink r:id="rId49" w:history="1">
+        <w:r>
+          <w:rPr>
+            <w:rStyle w:val="Hyperlink"/>
+          </w:rPr>
+          <w:t>https://www.nass.usda.gov/Publications/AgCensus/2017/Online_Resources/Ag_Atlas_Maps/index.php</w:t>
+        </w:r>
+      </w:hyperlink>
+      <w:r>
+        <w:t xml:space="preserve"> </w:t>
+      </w:r>
+    </w:p>
+    <w:p>
+      <w:pPr>
+        <w:ind w:left="720"/>
+      </w:pPr>
+      <w:r>
+        <w:t xml:space="preserve">USDA </w:t>
+      </w:r>
+      <w:proofErr w:type="spellStart"/>
+      <w:r>
+        <w:t>CropScape</w:t>
+      </w:r>
+      <w:proofErr w:type="spellEnd"/>
+      <w:r>
+        <w:t xml:space="preserve"> </w:t>
+      </w:r>
+      <w:r>
+        <w:t xml:space="preserve">– used by GEPA v2 for high resolution cropland type </w:t>
+      </w:r>
+      <w:hyperlink r:id="rId50" w:history="1">
+        <w:r>
+          <w:rPr>
+            <w:rStyle w:val="Hyperlink"/>
+          </w:rPr>
+          <w:t>https://nassgeodata.gmu.edu/CropScape/</w:t>
+        </w:r>
+      </w:hyperlink>
+      <w:r>
+        <w:t xml:space="preserve"> </w:t>
+      </w:r>
+    </w:p>
+    <w:p>
+      <w:pPr>
+        <w:ind w:left="720"/>
+      </w:pPr>
+      <w:proofErr w:type="spellStart"/>
+      <w:r>
+        <w:t>Enverus</w:t>
+      </w:r>
+      <w:proofErr w:type="spellEnd"/>
+      <w:r>
+        <w:t xml:space="preserve"> </w:t>
+      </w:r>
+      <w:r>
+        <w:t xml:space="preserve">(formerly </w:t>
+      </w:r>
+      <w:proofErr w:type="spellStart"/>
+      <w:r>
+        <w:t>drillinginfo</w:t>
+      </w:r>
+      <w:proofErr w:type="spellEnd"/>
+      <w:r>
+        <w:t xml:space="preserve">) </w:t>
+      </w:r>
+      <w:r>
+        <w:t xml:space="preserve">data </w:t>
+      </w:r>
+      <w:r>
+        <w:t xml:space="preserve">– </w:t>
+      </w:r>
+      <w:r>
+        <w:t xml:space="preserve">seems to be a product for sale, though they have university partnerships </w:t>
+      </w:r>
+      <w:hyperlink r:id="rId51" w:history="1">
+        <w:r>
+          <w:rPr>
+            <w:rStyle w:val="Hyperlink"/>
+          </w:rPr>
+          <w:t>https://www.enverus.com/university-partnerships</w:t>
+        </w:r>
+      </w:hyperlink>
+      <w:r>
+        <w:t>.  Used by GEPA v2 for multiple O&amp;G sectors’ activity data.</w:t>
+      </w:r>
+    </w:p>
+    <w:p>
+      <w:pPr>
+        <w:ind w:left="720"/>
+      </w:pPr>
+      <w:r>
+        <w:t xml:space="preserve">Mine safety and health administration – used by GEPA v2 for coal mine locations and some mobile combustion sources.  </w:t>
+      </w:r>
+      <w:hyperlink r:id="rId52" w:history="1">
+        <w:r>
+          <w:rPr>
+            <w:rStyle w:val="Hyperlink"/>
+          </w:rPr>
+          <w:t>https://www.msha.gov/data-and-reports/mine-data-retrieval-system</w:t>
+        </w:r>
+      </w:hyperlink>
+      <w:r>
+        <w:t xml:space="preserve"> </w:t>
+      </w:r>
+    </w:p>
+    <w:p>
+      <w:pPr>
+        <w:ind w:left="720"/>
+      </w:pPr>
+      <w:r>
+        <w:lastRenderedPageBreak/>
+        <w:t xml:space="preserve">DOT datasets – used by GEPA v2 for mobile combustion sources.  </w:t>
+      </w:r>
+      <w:hyperlink r:id="rId53" w:history="1">
+        <w:r>
+          <w:rPr>
+            <w:rStyle w:val="Hyperlink"/>
+          </w:rPr>
+          <w:t>https://www.fhwa.dot.gov/policyinformation/statistics/2012/</w:t>
+        </w:r>
+      </w:hyperlink>
+    </w:p>
+    <w:p>
+      <w:pPr>
+        <w:ind w:left="720"/>
+      </w:pPr>
+      <w:r>
+        <w:t xml:space="preserve">National waterway network – used by GEPA v2 for mobile combustion.  </w:t>
+      </w:r>
+      <w:hyperlink r:id="rId54" w:history="1">
+        <w:r>
+          <w:rPr>
+            <w:rStyle w:val="Hyperlink"/>
+          </w:rPr>
+          <w:t>https://data-usdot.opendata.arcgis.com/datasets/usdot::navigable-waterway-network-lines/about</w:t>
+        </w:r>
+      </w:hyperlink>
+      <w:r>
+        <w:t xml:space="preserve"> </w:t>
+      </w:r>
+    </w:p>
+    <w:p>
+      <w:pPr>
         <w:rPr>
           <w:b/>
           <w:bCs/>
         </w:rPr>
-        <w:t xml:space="preserve">People we </w:t>
-      </w:r>
+      </w:pPr>
       <w:r>
         <w:rPr>
           <w:b/>
           <w:bCs/>
         </w:rPr>
-        <w:t>could</w:t>
+        <w:t xml:space="preserve">People we </w:t>
       </w:r>
       <w:r>
         <w:rPr>
           <w:b/>
           <w:bCs/>
         </w:rPr>
+        <w:t>could</w:t>
+      </w:r>
+      <w:r>
+        <w:rPr>
+          <w:b/>
+          <w:bCs/>
+        </w:rPr>
         <w:t xml:space="preserve"> reach out to</w:t>
       </w:r>
     </w:p>
@@ -1536,8 +2084,13 @@
       <w:pPr>
         <w:ind w:left="720"/>
       </w:pPr>
-      <w:r>
-        <w:t>Of course those on the papers above.</w:t>
+      <w:proofErr w:type="gramStart"/>
+      <w:r>
+        <w:t>Of course</w:t>
+      </w:r>
+      <w:proofErr w:type="gramEnd"/>
+      <w:r>
+        <w:t xml:space="preserve"> those on the papers above.</w:t>
       </w:r>
     </w:p>
     <w:p>
@@ -1548,8 +2101,13 @@
         <w:t>Madison Barney (Lucy Hutyra lab) – emailed Joe about work she was doing on a Boston CH4 inventory</w:t>
       </w:r>
       <w:r>
-        <w:t xml:space="preserve"> – focusing at the time on wetland emissions</w:t>
-      </w:r>
+        <w:t xml:space="preserve"> – focusing at the time on wetland </w:t>
+      </w:r>
+      <w:proofErr w:type="gramStart"/>
+      <w:r>
+        <w:t>emissions</w:t>
+      </w:r>
+      <w:proofErr w:type="gramEnd"/>
     </w:p>
     <w:p>
       <w:pPr>
@@ -1590,11 +2148,16 @@
         <w:ind w:left="720"/>
       </w:pPr>
       <w:r>
-        <w:t>Moore et al from wastewater paper – Roisin said she knows them and can get us in touch for a conv</w:t>
+        <w:t xml:space="preserve">Moore et al from wastewater paper – Roisin said she knows them and can get us in touch for a </w:t>
+      </w:r>
+      <w:proofErr w:type="gramStart"/>
+      <w:r>
+        <w:t>conv</w:t>
       </w:r>
       <w:r>
         <w:t>ersation</w:t>
       </w:r>
+      <w:proofErr w:type="gramEnd"/>
     </w:p>
     <w:p>
       <w:pPr>
@@ -1617,12 +2180,16 @@
         <w:ind w:left="720"/>
       </w:pPr>
       <w:r>
-        <w:lastRenderedPageBreak/>
         <w:t>Maryann Sargent</w:t>
       </w:r>
       <w:r>
-        <w:t xml:space="preserve"> and Steve Wofsy</w:t>
-      </w:r>
+        <w:t xml:space="preserve"> and Steve </w:t>
+      </w:r>
+      <w:proofErr w:type="spellStart"/>
+      <w:r>
+        <w:t>Wofsy</w:t>
+      </w:r>
+      <w:proofErr w:type="spellEnd"/>
     </w:p>
     <w:p>
       <w:pPr>
@@ -1639,7 +2206,7 @@
       <w:r>
         <w:t>Debra Wunch – developed Flame-GTA inventory (</w:t>
       </w:r>
-      <w:hyperlink r:id="rId52" w:history="1">
+      <w:hyperlink r:id="rId55" w:history="1">
         <w:r>
           <w:rPr>
             <w:rStyle w:val="Hyperlink"/>
@@ -1653,7 +2220,7 @@
       <w:r>
         <w:t xml:space="preserve">and has done lots of work on urban CH4 (e.g., </w:t>
       </w:r>
-      <w:hyperlink r:id="rId53" w:history="1">
+      <w:hyperlink r:id="rId56" w:history="1">
         <w:r>
           <w:rPr>
             <w:rStyle w:val="Hyperlink"/>
@@ -1670,8 +2237,13 @@
         <w:ind w:left="720"/>
       </w:pPr>
       <w:r>
-        <w:t>EDF – in general, and especially if we eventually have interest in NG production</w:t>
-      </w:r>
+        <w:t xml:space="preserve">EDF – in general, and especially if we eventually have interest in NG </w:t>
+      </w:r>
+      <w:proofErr w:type="gramStart"/>
+      <w:r>
+        <w:t>production</w:t>
+      </w:r>
+      <w:proofErr w:type="gramEnd"/>
     </w:p>
     <w:p>
       <w:pPr>
@@ -1686,16 +2258,31 @@
         <w:ind w:left="720"/>
       </w:pPr>
       <w:r>
-        <w:t>GRAAPES/NOAA/James Whetstone – already offered whatever support they can provide in terms of bringing about a better final product</w:t>
-      </w:r>
+        <w:t xml:space="preserve">GRAAPES/NOAA/James Whetstone – already offered whatever support they can provide in terms of bringing about a better final </w:t>
+      </w:r>
+      <w:proofErr w:type="gramStart"/>
+      <w:r>
+        <w:t>product</w:t>
+      </w:r>
+      <w:proofErr w:type="gramEnd"/>
     </w:p>
     <w:p>
       <w:pPr>
         <w:ind w:left="720"/>
       </w:pPr>
-      <w:r>
-        <w:t>ConEd or other utilities – we have some tie-ins from the CH4 workshop</w:t>
-      </w:r>
+      <w:proofErr w:type="spellStart"/>
+      <w:r>
+        <w:t>ConEd</w:t>
+      </w:r>
+      <w:proofErr w:type="spellEnd"/>
+      <w:r>
+        <w:t xml:space="preserve"> or other utilities – we have some tie-ins from the CH4 </w:t>
+      </w:r>
+      <w:proofErr w:type="gramStart"/>
+      <w:r>
+        <w:t>workshop</w:t>
+      </w:r>
+      <w:proofErr w:type="gramEnd"/>
     </w:p>
     <w:p>
       <w:pPr>
@@ -1704,7 +2291,7 @@
       <w:r>
         <w:t>Jean Bogner (</w:t>
       </w:r>
-      <w:hyperlink r:id="rId54" w:history="1">
+      <w:hyperlink r:id="rId57" w:history="1">
         <w:r>
           <w:rPr>
             <w:rStyle w:val="Hyperlink"/>
@@ -1724,8 +2311,13 @@
         <w:ind w:left="720"/>
       </w:pPr>
       <w:r>
-        <w:t>Grant Allen – Joe’s old PI has experience with many sectors, including what seems like a lot of work on urban areas and wetlands</w:t>
-      </w:r>
+        <w:t xml:space="preserve">Grant Allen – Joe’s old PI has experience with many sectors, including what seems like a lot of work on urban areas and </w:t>
+      </w:r>
+      <w:proofErr w:type="gramStart"/>
+      <w:r>
+        <w:t>wetlands</w:t>
+      </w:r>
+      <w:proofErr w:type="gramEnd"/>
     </w:p>
     <w:p>
       <w:pPr>

</xml_diff>

<commit_message>
Adding a few papers and mention of CEDS
</commit_message>
<xml_diff>
--- a/Inventory_lit_review.docx
+++ b/Inventory_lit_review.docx
@@ -72,21 +72,7 @@
         <w:rPr>
           <w:rStyle w:val="citationrow"/>
         </w:rPr>
-        <w:t xml:space="preserve">.  Global study that looks at an empirical relationship between waste composition, moisture, and temperature to adjust the waste decay rate used in landfill emission estimates using IPCC methods.  Showed improved comparisons with measurements (though N is small, ~200), though certainly not </w:t>
-      </w:r>
-      <w:proofErr w:type="gramStart"/>
-      <w:r>
-        <w:rPr>
-          <w:rStyle w:val="citationrow"/>
-        </w:rPr>
-        <w:t>a perfect</w:t>
-      </w:r>
-      <w:proofErr w:type="gramEnd"/>
-      <w:r>
-        <w:rPr>
-          <w:rStyle w:val="citationrow"/>
-        </w:rPr>
-        <w:t xml:space="preserve"> agreement with measurements.  A </w:t>
+        <w:t xml:space="preserve">.  Global study that looks at an empirical relationship between waste composition, moisture, and temperature to adjust the waste decay rate used in landfill emission estimates using IPCC methods.  Showed improved comparisons with measurements (though N is small, ~200), though certainly not a perfect agreement with measurements.  A </w:t>
       </w:r>
       <w:proofErr w:type="spellStart"/>
       <w:r>
@@ -676,25 +662,7 @@
           <w:color w:val="auto"/>
           <w:u w:val="none"/>
         </w:rPr>
-        <w:t xml:space="preserve"> from wastewater entirely.  </w:t>
-      </w:r>
-      <w:proofErr w:type="gramStart"/>
-      <w:r>
-        <w:rPr>
-          <w:rStyle w:val="Hyperlink"/>
-          <w:color w:val="auto"/>
-          <w:u w:val="none"/>
-        </w:rPr>
-        <w:t>Mentions</w:t>
-      </w:r>
-      <w:proofErr w:type="gramEnd"/>
-      <w:r>
-        <w:rPr>
-          <w:rStyle w:val="Hyperlink"/>
-          <w:color w:val="auto"/>
-          <w:u w:val="none"/>
-        </w:rPr>
-        <w:t xml:space="preserve"> some relationships with temperature.</w:t>
+        <w:t xml:space="preserve"> from wastewater entirely.  Mentions some relationships with temperature.</w:t>
       </w:r>
     </w:p>
     <w:p>
@@ -750,23 +718,7 @@
         </w:r>
       </w:hyperlink>
       <w:r>
-        <w:t xml:space="preserve"> - 63 plants across US discussing biochemical oxygen demand (BOD) and </w:t>
-      </w:r>
-      <w:proofErr w:type="gramStart"/>
-      <w:r>
-        <w:t>flow based</w:t>
-      </w:r>
-      <w:proofErr w:type="gramEnd"/>
-      <w:r>
-        <w:t xml:space="preserve"> emission factors.  BOD was ~constant with size and flow was </w:t>
-      </w:r>
-      <w:proofErr w:type="gramStart"/>
-      <w:r>
-        <w:t>log-linear</w:t>
-      </w:r>
-      <w:proofErr w:type="gramEnd"/>
-      <w:r>
-        <w:t>.  ~2x IPPC/EPA EF on average.  Also stresses that variability in operations over time and facility to facility are important and make these EF’s more “rough estimates”.  Mentions of diurnal patterns from previous work.</w:t>
+        <w:t xml:space="preserve"> - 63 plants across US discussing biochemical oxygen demand (BOD) and flow based emission factors.  BOD was ~constant with size and flow was log-linear.  ~2x IPPC/EPA EF on average.  Also stresses that variability in operations over time and facility to facility are important and make these EF’s more “rough estimates”.  Mentions of diurnal patterns from previous work.</w:t>
       </w:r>
     </w:p>
     <w:p>
@@ -810,15 +762,7 @@
         </w:r>
       </w:hyperlink>
       <w:r>
-        <w:t xml:space="preserve">.  Unread.  Italy-focused article that clearly outlines </w:t>
-      </w:r>
-      <w:proofErr w:type="gramStart"/>
-      <w:r>
-        <w:t>EF’s</w:t>
-      </w:r>
-      <w:proofErr w:type="gramEnd"/>
-      <w:r>
-        <w:t xml:space="preserve"> for each type of wastewater treatment.  Could easily be applied – if we have such detailed data on the type of treatment at each facility (not sure if we do).</w:t>
+        <w:t>.  Unread.  Italy-focused article that clearly outlines EF’s for each type of wastewater treatment.  Could easily be applied – if we have such detailed data on the type of treatment at each facility (not sure if we do).</w:t>
       </w:r>
     </w:p>
     <w:p>
@@ -888,9 +832,28 @@
         <w:ind w:left="2160"/>
       </w:pPr>
       <w:r>
+        <w:t xml:space="preserve">LA – He et al., 2019, </w:t>
+      </w:r>
+      <w:hyperlink r:id="rId22" w:history="1">
+        <w:r>
+          <w:rPr>
+            <w:rStyle w:val="Hyperlink"/>
+          </w:rPr>
+          <w:t>https://doi.org/10.1029/2019GL083400</w:t>
+        </w:r>
+      </w:hyperlink>
+      <w:r>
+        <w:t>.  Unread.  Seasonality is linear (R2=0.58), slope = 0.014.  Intercept of 22.92.</w:t>
+      </w:r>
+    </w:p>
+    <w:p>
+      <w:pPr>
+        <w:ind w:left="2160"/>
+      </w:pPr>
+      <w:r>
         <w:t xml:space="preserve">DC – Karion et al., 2023, </w:t>
       </w:r>
-      <w:hyperlink r:id="rId22" w:history="1">
+      <w:hyperlink r:id="rId23" w:history="1">
         <w:r>
           <w:rPr>
             <w:rStyle w:val="Hyperlink"/>
@@ -909,7 +872,7 @@
       <w:r>
         <w:t xml:space="preserve">Baltimore – Karion et al., 2023, </w:t>
       </w:r>
-      <w:hyperlink r:id="rId23" w:history="1">
+      <w:hyperlink r:id="rId24" w:history="1">
         <w:r>
           <w:rPr>
             <w:rStyle w:val="Hyperlink"/>
@@ -931,7 +894,7 @@
       <w:r>
         <w:t xml:space="preserve"> </w:t>
       </w:r>
-      <w:hyperlink r:id="rId24" w:history="1">
+      <w:hyperlink r:id="rId25" w:history="1">
         <w:r>
           <w:rPr>
             <w:rStyle w:val="Hyperlink"/>
@@ -950,7 +913,7 @@
       <w:r>
         <w:t xml:space="preserve">EST 2024, </w:t>
       </w:r>
-      <w:hyperlink r:id="rId25" w:history="1">
+      <w:hyperlink r:id="rId26" w:history="1">
         <w:r>
           <w:rPr>
             <w:rStyle w:val="Hyperlink"/>
@@ -962,15 +925,7 @@
         <w:t>.  Unread F</w:t>
       </w:r>
       <w:r>
-        <w:t xml:space="preserve">elix Vogel et al., using </w:t>
-      </w:r>
-      <w:proofErr w:type="gramStart"/>
-      <w:r>
-        <w:t>vehicle based</w:t>
-      </w:r>
-      <w:proofErr w:type="gramEnd"/>
-      <w:r>
-        <w:t xml:space="preserve"> measurements to understand NG leaks in urban centers.  Could provide some useful information beyond previous papers.</w:t>
+        <w:t>elix Vogel et al., using vehicle based measurements to understand NG leaks in urban centers.  Could provide some useful information beyond previous papers.</w:t>
       </w:r>
     </w:p>
     <w:p>
@@ -980,7 +935,7 @@
       <w:r>
         <w:t xml:space="preserve">EST 2024, </w:t>
       </w:r>
-      <w:hyperlink r:id="rId26" w:history="1">
+      <w:hyperlink r:id="rId27" w:history="1">
         <w:r>
           <w:rPr>
             <w:rStyle w:val="Hyperlink"/>
@@ -1005,7 +960,7 @@
       <w:r>
         <w:t xml:space="preserve">EST 2021, </w:t>
       </w:r>
-      <w:hyperlink r:id="rId27" w:history="1">
+      <w:hyperlink r:id="rId28" w:history="1">
         <w:r>
           <w:rPr>
             <w:rStyle w:val="Hyperlink"/>
@@ -1027,6 +982,44 @@
     </w:p>
     <w:p>
       <w:pPr>
+        <w:ind w:left="1440"/>
+      </w:pPr>
+      <w:r>
+        <w:t xml:space="preserve">AMT 2024, </w:t>
+      </w:r>
+      <w:hyperlink r:id="rId29" w:history="1">
+        <w:r>
+          <w:rPr>
+            <w:rStyle w:val="Hyperlink"/>
+          </w:rPr>
+          <w:t>https://doi.org/10.5194/egusphere-2024-2129</w:t>
+        </w:r>
+      </w:hyperlink>
+      <w:r>
+        <w:t>.  Unread Anna paper looking at whole-house emissions.  Seemed more methods focused, less directly applicable results.</w:t>
+      </w:r>
+    </w:p>
+    <w:p>
+      <w:pPr>
+        <w:ind w:left="1440"/>
+      </w:pPr>
+      <w:r>
+        <w:t xml:space="preserve">PLOS One 2023, </w:t>
+      </w:r>
+      <w:hyperlink r:id="rId30" w:history="1">
+        <w:r>
+          <w:rPr>
+            <w:rStyle w:val="Hyperlink"/>
+          </w:rPr>
+          <w:t>https://doi.org/10.1371/journal.pone.0295055</w:t>
+        </w:r>
+      </w:hyperlink>
+      <w:r>
+        <w:t xml:space="preserve">.  Unread Nicholas et al., paper looking at 20 Boston whole-home CH4 emissions.  0.4 – 10.3 g/day with mean of 2.8 g/day.  </w:t>
+      </w:r>
+    </w:p>
+    <w:p>
+      <w:pPr>
         <w:ind w:left="720"/>
       </w:pPr>
       <w:r>
@@ -1043,7 +1036,7 @@
       <w:r>
         <w:t xml:space="preserve">PLOS one – 2023 </w:t>
       </w:r>
-      <w:hyperlink r:id="rId28" w:history="1">
+      <w:hyperlink r:id="rId31" w:history="1">
         <w:r>
           <w:rPr>
             <w:rStyle w:val="Hyperlink"/>
@@ -1061,15 +1054,7 @@
         <w:t>1/3 produced measurable CH4 (all produced N2O too).  Used to build EFs</w:t>
       </w:r>
       <w:r>
-        <w:t xml:space="preserve"> – older (&gt;30) individuals emitted slightly </w:t>
-      </w:r>
-      <w:proofErr w:type="gramStart"/>
-      <w:r>
-        <w:t>more</w:t>
-      </w:r>
-      <w:proofErr w:type="gramEnd"/>
-      <w:r>
-        <w:t xml:space="preserve"> and women were more likely to emit</w:t>
+        <w:t xml:space="preserve"> – older (&gt;30) individuals emitted slightly more and women were more likely to emit</w:t>
       </w:r>
       <w:r>
         <w:t>.  Specific to UK</w:t>
@@ -1096,21 +1081,14 @@
         <w:t xml:space="preserve">their </w:t>
       </w:r>
       <w:r>
+        <w:lastRenderedPageBreak/>
         <w:t>table 2)</w:t>
       </w:r>
       <w:r>
         <w:t>.</w:t>
       </w:r>
       <w:r>
-        <w:t xml:space="preserve">  They state “if the greater London area were a managed grassland, soil emissions of CH4 would be equivalent to that of human breath in the same area” – so emissions are small (0.05% of national inventory).  </w:t>
-      </w:r>
-      <w:proofErr w:type="gramStart"/>
-      <w:r>
-        <w:t>But,</w:t>
-      </w:r>
-      <w:proofErr w:type="gramEnd"/>
-      <w:r>
-        <w:t xml:space="preserve"> census data is easily available – so it wouldn’t be a hard one to add.  </w:t>
+        <w:t xml:space="preserve">  They state “if the greater London area were a managed grassland, soil emissions of CH4 would be equivalent to that of human breath in the same area” – so emissions are small (0.05% of national inventory).  But, census data is easily available – so it wouldn’t be a hard one to add.  </w:t>
       </w:r>
       <w:r>
         <w:t>There are s</w:t>
@@ -1119,26 +1097,10 @@
         <w:t xml:space="preserve">ome other </w:t>
       </w:r>
       <w:r>
-        <w:t xml:space="preserve">relevant </w:t>
-      </w:r>
-      <w:proofErr w:type="gramStart"/>
-      <w:r>
-        <w:t>work</w:t>
-      </w:r>
-      <w:proofErr w:type="gramEnd"/>
-      <w:r>
-        <w:t xml:space="preserve"> in their citations</w:t>
-      </w:r>
-      <w:r>
-        <w:t xml:space="preserve">, though they also seem to be </w:t>
-      </w:r>
-      <w:proofErr w:type="gramStart"/>
-      <w:r>
-        <w:t>limited</w:t>
-      </w:r>
-      <w:proofErr w:type="gramEnd"/>
-      <w:r>
-        <w:t xml:space="preserve"> N people or regions.</w:t>
+        <w:t>relevant work in their citations</w:t>
+      </w:r>
+      <w:r>
+        <w:t>, though they also seem to be limited N people or regions.</w:t>
       </w:r>
     </w:p>
     <w:p>
@@ -1160,7 +1122,7 @@
         <w:tab/>
         <w:t xml:space="preserve">RECAPP2 – </w:t>
       </w:r>
-      <w:hyperlink r:id="rId29" w:history="1">
+      <w:hyperlink r:id="rId32" w:history="1">
         <w:r>
           <w:rPr>
             <w:rStyle w:val="Hyperlink"/>
@@ -1194,7 +1156,6 @@
         <w:ind w:left="1440"/>
       </w:pPr>
       <w:r>
-        <w:lastRenderedPageBreak/>
         <w:t xml:space="preserve">McNicol et al., 2023 – </w:t>
       </w:r>
       <w:r>
@@ -1203,7 +1164,7 @@
       <w:r>
         <w:t xml:space="preserve">AGU Advances </w:t>
       </w:r>
-      <w:hyperlink r:id="rId30" w:history="1">
+      <w:hyperlink r:id="rId33" w:history="1">
         <w:r>
           <w:rPr>
             <w:rStyle w:val="Hyperlink"/>
@@ -1222,7 +1183,7 @@
       <w:r>
         <w:t xml:space="preserve">East et al., 2024 – Unread GRL </w:t>
       </w:r>
-      <w:hyperlink r:id="rId31" w:history="1">
+      <w:hyperlink r:id="rId34" w:history="1">
         <w:r>
           <w:rPr>
             <w:rStyle w:val="Hyperlink"/>
@@ -1289,7 +1250,7 @@
       <w:r>
         <w:t xml:space="preserve">Tiegs et al., 2024 – Unread Science </w:t>
       </w:r>
-      <w:hyperlink r:id="rId32" w:history="1">
+      <w:hyperlink r:id="rId35" w:history="1">
         <w:r>
           <w:rPr>
             <w:rStyle w:val="Hyperlink"/>
@@ -1308,7 +1269,7 @@
       <w:r>
         <w:t xml:space="preserve">Cao et al., 2024 – Unread Environmental Pollution </w:t>
       </w:r>
-      <w:hyperlink r:id="rId33" w:history="1">
+      <w:hyperlink r:id="rId36" w:history="1">
         <w:r>
           <w:rPr>
             <w:rStyle w:val="Hyperlink"/>
@@ -1344,7 +1305,7 @@
       <w:r>
         <w:t xml:space="preserve">UK – Boothroyd et al., 2018, </w:t>
       </w:r>
-      <w:hyperlink r:id="rId34" w:history="1">
+      <w:hyperlink r:id="rId37" w:history="1">
         <w:r>
           <w:rPr>
             <w:rStyle w:val="Hyperlink"/>
@@ -1429,7 +1390,7 @@
         </w:rPr>
         <w:t xml:space="preserve">Omara et al., (many familiar Harvard and EDF folks) 2023 – ESD </w:t>
       </w:r>
-      <w:hyperlink r:id="rId35" w:history="1">
+      <w:hyperlink r:id="rId38" w:history="1">
         <w:r>
           <w:rPr>
             <w:rStyle w:val="Hyperlink"/>
@@ -1484,7 +1445,7 @@
         </w:rPr>
         <w:t>Unread Omara et al., (</w:t>
       </w:r>
-      <w:hyperlink r:id="rId36" w:history="1">
+      <w:hyperlink r:id="rId39" w:history="1">
         <w:r>
           <w:rPr>
             <w:rStyle w:val="Hyperlink"/>
@@ -1509,9 +1470,10 @@
         <w:ind w:left="1440"/>
       </w:pPr>
       <w:r>
+        <w:lastRenderedPageBreak/>
         <w:t xml:space="preserve">Riddick et al., Atmosphere – 2024 </w:t>
       </w:r>
-      <w:hyperlink r:id="rId37" w:history="1">
+      <w:hyperlink r:id="rId40" w:history="1">
         <w:r>
           <w:rPr>
             <w:rStyle w:val="Hyperlink"/>
@@ -1536,7 +1498,7 @@
       <w:r>
         <w:t xml:space="preserve">Conrad et al., Communications Earth and Environment – 2023 </w:t>
       </w:r>
-      <w:hyperlink r:id="rId38" w:history="1">
+      <w:hyperlink r:id="rId41" w:history="1">
         <w:r>
           <w:rPr>
             <w:rStyle w:val="Hyperlink"/>
@@ -1559,10 +1521,9 @@
         <w:ind w:left="1440"/>
       </w:pPr>
       <w:r>
-        <w:lastRenderedPageBreak/>
         <w:t xml:space="preserve">GFEI inventory – Scarpelli et al., ACP 2022 </w:t>
       </w:r>
-      <w:hyperlink r:id="rId39" w:history="1">
+      <w:hyperlink r:id="rId42" w:history="1">
         <w:r>
           <w:rPr>
             <w:rStyle w:val="Hyperlink"/>
@@ -1590,7 +1551,7 @@
       <w:r>
         <w:t xml:space="preserve">Fiddler et al., JGR Atmospheres – 2024 </w:t>
       </w:r>
-      <w:hyperlink r:id="rId40" w:history="1">
+      <w:hyperlink r:id="rId43" w:history="1">
         <w:r>
           <w:rPr>
             <w:rStyle w:val="Hyperlink"/>
@@ -1605,29 +1566,13 @@
         <w:t xml:space="preserve">Unread </w:t>
       </w:r>
       <w:r>
-        <w:t xml:space="preserve">FIREX – AQ emission factors – including one for CH4.  I’m not sure how well the underlying activity data can be accessed, but </w:t>
-      </w:r>
-      <w:proofErr w:type="gramStart"/>
-      <w:r>
-        <w:t>worth</w:t>
-      </w:r>
-      <w:proofErr w:type="gramEnd"/>
-      <w:r>
-        <w:t xml:space="preserve"> looking at if we consider this sector.</w:t>
+        <w:t>FIREX – AQ emission factors – including one for CH4.  I’m not sure how well the underlying activity data can be accessed, but worth looking at if we consider this sector.</w:t>
       </w:r>
     </w:p>
     <w:p>
       <w:r>
         <w:tab/>
-        <w:t xml:space="preserve">Ag (priority = low, complexity </w:t>
-      </w:r>
-      <w:proofErr w:type="gramStart"/>
-      <w:r>
-        <w:t>= ?</w:t>
-      </w:r>
-      <w:proofErr w:type="gramEnd"/>
-      <w:r>
-        <w:t>)</w:t>
+        <w:t>Ag (priority = low, complexity = ?)</w:t>
       </w:r>
     </w:p>
     <w:p>
@@ -1652,7 +1597,7 @@
       <w:r>
         <w:t xml:space="preserve">sectoral optimization in Colorado </w:t>
       </w:r>
-      <w:hyperlink r:id="rId41" w:history="1">
+      <w:hyperlink r:id="rId44" w:history="1">
         <w:r>
           <w:rPr>
             <w:rStyle w:val="Hyperlink"/>
@@ -1701,7 +1646,7 @@
         </w:rPr>
         <w:t xml:space="preserve"> or 0.238 t/ha/yr.  </w:t>
       </w:r>
-      <w:hyperlink r:id="rId42" w:history="1">
+      <w:hyperlink r:id="rId45" w:history="1">
         <w:r>
           <w:rPr>
             <w:rStyle w:val="Hyperlink"/>
@@ -1746,9 +1691,13 @@
           <w:color w:val="auto"/>
           <w:u w:val="none"/>
         </w:rPr>
-        <w:t xml:space="preserve"> (priority = low, complexity </w:t>
-      </w:r>
-      <w:proofErr w:type="gramStart"/>
+        <w:t xml:space="preserve"> (priority = low, complexity = ?)</w:t>
+      </w:r>
+    </w:p>
+    <w:p>
+      <w:pPr>
+        <w:ind w:left="1440"/>
+      </w:pPr>
       <w:r>
         <w:rPr>
           <w:rStyle w:val="Hyperlink"/>
@@ -1756,9 +1705,8 @@
           <w:color w:val="auto"/>
           <w:u w:val="none"/>
         </w:rPr>
-        <w:t>= ?</w:t>
-      </w:r>
-      <w:proofErr w:type="gramEnd"/>
+        <w:t xml:space="preserve">Unread </w:t>
+      </w:r>
       <w:r>
         <w:rPr>
           <w:rStyle w:val="Hyperlink"/>
@@ -1766,32 +1714,9 @@
           <w:color w:val="auto"/>
           <w:u w:val="none"/>
         </w:rPr>
-        <w:t>)</w:t>
-      </w:r>
-    </w:p>
-    <w:p>
-      <w:pPr>
-        <w:ind w:left="1440"/>
-      </w:pPr>
-      <w:r>
-        <w:rPr>
-          <w:rStyle w:val="Hyperlink"/>
-          <w:rFonts w:ascii="Times New Roman" w:eastAsia="Times New Roman" w:hAnsi="Times New Roman" w:cs="Times New Roman"/>
-          <w:color w:val="auto"/>
-          <w:u w:val="none"/>
-        </w:rPr>
-        <w:t xml:space="preserve">Unread </w:t>
-      </w:r>
-      <w:r>
-        <w:rPr>
-          <w:rStyle w:val="Hyperlink"/>
-          <w:rFonts w:ascii="Times New Roman" w:eastAsia="Times New Roman" w:hAnsi="Times New Roman" w:cs="Times New Roman"/>
-          <w:color w:val="auto"/>
-          <w:u w:val="none"/>
-        </w:rPr>
         <w:t xml:space="preserve">2024 Nature Chemical Engineering global paper using lifecycle modeling to estimate lifetime emissions from cradle to gate.  Some aspects/methods and data sets could be of value, though we’d want point emissions, not to assign lifecycle emissions at the point of production.  </w:t>
       </w:r>
-      <w:hyperlink r:id="rId43" w:history="1">
+      <w:hyperlink r:id="rId46" w:history="1">
         <w:r>
           <w:rPr>
             <w:rStyle w:val="Hyperlink"/>
@@ -1826,7 +1751,13 @@
         <w:ind w:firstLine="720"/>
       </w:pPr>
       <w:r>
-        <w:t>Sargent, Mckain, Karion, Pitt, Zeng (maybe), GEPA, EDGAR, Scarpelli, Lamb, GTA-flame</w:t>
+        <w:t xml:space="preserve">Sargent, Mckain, Karion, Pitt, Zeng (maybe), GEPA, EDGAR, </w:t>
+      </w:r>
+      <w:r>
+        <w:t xml:space="preserve">CEDS, </w:t>
+      </w:r>
+      <w:r>
+        <w:t>Scarpelli, Lamb, GTA-flame</w:t>
       </w:r>
     </w:p>
     <w:p>
@@ -1839,7 +1770,7 @@
       <w:r>
         <w:t xml:space="preserve">Toronto (CA) - </w:t>
       </w:r>
-      <w:hyperlink r:id="rId44" w:history="1">
+      <w:hyperlink r:id="rId47" w:history="1">
         <w:r>
           <w:rPr>
             <w:rStyle w:val="Hyperlink"/>
@@ -1860,7 +1791,7 @@
         </w:rPr>
         <w:t xml:space="preserve">Scarpelli Canada GEPA – </w:t>
       </w:r>
-      <w:hyperlink r:id="rId45" w:history="1">
+      <w:hyperlink r:id="rId48" w:history="1">
         <w:r>
           <w:rPr>
             <w:rStyle w:val="Hyperlink"/>
@@ -1879,7 +1810,7 @@
       <w:r>
         <w:t xml:space="preserve">New to me, but Climate TRACE – global (national for some, facility level for others).  Seems to be primarily built from models relying on machine learning + measurements, but very few publications (much more policy-focused, Al Gore sponsored).  </w:t>
       </w:r>
-      <w:hyperlink r:id="rId46" w:history="1">
+      <w:hyperlink r:id="rId49" w:history="1">
         <w:r>
           <w:rPr>
             <w:rStyle w:val="Hyperlink"/>
@@ -1890,7 +1821,7 @@
       <w:r>
         <w:t xml:space="preserve">.  </w:t>
       </w:r>
-      <w:hyperlink r:id="rId47" w:history="1">
+      <w:hyperlink r:id="rId50" w:history="1">
         <w:r>
           <w:rPr>
             <w:rStyle w:val="Hyperlink"/>
@@ -1914,7 +1845,7 @@
           <w:b/>
           <w:bCs/>
         </w:rPr>
-        <w:t>New datasets to consider</w:t>
+        <w:t>Broader</w:t>
       </w:r>
     </w:p>
     <w:p>
@@ -1922,237 +1853,22 @@
         <w:ind w:left="720"/>
       </w:pPr>
       <w:r>
-        <w:t xml:space="preserve">FEMA structure data – building occupancy type (industrial, residential, etc.) map for the whole US.  </w:t>
-      </w:r>
-      <w:hyperlink r:id="rId48" w:history="1">
-        <w:r>
-          <w:rPr>
-            <w:rStyle w:val="Hyperlink"/>
-          </w:rPr>
-          <w:t>https://gis-fema.hub.arcgis.com/pages/usa-structures</w:t>
-        </w:r>
-      </w:hyperlink>
-    </w:p>
-    <w:p>
-      <w:pPr>
-        <w:ind w:left="720"/>
-      </w:pPr>
-      <w:r>
-        <w:t xml:space="preserve">Census house heating fuel – one of many census data tables available at national to county levels.  </w:t>
-      </w:r>
-      <w:hyperlink r:id="rId49" w:history="1">
-        <w:r>
-          <w:rPr>
-            <w:rStyle w:val="Hyperlink"/>
-          </w:rPr>
-          <w:t>https://data.census.gov/table/ACSDT5Y2020.B25040?q=B25040</w:t>
-        </w:r>
-      </w:hyperlink>
-    </w:p>
-    <w:p>
-      <w:pPr>
-        <w:ind w:left="720"/>
-        <w:rPr>
-          <w:rStyle w:val="Hyperlink"/>
-        </w:rPr>
-      </w:pPr>
-      <w:r>
-        <w:t xml:space="preserve">EPA FRS database that primarily includes facility information data for pretty much anything of environmental interest.  </w:t>
-      </w:r>
-      <w:hyperlink r:id="rId50" w:history="1">
-        <w:r>
-          <w:rPr>
-            <w:rStyle w:val="Hyperlink"/>
-          </w:rPr>
-          <w:t>https://www.epa.gov/frs</w:t>
-        </w:r>
-      </w:hyperlink>
-    </w:p>
-    <w:p>
-      <w:pPr>
-        <w:ind w:left="720"/>
-      </w:pPr>
-      <w:r>
-        <w:t xml:space="preserve">Waste Business Journal for landfills that Joe mentioned was used in combination with LMOP to scale up emissions beyond GHGRP for the GHGI.  </w:t>
+        <w:t>Rosentreter et al. (</w:t>
       </w:r>
       <w:hyperlink r:id="rId51" w:history="1">
         <w:r>
           <w:rPr>
             <w:rStyle w:val="Hyperlink"/>
           </w:rPr>
-          <w:t>https://www.wasteinfo.com/diratlas.htm</w:t>
-        </w:r>
-      </w:hyperlink>
-      <w:r>
-        <w:t xml:space="preserve">  </w:t>
+          <w:t>https://doi.org/10.1029/2023EF004234</w:t>
+        </w:r>
+      </w:hyperlink>
+      <w:r>
+        <w:t xml:space="preserve">).  Expert opinion survey of the biggest uncertainties/concerns in global budgets.  More likely useful for the paper to have clear targets </w:t>
       </w:r>
       <w:r>
         <w:lastRenderedPageBreak/>
-        <w:t>discussed</w:t>
-      </w:r>
-      <w:r>
-        <w:t xml:space="preserve"> in </w:t>
-      </w:r>
-      <w:hyperlink r:id="rId52" w:history="1">
-        <w:r>
-          <w:rPr>
-            <w:rStyle w:val="Hyperlink"/>
-          </w:rPr>
-          <w:t>https://www.epa.gov/sites/production/files/2021-04/documents/us-ghg-inventory-2021-annex-3-additional-source-or-sink-categories-part-b.pdf</w:t>
-        </w:r>
-      </w:hyperlink>
-      <w:r>
-        <w:t xml:space="preserve"> </w:t>
-      </w:r>
-    </w:p>
-    <w:p>
-      <w:pPr>
-        <w:ind w:left="720"/>
-      </w:pPr>
-      <w:r>
-        <w:t>USDA Census Ag Atlas Maps</w:t>
-      </w:r>
-      <w:r>
-        <w:t xml:space="preserve"> – used by GEPA v2 for several agricultural datasets </w:t>
-      </w:r>
-      <w:hyperlink r:id="rId53" w:history="1">
-        <w:r>
-          <w:rPr>
-            <w:rStyle w:val="Hyperlink"/>
-          </w:rPr>
-          <w:t>https://www.nass.usda.gov/Publications/AgCensus/2017/Online_Resources/Ag_Atlas_Maps/index.php</w:t>
-        </w:r>
-      </w:hyperlink>
-      <w:r>
-        <w:t xml:space="preserve"> </w:t>
-      </w:r>
-    </w:p>
-    <w:p>
-      <w:pPr>
-        <w:ind w:left="720"/>
-      </w:pPr>
-      <w:r>
-        <w:t xml:space="preserve">USDA </w:t>
-      </w:r>
-      <w:proofErr w:type="spellStart"/>
-      <w:r>
-        <w:t>CropScape</w:t>
-      </w:r>
-      <w:proofErr w:type="spellEnd"/>
-      <w:r>
-        <w:t xml:space="preserve"> </w:t>
-      </w:r>
-      <w:r>
-        <w:t xml:space="preserve">– used by GEPA v2 for high resolution cropland type </w:t>
-      </w:r>
-      <w:hyperlink r:id="rId54" w:history="1">
-        <w:r>
-          <w:rPr>
-            <w:rStyle w:val="Hyperlink"/>
-          </w:rPr>
-          <w:t>https://nassgeodata.gmu.edu/CropScape/</w:t>
-        </w:r>
-      </w:hyperlink>
-      <w:r>
-        <w:t xml:space="preserve"> </w:t>
-      </w:r>
-    </w:p>
-    <w:p>
-      <w:pPr>
-        <w:ind w:left="720"/>
-      </w:pPr>
-      <w:proofErr w:type="spellStart"/>
-      <w:r>
-        <w:t>Enverus</w:t>
-      </w:r>
-      <w:proofErr w:type="spellEnd"/>
-      <w:r>
-        <w:t xml:space="preserve"> </w:t>
-      </w:r>
-      <w:r>
-        <w:t xml:space="preserve">(formerly </w:t>
-      </w:r>
-      <w:proofErr w:type="spellStart"/>
-      <w:r>
-        <w:t>drillinginfo</w:t>
-      </w:r>
-      <w:proofErr w:type="spellEnd"/>
-      <w:r>
-        <w:t xml:space="preserve">) </w:t>
-      </w:r>
-      <w:r>
-        <w:t xml:space="preserve">data </w:t>
-      </w:r>
-      <w:r>
-        <w:t xml:space="preserve">– </w:t>
-      </w:r>
-      <w:r>
-        <w:t xml:space="preserve">seems to be a product for sale, though they have university partnerships </w:t>
-      </w:r>
-      <w:hyperlink r:id="rId55" w:history="1">
-        <w:r>
-          <w:rPr>
-            <w:rStyle w:val="Hyperlink"/>
-          </w:rPr>
-          <w:t>https://www.enverus.com/university-partnerships</w:t>
-        </w:r>
-      </w:hyperlink>
-      <w:r>
-        <w:t>.  Used by GEPA v2 for multiple O&amp;G sectors’ activity data.</w:t>
-      </w:r>
-    </w:p>
-    <w:p>
-      <w:pPr>
-        <w:ind w:left="720"/>
-      </w:pPr>
-      <w:r>
-        <w:t xml:space="preserve">Mine safety and health administration – used by GEPA v2 for coal mine locations and some mobile combustion sources.  </w:t>
-      </w:r>
-      <w:hyperlink r:id="rId56" w:history="1">
-        <w:r>
-          <w:rPr>
-            <w:rStyle w:val="Hyperlink"/>
-          </w:rPr>
-          <w:t>https://www.msha.gov/data-and-reports/mine-data-retrieval-system</w:t>
-        </w:r>
-      </w:hyperlink>
-      <w:r>
-        <w:t xml:space="preserve"> </w:t>
-      </w:r>
-    </w:p>
-    <w:p>
-      <w:pPr>
-        <w:ind w:left="720"/>
-      </w:pPr>
-      <w:r>
-        <w:t xml:space="preserve">DOT datasets – used by GEPA v2 for mobile combustion sources.  </w:t>
-      </w:r>
-      <w:hyperlink r:id="rId57" w:history="1">
-        <w:r>
-          <w:rPr>
-            <w:rStyle w:val="Hyperlink"/>
-          </w:rPr>
-          <w:t>https://www.fhwa.dot.gov/policyinformation/statistics/2012/</w:t>
-        </w:r>
-      </w:hyperlink>
-    </w:p>
-    <w:p>
-      <w:pPr>
-        <w:ind w:left="720"/>
-      </w:pPr>
-      <w:r>
-        <w:t xml:space="preserve">National waterway network – used by GEPA v2 for mobile combustion.  </w:t>
-      </w:r>
-      <w:hyperlink r:id="rId58" w:history="1">
-        <w:r>
-          <w:rPr>
-            <w:rStyle w:val="Hyperlink"/>
-          </w:rPr>
-          <w:t>https://data-usdot.opendata.arcgis.com/datasets/usdot::navigable-waterway-network-lines/about</w:t>
-        </w:r>
-      </w:hyperlink>
-      <w:r>
-        <w:t xml:space="preserve"> </w:t>
+        <w:t>for what this helps us better address, especially given it is in part a tool to test approaches, not just another inventory.</w:t>
       </w:r>
     </w:p>
     <w:p>
@@ -2167,20 +1883,272 @@
           <w:b/>
           <w:bCs/>
         </w:rPr>
-        <w:t xml:space="preserve">People we </w:t>
-      </w:r>
-      <w:r>
+        <w:t>New datasets to consider</w:t>
+      </w:r>
+    </w:p>
+    <w:p>
+      <w:pPr>
+        <w:ind w:left="720"/>
+      </w:pPr>
+      <w:r>
+        <w:t xml:space="preserve">FEMA structure data – building occupancy type (industrial, residential, etc.) map for the whole US.  </w:t>
+      </w:r>
+      <w:hyperlink r:id="rId52" w:history="1">
+        <w:r>
+          <w:rPr>
+            <w:rStyle w:val="Hyperlink"/>
+          </w:rPr>
+          <w:t>https://gis-fema.hub.arcgis.com/pages/usa-structures</w:t>
+        </w:r>
+      </w:hyperlink>
+    </w:p>
+    <w:p>
+      <w:pPr>
+        <w:ind w:left="720"/>
+      </w:pPr>
+      <w:r>
+        <w:t xml:space="preserve">Census house heating fuel – one of many census data tables available at national to county levels.  </w:t>
+      </w:r>
+      <w:hyperlink r:id="rId53" w:history="1">
+        <w:r>
+          <w:rPr>
+            <w:rStyle w:val="Hyperlink"/>
+          </w:rPr>
+          <w:t>https://data.census.gov/table/ACSDT5Y2020.B25040?q=B25040</w:t>
+        </w:r>
+      </w:hyperlink>
+    </w:p>
+    <w:p>
+      <w:pPr>
+        <w:ind w:left="720"/>
+        <w:rPr>
+          <w:rStyle w:val="Hyperlink"/>
+        </w:rPr>
+      </w:pPr>
+      <w:r>
+        <w:t xml:space="preserve">EPA FRS database that primarily includes facility information data for pretty much anything of environmental interest.  </w:t>
+      </w:r>
+      <w:hyperlink r:id="rId54" w:history="1">
+        <w:r>
+          <w:rPr>
+            <w:rStyle w:val="Hyperlink"/>
+          </w:rPr>
+          <w:t>https://www.epa.gov/frs</w:t>
+        </w:r>
+      </w:hyperlink>
+    </w:p>
+    <w:p>
+      <w:pPr>
+        <w:ind w:left="720"/>
+      </w:pPr>
+      <w:r>
+        <w:t xml:space="preserve">Waste Business Journal for landfills that Joe mentioned was used in combination with LMOP to scale up emissions beyond GHGRP for the GHGI.  </w:t>
+      </w:r>
+      <w:hyperlink r:id="rId55" w:history="1">
+        <w:r>
+          <w:rPr>
+            <w:rStyle w:val="Hyperlink"/>
+          </w:rPr>
+          <w:t>https://www.wasteinfo.com/diratlas.htm</w:t>
+        </w:r>
+      </w:hyperlink>
+      <w:r>
+        <w:t xml:space="preserve">  </w:t>
+      </w:r>
+      <w:r>
+        <w:t>discussed</w:t>
+      </w:r>
+      <w:r>
+        <w:t xml:space="preserve"> in </w:t>
+      </w:r>
+      <w:hyperlink r:id="rId56" w:history="1">
+        <w:r>
+          <w:rPr>
+            <w:rStyle w:val="Hyperlink"/>
+          </w:rPr>
+          <w:t>https://www.epa.gov/sites/production/files/2021-04/documents/us-ghg-inventory-2021-annex-3-additional-source-or-sink-categories-part-b.pdf</w:t>
+        </w:r>
+      </w:hyperlink>
+      <w:r>
+        <w:t xml:space="preserve"> </w:t>
+      </w:r>
+    </w:p>
+    <w:p>
+      <w:pPr>
+        <w:ind w:left="720"/>
+      </w:pPr>
+      <w:r>
+        <w:t>USDA Census Ag Atlas Maps</w:t>
+      </w:r>
+      <w:r>
+        <w:t xml:space="preserve"> – used by GEPA v2 for several agricultural datasets </w:t>
+      </w:r>
+      <w:hyperlink r:id="rId57" w:history="1">
+        <w:r>
+          <w:rPr>
+            <w:rStyle w:val="Hyperlink"/>
+          </w:rPr>
+          <w:t>https://www.nass.usda.gov/Publications/AgCensus/2017/Online_Resources/Ag_Atlas_Maps/index.php</w:t>
+        </w:r>
+      </w:hyperlink>
+      <w:r>
+        <w:t xml:space="preserve"> </w:t>
+      </w:r>
+    </w:p>
+    <w:p>
+      <w:pPr>
+        <w:ind w:left="720"/>
+      </w:pPr>
+      <w:r>
+        <w:t xml:space="preserve">USDA </w:t>
+      </w:r>
+      <w:proofErr w:type="spellStart"/>
+      <w:r>
+        <w:t>CropScape</w:t>
+      </w:r>
+      <w:proofErr w:type="spellEnd"/>
+      <w:r>
+        <w:t xml:space="preserve"> </w:t>
+      </w:r>
+      <w:r>
+        <w:t xml:space="preserve">– used by GEPA v2 for high resolution cropland type </w:t>
+      </w:r>
+      <w:hyperlink r:id="rId58" w:history="1">
+        <w:r>
+          <w:rPr>
+            <w:rStyle w:val="Hyperlink"/>
+          </w:rPr>
+          <w:t>https://nassgeodata.gmu.edu/CropScape/</w:t>
+        </w:r>
+      </w:hyperlink>
+      <w:r>
+        <w:t xml:space="preserve"> </w:t>
+      </w:r>
+    </w:p>
+    <w:p>
+      <w:pPr>
+        <w:ind w:left="720"/>
+      </w:pPr>
+      <w:proofErr w:type="spellStart"/>
+      <w:r>
+        <w:t>Enverus</w:t>
+      </w:r>
+      <w:proofErr w:type="spellEnd"/>
+      <w:r>
+        <w:t xml:space="preserve"> </w:t>
+      </w:r>
+      <w:r>
+        <w:t xml:space="preserve">(formerly </w:t>
+      </w:r>
+      <w:proofErr w:type="spellStart"/>
+      <w:r>
+        <w:t>drillinginfo</w:t>
+      </w:r>
+      <w:proofErr w:type="spellEnd"/>
+      <w:r>
+        <w:t xml:space="preserve">) </w:t>
+      </w:r>
+      <w:r>
+        <w:t xml:space="preserve">data </w:t>
+      </w:r>
+      <w:r>
+        <w:t xml:space="preserve">– </w:t>
+      </w:r>
+      <w:r>
+        <w:t xml:space="preserve">seems to be a product for sale, though they have university partnerships </w:t>
+      </w:r>
+      <w:hyperlink r:id="rId59" w:history="1">
+        <w:r>
+          <w:rPr>
+            <w:rStyle w:val="Hyperlink"/>
+          </w:rPr>
+          <w:t>https://www.enverus.com/university-partnerships</w:t>
+        </w:r>
+      </w:hyperlink>
+      <w:r>
+        <w:t>.  Used by GEPA v2 for multiple O&amp;G sectors’ activity data.</w:t>
+      </w:r>
+    </w:p>
+    <w:p>
+      <w:pPr>
+        <w:ind w:left="720"/>
+      </w:pPr>
+      <w:r>
+        <w:t xml:space="preserve">Mine safety and health administration – used by GEPA v2 for coal mine locations and some mobile combustion sources.  </w:t>
+      </w:r>
+      <w:hyperlink r:id="rId60" w:history="1">
+        <w:r>
+          <w:rPr>
+            <w:rStyle w:val="Hyperlink"/>
+          </w:rPr>
+          <w:t>https://www.msha.gov/data-and-reports/mine-data-retrieval-system</w:t>
+        </w:r>
+      </w:hyperlink>
+      <w:r>
+        <w:t xml:space="preserve"> </w:t>
+      </w:r>
+    </w:p>
+    <w:p>
+      <w:pPr>
+        <w:ind w:left="720"/>
+      </w:pPr>
+      <w:r>
+        <w:t xml:space="preserve">DOT datasets – used by GEPA v2 for mobile combustion sources.  </w:t>
+      </w:r>
+      <w:hyperlink r:id="rId61" w:history="1">
+        <w:r>
+          <w:rPr>
+            <w:rStyle w:val="Hyperlink"/>
+          </w:rPr>
+          <w:t>https://www.fhwa.dot.gov/policyinformation/statistics/2012/</w:t>
+        </w:r>
+      </w:hyperlink>
+    </w:p>
+    <w:p>
+      <w:pPr>
+        <w:ind w:left="720"/>
+      </w:pPr>
+      <w:r>
+        <w:t xml:space="preserve">National waterway network – used by GEPA v2 for mobile combustion.  </w:t>
+      </w:r>
+      <w:hyperlink r:id="rId62" w:history="1">
+        <w:r>
+          <w:rPr>
+            <w:rStyle w:val="Hyperlink"/>
+          </w:rPr>
+          <w:t>https://data-usdot.opendata.arcgis.com/datasets/usdot::navigable-waterway-network-lines/about</w:t>
+        </w:r>
+      </w:hyperlink>
+      <w:r>
+        <w:t xml:space="preserve"> </w:t>
+      </w:r>
+    </w:p>
+    <w:p>
+      <w:pPr>
         <w:rPr>
           <w:b/>
           <w:bCs/>
         </w:rPr>
-        <w:t>could</w:t>
-      </w:r>
+      </w:pPr>
       <w:r>
         <w:rPr>
           <w:b/>
           <w:bCs/>
         </w:rPr>
+        <w:t xml:space="preserve">People we </w:t>
+      </w:r>
+      <w:r>
+        <w:rPr>
+          <w:b/>
+          <w:bCs/>
+        </w:rPr>
+        <w:t>could</w:t>
+      </w:r>
+      <w:r>
+        <w:rPr>
+          <w:b/>
+          <w:bCs/>
+        </w:rPr>
         <w:t xml:space="preserve"> reach out to</w:t>
       </w:r>
     </w:p>
@@ -2188,13 +2156,8 @@
       <w:pPr>
         <w:ind w:left="720"/>
       </w:pPr>
-      <w:proofErr w:type="gramStart"/>
-      <w:r>
-        <w:t>Of course</w:t>
-      </w:r>
-      <w:proofErr w:type="gramEnd"/>
-      <w:r>
-        <w:t xml:space="preserve"> those on the papers above.</w:t>
+      <w:r>
+        <w:t>Of course those on the papers above.</w:t>
       </w:r>
     </w:p>
     <w:p>
@@ -2236,6 +2199,7 @@
         <w:ind w:left="720"/>
       </w:pPr>
       <w:r>
+        <w:lastRenderedPageBreak/>
         <w:t>Roisin Commane</w:t>
       </w:r>
       <w:r>
@@ -2300,7 +2264,7 @@
       <w:r>
         <w:t>Debra Wunch – developed Flame-GTA inventory (</w:t>
       </w:r>
-      <w:hyperlink r:id="rId59" w:history="1">
+      <w:hyperlink r:id="rId63" w:history="1">
         <w:r>
           <w:rPr>
             <w:rStyle w:val="Hyperlink"/>
@@ -2314,7 +2278,7 @@
       <w:r>
         <w:t xml:space="preserve">and has done lots of work on urban CH4 (e.g., </w:t>
       </w:r>
-      <w:hyperlink r:id="rId60" w:history="1">
+      <w:hyperlink r:id="rId64" w:history="1">
         <w:r>
           <w:rPr>
             <w:rStyle w:val="Hyperlink"/>
@@ -2331,7 +2295,6 @@
         <w:ind w:left="720"/>
       </w:pPr>
       <w:r>
-        <w:lastRenderedPageBreak/>
         <w:t>EDF – in general, and especially if we eventually have interest in NG production</w:t>
       </w:r>
     </w:p>
@@ -2371,7 +2334,7 @@
       <w:r>
         <w:t>Jean Bogner (</w:t>
       </w:r>
-      <w:hyperlink r:id="rId61" w:history="1">
+      <w:hyperlink r:id="rId65" w:history="1">
         <w:r>
           <w:rPr>
             <w:rStyle w:val="Hyperlink"/>

</xml_diff>

<commit_message>
Adding a few papers.
</commit_message>
<xml_diff>
--- a/Inventory_lit_review.docx
+++ b/Inventory_lit_review.docx
@@ -343,14 +343,27 @@
     <w:p>
       <w:pPr>
         <w:ind w:left="1440"/>
-      </w:pPr>
-      <w:r>
-        <w:rPr>
-          <w:rStyle w:val="Hyperlink"/>
-          <w:color w:val="auto"/>
-          <w:u w:val="none"/>
-        </w:rPr>
-        <w:t xml:space="preserve">EST – 2024 </w:t>
+        <w:rPr>
+          <w:rStyle w:val="Hyperlink"/>
+          <w:color w:val="auto"/>
+          <w:u w:val="none"/>
+        </w:rPr>
+      </w:pPr>
+      <w:r>
+        <w:rPr>
+          <w:rStyle w:val="Hyperlink"/>
+          <w:color w:val="auto"/>
+          <w:u w:val="none"/>
+        </w:rPr>
+        <w:t>AM</w:t>
+      </w:r>
+      <w:r>
+        <w:rPr>
+          <w:rStyle w:val="Hyperlink"/>
+          <w:color w:val="auto"/>
+          <w:u w:val="none"/>
+        </w:rPr>
+        <w:t xml:space="preserve">T – 2024 </w:t>
       </w:r>
       <w:hyperlink r:id="rId10" w:history="1">
         <w:r>
@@ -371,6 +384,35 @@
     </w:p>
     <w:p>
       <w:pPr>
+        <w:ind w:left="1440"/>
+      </w:pPr>
+      <w:r>
+        <w:rPr>
+          <w:rStyle w:val="Hyperlink"/>
+          <w:color w:val="auto"/>
+          <w:u w:val="none"/>
+        </w:rPr>
+        <w:t xml:space="preserve">Preprint – 2024 </w:t>
+      </w:r>
+      <w:hyperlink r:id="rId11" w:history="1">
+        <w:r>
+          <w:rPr>
+            <w:rStyle w:val="Hyperlink"/>
+          </w:rPr>
+          <w:t>https://doi.org/10.31223/X5TB09</w:t>
+        </w:r>
+      </w:hyperlink>
+      <w:r>
+        <w:rPr>
+          <w:rStyle w:val="Hyperlink"/>
+          <w:color w:val="auto"/>
+          <w:u w:val="none"/>
+        </w:rPr>
+        <w:t>.  Unread, includes Bram Maasakkers and a few other familiar names.  GHGSat measurements of 151 landfills across 6 continents showing poor GHGRP performance.</w:t>
+      </w:r>
+    </w:p>
+    <w:p>
+      <w:pPr>
         <w:ind w:firstLine="720"/>
       </w:pPr>
       <w:r>
@@ -384,7 +426,7 @@
       <w:r>
         <w:t xml:space="preserve">Cincinnati – Fries et al., 2018, </w:t>
       </w:r>
-      <w:hyperlink r:id="rId11" w:history="1">
+      <w:hyperlink r:id="rId12" w:history="1">
         <w:r>
           <w:rPr>
             <w:rStyle w:val="Hyperlink"/>
@@ -393,7 +435,11 @@
         </w:r>
       </w:hyperlink>
       <w:r>
-        <w:t xml:space="preserve"> - collected samples and used C and H isotopes + N2O to determine biogenic vs thermogenic.   Most leaks were biogenic (72%) – but they noted site choice likely biased this high.  18.3 mg CH4/day avg emission rate for manholes and sewer grates.</w:t>
+        <w:t xml:space="preserve"> - collected samples and used C and H isotopes + N2O to determine biogenic vs thermogenic.   Most </w:t>
+      </w:r>
+      <w:r>
+        <w:lastRenderedPageBreak/>
+        <w:t>leaks were biogenic (72%) – but they noted site choice likely biased this high.  18.3 mg CH4/day avg emission rate for manholes and sewer grates.</w:t>
       </w:r>
     </w:p>
     <w:p>
@@ -408,10 +454,9 @@
         </w:rPr>
       </w:pPr>
       <w:r>
-        <w:lastRenderedPageBreak/>
         <w:t xml:space="preserve">Hamburg + Utrecht (EU) – Maazallahi et al., 2020, </w:t>
       </w:r>
-      <w:hyperlink r:id="rId12" w:history="1">
+      <w:hyperlink r:id="rId13" w:history="1">
         <w:r>
           <w:rPr>
             <w:rStyle w:val="Hyperlink"/>
@@ -462,7 +507,7 @@
       <w:r>
         <w:t xml:space="preserve">Bucharest and Ploiesti (EU) – Fernandez et al., 2022, </w:t>
       </w:r>
-      <w:hyperlink r:id="rId13" w:history="1">
+      <w:hyperlink r:id="rId14" w:history="1">
         <w:r>
           <w:rPr>
             <w:rStyle w:val="Hyperlink"/>
@@ -481,7 +526,7 @@
       <w:r>
         <w:t xml:space="preserve">Paris (EU) – Defratyka et al., 2021, </w:t>
       </w:r>
-      <w:hyperlink r:id="rId14" w:history="1">
+      <w:hyperlink r:id="rId15" w:history="1">
         <w:r>
           <w:rPr>
             <w:rStyle w:val="Hyperlink"/>
@@ -500,7 +545,7 @@
       <w:r>
         <w:t xml:space="preserve">Montreal (CA) – Williams et al., 2022, </w:t>
       </w:r>
-      <w:hyperlink r:id="rId15" w:history="1">
+      <w:hyperlink r:id="rId16" w:history="1">
         <w:r>
           <w:rPr>
             <w:rStyle w:val="Hyperlink"/>
@@ -524,7 +569,7 @@
       <w:r>
         <w:t xml:space="preserve">EST 2023, </w:t>
       </w:r>
-      <w:hyperlink r:id="rId16" w:history="1">
+      <w:hyperlink r:id="rId17" w:history="1">
         <w:r>
           <w:rPr>
             <w:rStyle w:val="Hyperlink"/>
@@ -601,7 +646,7 @@
         </w:rPr>
         <w:t xml:space="preserve">China – Yuan et al., 2024, </w:t>
       </w:r>
-      <w:hyperlink r:id="rId17" w:history="1">
+      <w:hyperlink r:id="rId18" w:history="1">
         <w:r>
           <w:rPr>
             <w:rStyle w:val="Hyperlink"/>
@@ -633,7 +678,7 @@
       <w:r>
         <w:t xml:space="preserve">Moore et al., 2023, </w:t>
       </w:r>
-      <w:hyperlink r:id="rId18" w:history="1">
+      <w:hyperlink r:id="rId19" w:history="1">
         <w:r>
           <w:rPr>
             <w:rStyle w:val="Hyperlink"/>
@@ -649,7 +694,7 @@
       <w:pPr>
         <w:ind w:left="1440"/>
       </w:pPr>
-      <w:hyperlink r:id="rId19" w:history="1">
+      <w:hyperlink r:id="rId20" w:history="1">
         <w:r>
           <w:rPr>
             <w:rStyle w:val="Hyperlink"/>
@@ -677,7 +722,7 @@
       <w:pPr>
         <w:ind w:left="1440"/>
       </w:pPr>
-      <w:hyperlink r:id="rId20" w:history="1">
+      <w:hyperlink r:id="rId21" w:history="1">
         <w:r>
           <w:rPr>
             <w:rStyle w:val="Hyperlink"/>
@@ -702,7 +747,7 @@
       <w:r>
         <w:t xml:space="preserve">Multiple US cities – Lamb et al., 2015, </w:t>
       </w:r>
-      <w:hyperlink r:id="rId21" w:history="1">
+      <w:hyperlink r:id="rId22" w:history="1">
         <w:r>
           <w:rPr>
             <w:rStyle w:val="Hyperlink"/>
@@ -729,7 +774,7 @@
       <w:r>
         <w:t xml:space="preserve">LA – Zeng et al., 2023, </w:t>
       </w:r>
-      <w:hyperlink r:id="rId22" w:history="1">
+      <w:hyperlink r:id="rId23" w:history="1">
         <w:r>
           <w:rPr>
             <w:rStyle w:val="Hyperlink"/>
@@ -757,7 +802,7 @@
       <w:r>
         <w:t xml:space="preserve">LA – He et al., 2019, </w:t>
       </w:r>
-      <w:hyperlink r:id="rId23" w:history="1">
+      <w:hyperlink r:id="rId24" w:history="1">
         <w:r>
           <w:rPr>
             <w:rStyle w:val="Hyperlink"/>
@@ -776,7 +821,7 @@
       <w:r>
         <w:t xml:space="preserve">DC – Karion et al., 2023, </w:t>
       </w:r>
-      <w:hyperlink r:id="rId24" w:history="1">
+      <w:hyperlink r:id="rId25" w:history="1">
         <w:r>
           <w:rPr>
             <w:rStyle w:val="Hyperlink"/>
@@ -795,7 +840,7 @@
       <w:r>
         <w:t xml:space="preserve">Baltimore – Karion et al., 2023, </w:t>
       </w:r>
-      <w:hyperlink r:id="rId25" w:history="1">
+      <w:hyperlink r:id="rId26" w:history="1">
         <w:r>
           <w:rPr>
             <w:rStyle w:val="Hyperlink"/>
@@ -817,7 +862,7 @@
       <w:r>
         <w:t xml:space="preserve"> </w:t>
       </w:r>
-      <w:hyperlink r:id="rId26" w:history="1">
+      <w:hyperlink r:id="rId27" w:history="1">
         <w:r>
           <w:rPr>
             <w:rStyle w:val="Hyperlink"/>
@@ -836,7 +881,7 @@
       <w:r>
         <w:t xml:space="preserve">EST 2024, </w:t>
       </w:r>
-      <w:hyperlink r:id="rId27" w:history="1">
+      <w:hyperlink r:id="rId28" w:history="1">
         <w:r>
           <w:rPr>
             <w:rStyle w:val="Hyperlink"/>
@@ -864,7 +909,7 @@
       <w:r>
         <w:t xml:space="preserve">EST 2024, </w:t>
       </w:r>
-      <w:hyperlink r:id="rId28" w:history="1">
+      <w:hyperlink r:id="rId29" w:history="1">
         <w:r>
           <w:rPr>
             <w:rStyle w:val="Hyperlink"/>
@@ -889,7 +934,7 @@
       <w:r>
         <w:t xml:space="preserve">EST 2021, </w:t>
       </w:r>
-      <w:hyperlink r:id="rId29" w:history="1">
+      <w:hyperlink r:id="rId30" w:history="1">
         <w:r>
           <w:rPr>
             <w:rStyle w:val="Hyperlink"/>
@@ -908,7 +953,7 @@
       <w:r>
         <w:t xml:space="preserve">AMT 2024, </w:t>
       </w:r>
-      <w:hyperlink r:id="rId30" w:history="1">
+      <w:hyperlink r:id="rId31" w:history="1">
         <w:r>
           <w:rPr>
             <w:rStyle w:val="Hyperlink"/>
@@ -925,9 +970,10 @@
         <w:ind w:left="1440"/>
       </w:pPr>
       <w:r>
+        <w:lastRenderedPageBreak/>
         <w:t xml:space="preserve">PLOS One 2023, </w:t>
       </w:r>
-      <w:hyperlink r:id="rId31" w:history="1">
+      <w:hyperlink r:id="rId32" w:history="1">
         <w:r>
           <w:rPr>
             <w:rStyle w:val="Hyperlink"/>
@@ -950,10 +996,9 @@
         <w:ind w:left="1440"/>
       </w:pPr>
       <w:r>
-        <w:lastRenderedPageBreak/>
         <w:t xml:space="preserve">ACS EST Air 2024, </w:t>
       </w:r>
-      <w:hyperlink r:id="rId32" w:history="1">
+      <w:hyperlink r:id="rId33" w:history="1">
         <w:r>
           <w:rPr>
             <w:rStyle w:val="Hyperlink"/>
@@ -964,6 +1009,9 @@
       <w:r>
         <w:t>.  Unread Traviss et al. paper calculating emission factors for GHGs, BC, NMVOCs, PM, etc. from wood/pellet stoves.  Potentially a very simple plug in to update IPCC EFs currently being used (fairly certain it’s IPCC currently).  Separated by type of stove (catalytic vs pellet vs uncertified, etc.), so may need to do some sort of avg or assumptions.</w:t>
       </w:r>
+      <w:r>
+        <w:t xml:space="preserve">  They scale up their estimates, so we could also investigate that approach.</w:t>
+      </w:r>
     </w:p>
     <w:p>
       <w:pPr>
@@ -983,7 +1031,7 @@
       <w:r>
         <w:t xml:space="preserve">PLOS one – 2023 </w:t>
       </w:r>
-      <w:hyperlink r:id="rId33" w:history="1">
+      <w:hyperlink r:id="rId34" w:history="1">
         <w:r>
           <w:rPr>
             <w:rStyle w:val="Hyperlink"/>
@@ -1068,7 +1116,7 @@
         <w:tab/>
         <w:t xml:space="preserve">RECAPP2 – </w:t>
       </w:r>
-      <w:hyperlink r:id="rId34" w:history="1">
+      <w:hyperlink r:id="rId35" w:history="1">
         <w:r>
           <w:rPr>
             <w:rStyle w:val="Hyperlink"/>
@@ -1102,7 +1150,7 @@
       <w:r>
         <w:t xml:space="preserve">AGU Advances </w:t>
       </w:r>
-      <w:hyperlink r:id="rId35" w:history="1">
+      <w:hyperlink r:id="rId36" w:history="1">
         <w:r>
           <w:rPr>
             <w:rStyle w:val="Hyperlink"/>
@@ -1121,7 +1169,7 @@
       <w:r>
         <w:t xml:space="preserve">East et al., 2024 – Unread GRL </w:t>
       </w:r>
-      <w:hyperlink r:id="rId36" w:history="1">
+      <w:hyperlink r:id="rId37" w:history="1">
         <w:r>
           <w:rPr>
             <w:rStyle w:val="Hyperlink"/>
@@ -1140,7 +1188,7 @@
       <w:r>
         <w:t xml:space="preserve">Tiegs et al., 2024 – Unread Science </w:t>
       </w:r>
-      <w:hyperlink r:id="rId37" w:history="1">
+      <w:hyperlink r:id="rId38" w:history="1">
         <w:r>
           <w:rPr>
             <w:rStyle w:val="Hyperlink"/>
@@ -1157,9 +1205,10 @@
         <w:ind w:left="1440"/>
       </w:pPr>
       <w:r>
+        <w:lastRenderedPageBreak/>
         <w:t xml:space="preserve">Cao et al., 2024 – Unread Environmental Pollution </w:t>
       </w:r>
-      <w:hyperlink r:id="rId38" w:history="1">
+      <w:hyperlink r:id="rId39" w:history="1">
         <w:r>
           <w:rPr>
             <w:rStyle w:val="Hyperlink"/>
@@ -1178,7 +1227,7 @@
       <w:r>
         <w:t xml:space="preserve">Weber et al., 2019 – Nature Communications </w:t>
       </w:r>
-      <w:hyperlink r:id="rId39" w:history="1">
+      <w:hyperlink r:id="rId40" w:history="1">
         <w:r>
           <w:rPr>
             <w:rStyle w:val="Hyperlink"/>
@@ -1187,11 +1236,7 @@
         </w:r>
       </w:hyperlink>
       <w:r>
-        <w:t xml:space="preserve"> uses machine learning to map marine/coastal CH4 emissions.  We currently do NOT include marine emissions (estimated here at 6-12 Tg/yr globally) and this may </w:t>
-      </w:r>
-      <w:r>
-        <w:lastRenderedPageBreak/>
-        <w:t>include an EF we can combine with marine categories in the National Wetland Inventory, or it may provide mapped emissions that we can directly incorporate.</w:t>
+        <w:t xml:space="preserve"> uses machine learning to map marine/coastal CH4 emissions.  We currently do NOT include marine emissions (estimated here at 6-12 Tg/yr globally) and this may include an EF we can combine with marine categories in the National Wetland Inventory, or it may provide mapped emissions that we can directly incorporate.</w:t>
       </w:r>
     </w:p>
     <w:p>
@@ -1210,7 +1255,7 @@
       <w:r>
         <w:t xml:space="preserve">UK – Boothroyd et al., 2018, </w:t>
       </w:r>
-      <w:hyperlink r:id="rId40" w:history="1">
+      <w:hyperlink r:id="rId41" w:history="1">
         <w:r>
           <w:rPr>
             <w:rStyle w:val="Hyperlink"/>
@@ -1287,7 +1332,7 @@
         </w:rPr>
         <w:t xml:space="preserve">Omara et al., (many familiar Harvard and EDF folks) 2023 – ESD </w:t>
       </w:r>
-      <w:hyperlink r:id="rId41" w:history="1">
+      <w:hyperlink r:id="rId42" w:history="1">
         <w:r>
           <w:rPr>
             <w:rStyle w:val="Hyperlink"/>
@@ -1342,7 +1387,7 @@
         </w:rPr>
         <w:t>Unread Omara et al., (</w:t>
       </w:r>
-      <w:hyperlink r:id="rId42" w:history="1">
+      <w:hyperlink r:id="rId43" w:history="1">
         <w:r>
           <w:rPr>
             <w:rStyle w:val="Hyperlink"/>
@@ -1361,7 +1406,7 @@
       <w:r>
         <w:t xml:space="preserve">Riddick et al., Atmosphere – 2024 </w:t>
       </w:r>
-      <w:hyperlink r:id="rId43" w:history="1">
+      <w:hyperlink r:id="rId44" w:history="1">
         <w:r>
           <w:rPr>
             <w:rStyle w:val="Hyperlink"/>
@@ -1386,7 +1431,7 @@
       <w:r>
         <w:t xml:space="preserve">Conrad et al., Communications Earth and Environment – 2023 </w:t>
       </w:r>
-      <w:hyperlink r:id="rId44" w:history="1">
+      <w:hyperlink r:id="rId45" w:history="1">
         <w:r>
           <w:rPr>
             <w:rStyle w:val="Hyperlink"/>
@@ -1411,7 +1456,7 @@
       <w:r>
         <w:t xml:space="preserve">GFEI inventory – Scarpelli et al., ACP 2022 </w:t>
       </w:r>
-      <w:hyperlink r:id="rId45" w:history="1">
+      <w:hyperlink r:id="rId46" w:history="1">
         <w:r>
           <w:rPr>
             <w:rStyle w:val="Hyperlink"/>
@@ -1421,6 +1466,25 @@
       </w:hyperlink>
       <w:r>
         <w:t xml:space="preserve"> .  Global gridded inventory at 0.1 deg up to 2019.</w:t>
+      </w:r>
+    </w:p>
+    <w:p>
+      <w:pPr>
+        <w:ind w:left="1440"/>
+      </w:pPr>
+      <w:r>
+        <w:t xml:space="preserve">Mackay et al., EST – 2024 </w:t>
+      </w:r>
+      <w:hyperlink r:id="rId47" w:history="1">
+        <w:r>
+          <w:rPr>
+            <w:rStyle w:val="Hyperlink"/>
+          </w:rPr>
+          <w:t>https://doi.org/10.1021/acs.est.4c03651</w:t>
+        </w:r>
+      </w:hyperlink>
+      <w:r>
+        <w:t>.  Unread, they are basically doing an Alvarez et al., like synthesis report of Canada O&amp;G work showing generally consistent emissions with their inventory estimates.</w:t>
       </w:r>
     </w:p>
     <w:p>
@@ -1439,7 +1503,7 @@
       <w:r>
         <w:t xml:space="preserve">Fiddler et al., JGR Atmospheres – 2024 </w:t>
       </w:r>
-      <w:hyperlink r:id="rId46" w:history="1">
+      <w:hyperlink r:id="rId48" w:history="1">
         <w:r>
           <w:rPr>
             <w:rStyle w:val="Hyperlink"/>
@@ -1459,6 +1523,7 @@
     </w:p>
     <w:p>
       <w:r>
+        <w:lastRenderedPageBreak/>
         <w:tab/>
         <w:t>Ag (priority = low, complexity = ?)</w:t>
       </w:r>
@@ -1485,7 +1550,7 @@
       <w:r>
         <w:t xml:space="preserve">sectoral optimization in Colorado </w:t>
       </w:r>
-      <w:hyperlink r:id="rId47" w:history="1">
+      <w:hyperlink r:id="rId49" w:history="1">
         <w:r>
           <w:rPr>
             <w:rStyle w:val="Hyperlink"/>
@@ -1514,7 +1579,7 @@
         </w:rPr>
         <w:t xml:space="preserve">Unread 2024 EST paper on agricultural ponds.  Discusses a method to estimate emissions, uses Australia to demo and compare to reported emissions.  41 kt/yr or 0.238 t/ha/yr.  </w:t>
       </w:r>
-      <w:hyperlink r:id="rId48" w:history="1">
+      <w:hyperlink r:id="rId50" w:history="1">
         <w:r>
           <w:rPr>
             <w:rStyle w:val="Hyperlink"/>
@@ -1565,6 +1630,9 @@
     <w:p>
       <w:pPr>
         <w:ind w:left="1440"/>
+        <w:rPr>
+          <w:rStyle w:val="c-bibliographic-informationvalue"/>
+        </w:rPr>
       </w:pPr>
       <w:r>
         <w:rPr>
@@ -1573,7 +1641,6 @@
           <w:color w:val="auto"/>
           <w:u w:val="none"/>
         </w:rPr>
-        <w:lastRenderedPageBreak/>
         <w:t xml:space="preserve">Unread </w:t>
       </w:r>
       <w:r>
@@ -1585,7 +1652,7 @@
         </w:rPr>
         <w:t xml:space="preserve">2024 Nature Chemical Engineering global paper using lifecycle modeling to estimate lifetime emissions from cradle to gate.  Some aspects/methods and data sets could be of value, though we’d want point emissions, not to assign lifecycle emissions at the point of production.  </w:t>
       </w:r>
-      <w:hyperlink r:id="rId49" w:history="1">
+      <w:hyperlink r:id="rId51" w:history="1">
         <w:r>
           <w:rPr>
             <w:rStyle w:val="Hyperlink"/>
@@ -1599,6 +1666,39 @@
         </w:rPr>
         <w:t xml:space="preserve"> </w:t>
       </w:r>
+    </w:p>
+    <w:p>
+      <w:pPr>
+        <w:rPr>
+          <w:rStyle w:val="c-bibliographic-informationvalue"/>
+        </w:rPr>
+      </w:pPr>
+      <w:r>
+        <w:rPr>
+          <w:rStyle w:val="c-bibliographic-informationvalue"/>
+        </w:rPr>
+        <w:tab/>
+        <w:t>Shipping (priority = low, complexity = ?)</w:t>
+      </w:r>
+    </w:p>
+    <w:p>
+      <w:pPr>
+        <w:ind w:left="1440"/>
+      </w:pPr>
+      <w:r>
+        <w:rPr>
+          <w:rStyle w:val="c-bibliographic-informationvalue"/>
+        </w:rPr>
+        <w:t xml:space="preserve">Unread ESSD.  Global 0.1 by 0.1 deg 2016 – 2021 shipping inventory + activity data and emissions estimates using CEDS.  </w:t>
+      </w:r>
+      <w:hyperlink r:id="rId52" w:history="1">
+        <w:r>
+          <w:rPr>
+            <w:rStyle w:val="Hyperlink"/>
+          </w:rPr>
+          <w:t>https://doi.org/10.5194/essd-2024-258</w:t>
+        </w:r>
+      </w:hyperlink>
     </w:p>
     <w:p>
       <w:pPr>
@@ -1639,7 +1739,7 @@
       <w:r>
         <w:t xml:space="preserve">Toronto (CA) - </w:t>
       </w:r>
-      <w:hyperlink r:id="rId50" w:history="1">
+      <w:hyperlink r:id="rId53" w:history="1">
         <w:r>
           <w:rPr>
             <w:rStyle w:val="Hyperlink"/>
@@ -1660,7 +1760,7 @@
         </w:rPr>
         <w:t xml:space="preserve">Scarpelli Canada GEPA – </w:t>
       </w:r>
-      <w:hyperlink r:id="rId51" w:history="1">
+      <w:hyperlink r:id="rId54" w:history="1">
         <w:r>
           <w:rPr>
             <w:rStyle w:val="Hyperlink"/>
@@ -1679,7 +1779,7 @@
       <w:r>
         <w:t xml:space="preserve">New to me, but Climate TRACE – global (national for some, facility level for others).  Seems to be primarily built from models relying on machine learning + measurements, but very few publications (much more policy-focused, Al Gore sponsored).  </w:t>
       </w:r>
-      <w:hyperlink r:id="rId52" w:history="1">
+      <w:hyperlink r:id="rId55" w:history="1">
         <w:r>
           <w:rPr>
             <w:rStyle w:val="Hyperlink"/>
@@ -1690,7 +1790,7 @@
       <w:r>
         <w:t xml:space="preserve">.  </w:t>
       </w:r>
-      <w:hyperlink r:id="rId53" w:history="1">
+      <w:hyperlink r:id="rId56" w:history="1">
         <w:r>
           <w:rPr>
             <w:rStyle w:val="Hyperlink"/>
@@ -1724,7 +1824,7 @@
       <w:r>
         <w:t>Rosentreter et al. (</w:t>
       </w:r>
-      <w:hyperlink r:id="rId54" w:history="1">
+      <w:hyperlink r:id="rId57" w:history="1">
         <w:r>
           <w:rPr>
             <w:rStyle w:val="Hyperlink"/>
@@ -1758,7 +1858,7 @@
       <w:r>
         <w:t xml:space="preserve">FEMA structure data – building occupancy type (industrial, residential, etc.) map for the whole US.  </w:t>
       </w:r>
-      <w:hyperlink r:id="rId55" w:history="1">
+      <w:hyperlink r:id="rId58" w:history="1">
         <w:r>
           <w:rPr>
             <w:rStyle w:val="Hyperlink"/>
@@ -1774,7 +1874,7 @@
       <w:r>
         <w:t xml:space="preserve">Census house heating fuel – one of many census data tables available at national to county levels.  </w:t>
       </w:r>
-      <w:hyperlink r:id="rId56" w:history="1">
+      <w:hyperlink r:id="rId59" w:history="1">
         <w:r>
           <w:rPr>
             <w:rStyle w:val="Hyperlink"/>
@@ -1793,7 +1893,7 @@
       <w:r>
         <w:t xml:space="preserve">EPA FRS database that primarily includes facility information data for pretty much anything of environmental interest.  </w:t>
       </w:r>
-      <w:hyperlink r:id="rId57" w:history="1">
+      <w:hyperlink r:id="rId60" w:history="1">
         <w:r>
           <w:rPr>
             <w:rStyle w:val="Hyperlink"/>
@@ -1807,9 +1907,10 @@
         <w:ind w:left="720"/>
       </w:pPr>
       <w:r>
+        <w:lastRenderedPageBreak/>
         <w:t xml:space="preserve">Waste Business Journal for landfills that Joe mentioned was used in combination with LMOP to scale up emissions beyond GHGRP for the GHGI.  </w:t>
       </w:r>
-      <w:hyperlink r:id="rId58" w:history="1">
+      <w:hyperlink r:id="rId61" w:history="1">
         <w:r>
           <w:rPr>
             <w:rStyle w:val="Hyperlink"/>
@@ -1826,7 +1927,7 @@
       <w:r>
         <w:t xml:space="preserve"> in </w:t>
       </w:r>
-      <w:hyperlink r:id="rId59" w:history="1">
+      <w:hyperlink r:id="rId62" w:history="1">
         <w:r>
           <w:rPr>
             <w:rStyle w:val="Hyperlink"/>
@@ -1848,7 +1949,7 @@
       <w:r>
         <w:t xml:space="preserve"> – used by GEPA v2 for several agricultural datasets </w:t>
       </w:r>
-      <w:hyperlink r:id="rId60" w:history="1">
+      <w:hyperlink r:id="rId63" w:history="1">
         <w:r>
           <w:rPr>
             <w:rStyle w:val="Hyperlink"/>
@@ -1870,7 +1971,7 @@
       <w:r>
         <w:t xml:space="preserve">– used by GEPA v2 for high resolution cropland type </w:t>
       </w:r>
-      <w:hyperlink r:id="rId61" w:history="1">
+      <w:hyperlink r:id="rId64" w:history="1">
         <w:r>
           <w:rPr>
             <w:rStyle w:val="Hyperlink"/>
@@ -1887,7 +1988,6 @@
         <w:ind w:left="720"/>
       </w:pPr>
       <w:r>
-        <w:lastRenderedPageBreak/>
         <w:t xml:space="preserve">Enverus </w:t>
       </w:r>
       <w:r>
@@ -1902,7 +2002,7 @@
       <w:r>
         <w:t xml:space="preserve">seems to be a product for sale, though they have university partnerships </w:t>
       </w:r>
-      <w:hyperlink r:id="rId62" w:history="1">
+      <w:hyperlink r:id="rId65" w:history="1">
         <w:r>
           <w:rPr>
             <w:rStyle w:val="Hyperlink"/>
@@ -1921,7 +2021,7 @@
       <w:r>
         <w:t xml:space="preserve">Mine safety and health administration – used by GEPA v2 for coal mine locations and some mobile combustion sources.  </w:t>
       </w:r>
-      <w:hyperlink r:id="rId63" w:history="1">
+      <w:hyperlink r:id="rId66" w:history="1">
         <w:r>
           <w:rPr>
             <w:rStyle w:val="Hyperlink"/>
@@ -1940,7 +2040,7 @@
       <w:r>
         <w:t xml:space="preserve">DOT datasets – used by GEPA v2 for mobile combustion sources.  </w:t>
       </w:r>
-      <w:hyperlink r:id="rId64" w:history="1">
+      <w:hyperlink r:id="rId67" w:history="1">
         <w:r>
           <w:rPr>
             <w:rStyle w:val="Hyperlink"/>
@@ -1956,7 +2056,7 @@
       <w:r>
         <w:t xml:space="preserve">National waterway network – used by GEPA v2 for mobile combustion.  </w:t>
       </w:r>
-      <w:hyperlink r:id="rId65" w:history="1">
+      <w:hyperlink r:id="rId68" w:history="1">
         <w:r>
           <w:rPr>
             <w:rStyle w:val="Hyperlink"/>
@@ -2101,9 +2201,10 @@
         <w:ind w:left="720"/>
       </w:pPr>
       <w:r>
+        <w:lastRenderedPageBreak/>
         <w:t>Debra Wunch – developed Flame-GTA inventory (</w:t>
       </w:r>
-      <w:hyperlink r:id="rId66" w:history="1">
+      <w:hyperlink r:id="rId69" w:history="1">
         <w:r>
           <w:rPr>
             <w:rStyle w:val="Hyperlink"/>
@@ -2117,7 +2218,7 @@
       <w:r>
         <w:t xml:space="preserve">and has done lots of work on urban CH4 (e.g., </w:t>
       </w:r>
-      <w:hyperlink r:id="rId67" w:history="1">
+      <w:hyperlink r:id="rId70" w:history="1">
         <w:r>
           <w:rPr>
             <w:rStyle w:val="Hyperlink"/>
@@ -2168,7 +2269,7 @@
       <w:r>
         <w:t>Jean Bogner (</w:t>
       </w:r>
-      <w:hyperlink r:id="rId68" w:history="1">
+      <w:hyperlink r:id="rId71" w:history="1">
         <w:r>
           <w:rPr>
             <w:rStyle w:val="Hyperlink"/>
@@ -2188,7 +2289,6 @@
         <w:ind w:left="720"/>
       </w:pPr>
       <w:r>
-        <w:lastRenderedPageBreak/>
         <w:t>Grant Allen – Joe’s old PI has experience with many sectors, including what seems like a lot of work on urban areas and wetlands</w:t>
       </w:r>
     </w:p>

</xml_diff>